<commit_message>
Science page: same comparison as the BF page, simpler (takeaway repeat, ingredient-team table and BioPerine line hidden); handoff updated
Co-Authored-By: Claude Opus 5.5 <noreply@anthropic.com>
Claude-Session: https://claude.ai/code/session_01VYMABo11xv71mQ7912r49G
</commit_message>
<xml_diff>
--- a/handoff/MUTO_Dev_Handoff_BF_PDP_31Oct2026.docx
+++ b/handoff/MUTO_Dev_Handoff_BF_PDP_31Oct2026.docx
@@ -1366,6 +1366,175 @@
           <w:bCs/>
           <w:b/>
         </w:rPr>
+        <w:t xml:space="preserve">Science page (</w:t>
+      </w:r>
+      <w:r>
+        <w:rPr>
+          <w:rStyle w:val="VerbatimChar"/>
+          <w:bCs/>
+          <w:b/>
+        </w:rPr>
+        <w:t xml:space="preserve">/pages/science</w:t>
+      </w:r>
+      <w:r>
+        <w:rPr>
+          <w:bCs/>
+          <w:b/>
+        </w:rPr>
+        <w:t xml:space="preserve">, template</w:t>
+      </w:r>
+      <w:r>
+        <w:rPr>
+          <w:bCs/>
+          <w:b/>
+        </w:rPr>
+        <w:t xml:space="preserve"> </w:t>
+      </w:r>
+      <w:r>
+        <w:rPr>
+          <w:rStyle w:val="VerbatimChar"/>
+          <w:bCs/>
+          <w:b/>
+        </w:rPr>
+        <w:t xml:space="preserve">page.science-simple</w:t>
+      </w:r>
+      <w:r>
+        <w:rPr>
+          <w:bCs/>
+          <w:b/>
+        </w:rPr>
+        <w:t xml:space="preserve">):</w:t>
+      </w:r>
+    </w:p>
+    <w:p>
+      <w:pPr>
+        <w:numPr>
+          <w:ilvl w:val="0"/>
+          <w:numId w:val="1013"/>
+        </w:numPr>
+        <w:pStyle w:val="Compact"/>
+      </w:pPr>
+      <w:r>
+        <w:t xml:space="preserve">Chapter 04’s table is replaced by the same</w:t>
+      </w:r>
+      <w:r>
+        <w:t xml:space="preserve"> </w:t>
+      </w:r>
+      <w:r>
+        <w:t xml:space="preserve">“</w:t>
+      </w:r>
+      <w:r>
+        <w:t xml:space="preserve">MUTO vs the usual</w:t>
+      </w:r>
+      <w:r>
+        <w:t xml:space="preserve">”</w:t>
+      </w:r>
+      <w:r>
+        <w:t xml:space="preserve"> </w:t>
+      </w:r>
+      <w:r>
+        <w:t xml:space="preserve">comparison. The chapter menu’s</w:t>
+      </w:r>
+      <w:r>
+        <w:t xml:space="preserve"> </w:t>
+      </w:r>
+      <w:r>
+        <w:t xml:space="preserve">“</w:t>
+      </w:r>
+      <w:r>
+        <w:t xml:space="preserve">Comparison</w:t>
+      </w:r>
+      <w:r>
+        <w:t xml:space="preserve">”</w:t>
+      </w:r>
+      <w:r>
+        <w:t xml:space="preserve"> </w:t>
+      </w:r>
+      <w:r>
+        <w:t xml:space="preserve">link still jumps to it.</w:t>
+      </w:r>
+    </w:p>
+    <w:p>
+      <w:pPr>
+        <w:numPr>
+          <w:ilvl w:val="0"/>
+          <w:numId w:val="1013"/>
+        </w:numPr>
+        <w:pStyle w:val="Compact"/>
+      </w:pPr>
+      <w:r>
+        <w:t xml:space="preserve">Simplified: chapter 01’s takeaway line (repeated in chapter 02), and chapter 03’s</w:t>
+      </w:r>
+      <w:r>
+        <w:t xml:space="preserve"> </w:t>
+      </w:r>
+      <w:r>
+        <w:t xml:space="preserve">“</w:t>
+      </w:r>
+      <w:r>
+        <w:t xml:space="preserve">How the 19 ingredients work together</w:t>
+      </w:r>
+      <w:r>
+        <w:t xml:space="preserve">”</w:t>
+      </w:r>
+      <w:r>
+        <w:t xml:space="preserve"> </w:t>
+      </w:r>
+      <w:r>
+        <w:t xml:space="preserve">table and BioPerine line are hidden.</w:t>
+      </w:r>
+    </w:p>
+    <w:p>
+      <w:pPr>
+        <w:numPr>
+          <w:ilvl w:val="0"/>
+          <w:numId w:val="1013"/>
+        </w:numPr>
+        <w:pStyle w:val="Compact"/>
+      </w:pPr>
+      <w:r>
+        <w:t xml:space="preserve">Done from</w:t>
+      </w:r>
+      <w:r>
+        <w:t xml:space="preserve"> </w:t>
+      </w:r>
+      <w:r>
+        <w:rPr>
+          <w:rStyle w:val="VerbatimChar"/>
+        </w:rPr>
+        <w:t xml:space="preserve">muto-bf-head.liquid</w:t>
+      </w:r>
+      <w:r>
+        <w:t xml:space="preserve"> </w:t>
+      </w:r>
+      <w:r>
+        <w:t xml:space="preserve">(its second</w:t>
+      </w:r>
+      <w:r>
+        <w:t xml:space="preserve"> </w:t>
+      </w:r>
+      <w:r>
+        <w:rPr>
+          <w:rStyle w:val="VerbatimChar"/>
+        </w:rPr>
+        <w:t xml:space="preserve">if</w:t>
+      </w:r>
+      <w:r>
+        <w:t xml:space="preserve"> </w:t>
+      </w:r>
+      <w:r>
+        <w:t xml:space="preserve">block). The science template itself is unchanged.</w:t>
+      </w:r>
+    </w:p>
+    <w:p>
+      <w:pPr>
+        <w:pStyle w:val="FirstParagraph"/>
+      </w:pPr>
+      <w:r>
+        <w:rPr>
+          <w:bCs/>
+          <w:b/>
+        </w:rPr>
         <w:t xml:space="preserve">Site-wide (all pages, phones and tablets under 990px):</w:t>
       </w:r>
       <w:r>
@@ -1379,7 +1548,7 @@
       <w:pPr>
         <w:numPr>
           <w:ilvl w:val="0"/>
-          <w:numId w:val="1013"/>
+          <w:numId w:val="1014"/>
         </w:numPr>
         <w:pStyle w:val="Compact"/>
       </w:pPr>
@@ -1391,7 +1560,7 @@
       <w:pPr>
         <w:numPr>
           <w:ilvl w:val="0"/>
-          <w:numId w:val="1013"/>
+          <w:numId w:val="1014"/>
         </w:numPr>
         <w:pStyle w:val="Compact"/>
       </w:pPr>
@@ -1403,7 +1572,7 @@
       <w:pPr>
         <w:numPr>
           <w:ilvl w:val="0"/>
-          <w:numId w:val="1013"/>
+          <w:numId w:val="1014"/>
         </w:numPr>
         <w:pStyle w:val="Compact"/>
       </w:pPr>
@@ -1522,7 +1691,7 @@
               <w:t xml:space="preserve"> </w:t>
             </w:r>
             <w:r>
-              <w:t xml:space="preserve">The compact mobile header (site-wide); on the BF template, loads all BF styles before the page is drawn, the button colour, and the top bar.</w:t>
+              <w:t xml:space="preserve">The compact mobile header (site-wide); the science page’s comparison and simplifications; on the BF template, loads all BF styles before the page is drawn, the button colour, and the top bar.</w:t>
             </w:r>
           </w:p>
         </w:tc>
@@ -2189,7 +2358,7 @@
       <w:pPr>
         <w:numPr>
           <w:ilvl w:val="0"/>
-          <w:numId w:val="1014"/>
+          <w:numId w:val="1015"/>
         </w:numPr>
         <w:pStyle w:val="Compact"/>
       </w:pPr>
@@ -2267,7 +2436,7 @@
       <w:pPr>
         <w:numPr>
           <w:ilvl w:val="0"/>
-          <w:numId w:val="1014"/>
+          <w:numId w:val="1015"/>
         </w:numPr>
         <w:pStyle w:val="Compact"/>
       </w:pPr>
@@ -2279,7 +2448,7 @@
       <w:pPr>
         <w:numPr>
           <w:ilvl w:val="1"/>
-          <w:numId w:val="1015"/>
+          <w:numId w:val="1016"/>
         </w:numPr>
         <w:pStyle w:val="Compact"/>
       </w:pPr>
@@ -2300,7 +2469,7 @@
       <w:pPr>
         <w:numPr>
           <w:ilvl w:val="1"/>
-          <w:numId w:val="1015"/>
+          <w:numId w:val="1016"/>
         </w:numPr>
         <w:pStyle w:val="Compact"/>
       </w:pPr>
@@ -2353,7 +2522,7 @@
       <w:pPr>
         <w:numPr>
           <w:ilvl w:val="1"/>
-          <w:numId w:val="1015"/>
+          <w:numId w:val="1016"/>
         </w:numPr>
         <w:pStyle w:val="Compact"/>
       </w:pPr>
@@ -2390,7 +2559,7 @@
       <w:pPr>
         <w:numPr>
           <w:ilvl w:val="1"/>
-          <w:numId w:val="1015"/>
+          <w:numId w:val="1016"/>
         </w:numPr>
         <w:pStyle w:val="Compact"/>
       </w:pPr>
@@ -2412,7 +2581,7 @@
       <w:pPr>
         <w:numPr>
           <w:ilvl w:val="0"/>
-          <w:numId w:val="1016"/>
+          <w:numId w:val="1017"/>
         </w:numPr>
         <w:pStyle w:val="Compact"/>
       </w:pPr>
@@ -2437,7 +2606,7 @@
       <w:pPr>
         <w:numPr>
           <w:ilvl w:val="1"/>
-          <w:numId w:val="1017"/>
+          <w:numId w:val="1018"/>
         </w:numPr>
         <w:pStyle w:val="Compact"/>
       </w:pPr>
@@ -2465,23 +2634,23 @@
       <w:pPr>
         <w:numPr>
           <w:ilvl w:val="1"/>
+          <w:numId w:val="1018"/>
+        </w:numPr>
+        <w:pStyle w:val="Compact"/>
+      </w:pPr>
+      <w:r>
+        <w:t xml:space="preserve">Claim skips the cart drawer. If any gift is added by something in the drawer, it won’t be added this way.</w:t>
+      </w:r>
+    </w:p>
+    <w:p>
+      <w:pPr>
+        <w:numPr>
+          <w:ilvl w:val="0"/>
           <w:numId w:val="1017"/>
         </w:numPr>
         <w:pStyle w:val="Compact"/>
       </w:pPr>
       <w:r>
-        <w:t xml:space="preserve">Claim skips the cart drawer. If any gift is added by something in the drawer, it won’t be added this way.</w:t>
-      </w:r>
-    </w:p>
-    <w:p>
-      <w:pPr>
-        <w:numPr>
-          <w:ilvl w:val="0"/>
-          <w:numId w:val="1016"/>
-        </w:numPr>
-        <w:pStyle w:val="Compact"/>
-      </w:pPr>
-      <w:r>
         <w:t xml:space="preserve">☐ Place test orders through the main button, the sticky bar (both plans) and the one-time purchase. Check the right variant and plan in each.</w:t>
       </w:r>
     </w:p>
@@ -2489,7 +2658,7 @@
       <w:pPr>
         <w:numPr>
           <w:ilvl w:val="0"/>
-          <w:numId w:val="1016"/>
+          <w:numId w:val="1017"/>
         </w:numPr>
         <w:pStyle w:val="Compact"/>
       </w:pPr>
@@ -2501,7 +2670,7 @@
       <w:pPr>
         <w:numPr>
           <w:ilvl w:val="0"/>
-          <w:numId w:val="1016"/>
+          <w:numId w:val="1017"/>
         </w:numPr>
         <w:pStyle w:val="Compact"/>
       </w:pPr>
@@ -2513,7 +2682,7 @@
       <w:pPr>
         <w:numPr>
           <w:ilvl w:val="0"/>
-          <w:numId w:val="1016"/>
+          <w:numId w:val="1017"/>
         </w:numPr>
         <w:pStyle w:val="Compact"/>
       </w:pPr>
@@ -2525,7 +2694,7 @@
       <w:pPr>
         <w:numPr>
           <w:ilvl w:val="0"/>
-          <w:numId w:val="1016"/>
+          <w:numId w:val="1017"/>
         </w:numPr>
         <w:pStyle w:val="Compact"/>
       </w:pPr>
@@ -2537,7 +2706,7 @@
       <w:pPr>
         <w:numPr>
           <w:ilvl w:val="0"/>
-          <w:numId w:val="1016"/>
+          <w:numId w:val="1017"/>
         </w:numPr>
         <w:pStyle w:val="Compact"/>
       </w:pPr>
@@ -2549,7 +2718,7 @@
       <w:pPr>
         <w:numPr>
           <w:ilvl w:val="0"/>
-          <w:numId w:val="1016"/>
+          <w:numId w:val="1017"/>
         </w:numPr>
         <w:pStyle w:val="Compact"/>
       </w:pPr>
@@ -2574,12 +2743,42 @@
       <w:pPr>
         <w:numPr>
           <w:ilvl w:val="0"/>
-          <w:numId w:val="1016"/>
+          <w:numId w:val="1017"/>
         </w:numPr>
         <w:pStyle w:val="Compact"/>
       </w:pPr>
       <w:r>
         <w:t xml:space="preserve">☐ Doesn’t collide with chat or popup widgets at the bottom of the screen.</w:t>
+      </w:r>
+    </w:p>
+    <w:p>
+      <w:pPr>
+        <w:numPr>
+          <w:ilvl w:val="0"/>
+          <w:numId w:val="1017"/>
+        </w:numPr>
+        <w:pStyle w:val="Compact"/>
+      </w:pPr>
+      <w:r>
+        <w:t xml:space="preserve">☐ Science page: the comparison shows in chapter 04, the</w:t>
+      </w:r>
+      <w:r>
+        <w:t xml:space="preserve"> </w:t>
+      </w:r>
+      <w:r>
+        <w:t xml:space="preserve">“</w:t>
+      </w:r>
+      <w:r>
+        <w:t xml:space="preserve">Comparison</w:t>
+      </w:r>
+      <w:r>
+        <w:t xml:space="preserve">”</w:t>
+      </w:r>
+      <w:r>
+        <w:t xml:space="preserve"> </w:t>
+      </w:r>
+      <w:r>
+        <w:t xml:space="preserve">chapter link jumps to it, and nothing else looks missing.</w:t>
       </w:r>
     </w:p>
     <w:bookmarkEnd w:id="26"/>
@@ -2596,7 +2795,7 @@
       <w:pPr>
         <w:numPr>
           <w:ilvl w:val="0"/>
-          <w:numId w:val="1018"/>
+          <w:numId w:val="1019"/>
         </w:numPr>
         <w:pStyle w:val="Compact"/>
       </w:pPr>
@@ -2645,7 +2844,7 @@
       <w:pPr>
         <w:numPr>
           <w:ilvl w:val="0"/>
-          <w:numId w:val="1018"/>
+          <w:numId w:val="1019"/>
         </w:numPr>
         <w:pStyle w:val="Compact"/>
       </w:pPr>
@@ -2661,103 +2860,103 @@
       <w:pPr>
         <w:numPr>
           <w:ilvl w:val="1"/>
+          <w:numId w:val="1020"/>
+        </w:numPr>
+        <w:pStyle w:val="Compact"/>
+      </w:pPr>
+      <w:r>
+        <w:t xml:space="preserve">Top bar:</w:t>
+      </w:r>
+      <w:r>
+        <w:t xml:space="preserve"> </w:t>
+      </w:r>
+      <w:r>
+        <w:rPr>
+          <w:rStyle w:val="VerbatimChar"/>
+        </w:rPr>
+        <w:t xml:space="preserve">muto-bf-bar.liquid</w:t>
+      </w:r>
+      <w:r>
+        <w:t xml:space="preserve">.</w:t>
+      </w:r>
+    </w:p>
+    <w:p>
+      <w:pPr>
+        <w:numPr>
+          <w:ilvl w:val="1"/>
+          <w:numId w:val="1020"/>
+        </w:numPr>
+        <w:pStyle w:val="Compact"/>
+      </w:pPr>
+      <w:r>
+        <w:t xml:space="preserve">Black Friday line (</w:t>
+      </w:r>
+      <w:r>
+        <w:t xml:space="preserve">“</w:t>
+      </w:r>
+      <w:r>
+        <w:t xml:space="preserve">Ends 30 Nov</w:t>
+      </w:r>
+      <w:r>
+        <w:t xml:space="preserve">”</w:t>
+      </w:r>
+      <w:r>
+        <w:t xml:space="preserve">):</w:t>
+      </w:r>
+      <w:r>
+        <w:t xml:space="preserve"> </w:t>
+      </w:r>
+      <w:r>
+        <w:rPr>
+          <w:rStyle w:val="VerbatimChar"/>
+        </w:rPr>
+        <w:t xml:space="preserve">muto-bf-copy.css</w:t>
+      </w:r>
+      <w:r>
+        <w:t xml:space="preserve">.</w:t>
+      </w:r>
+    </w:p>
+    <w:p>
+      <w:pPr>
+        <w:numPr>
+          <w:ilvl w:val="1"/>
+          <w:numId w:val="1020"/>
+        </w:numPr>
+        <w:pStyle w:val="Compact"/>
+      </w:pPr>
+      <w:r>
+        <w:t xml:space="preserve">Sticky bar line (</w:t>
+      </w:r>
+      <w:r>
+        <w:t xml:space="preserve">“</w:t>
+      </w:r>
+      <w:r>
+        <w:t xml:space="preserve">53% off your first order</w:t>
+      </w:r>
+      <w:r>
+        <w:t xml:space="preserve">”</w:t>
+      </w:r>
+      <w:r>
+        <w:t xml:space="preserve">):</w:t>
+      </w:r>
+      <w:r>
+        <w:t xml:space="preserve"> </w:t>
+      </w:r>
+      <w:r>
+        <w:rPr>
+          <w:rStyle w:val="VerbatimChar"/>
+        </w:rPr>
+        <w:t xml:space="preserve">muto-bf-offer.liquid</w:t>
+      </w:r>
+      <w:r>
+        <w:t xml:space="preserve">.</w:t>
+      </w:r>
+    </w:p>
+    <w:p>
+      <w:pPr>
+        <w:numPr>
+          <w:ilvl w:val="0"/>
           <w:numId w:val="1019"/>
-        </w:numPr>
-        <w:pStyle w:val="Compact"/>
-      </w:pPr>
-      <w:r>
-        <w:t xml:space="preserve">Top bar:</w:t>
-      </w:r>
-      <w:r>
-        <w:t xml:space="preserve"> </w:t>
-      </w:r>
-      <w:r>
-        <w:rPr>
-          <w:rStyle w:val="VerbatimChar"/>
-        </w:rPr>
-        <w:t xml:space="preserve">muto-bf-bar.liquid</w:t>
-      </w:r>
-      <w:r>
-        <w:t xml:space="preserve">.</w:t>
-      </w:r>
-    </w:p>
-    <w:p>
-      <w:pPr>
-        <w:numPr>
-          <w:ilvl w:val="1"/>
-          <w:numId w:val="1019"/>
-        </w:numPr>
-        <w:pStyle w:val="Compact"/>
-      </w:pPr>
-      <w:r>
-        <w:t xml:space="preserve">Black Friday line (</w:t>
-      </w:r>
-      <w:r>
-        <w:t xml:space="preserve">“</w:t>
-      </w:r>
-      <w:r>
-        <w:t xml:space="preserve">Ends 30 Nov</w:t>
-      </w:r>
-      <w:r>
-        <w:t xml:space="preserve">”</w:t>
-      </w:r>
-      <w:r>
-        <w:t xml:space="preserve">):</w:t>
-      </w:r>
-      <w:r>
-        <w:t xml:space="preserve"> </w:t>
-      </w:r>
-      <w:r>
-        <w:rPr>
-          <w:rStyle w:val="VerbatimChar"/>
-        </w:rPr>
-        <w:t xml:space="preserve">muto-bf-copy.css</w:t>
-      </w:r>
-      <w:r>
-        <w:t xml:space="preserve">.</w:t>
-      </w:r>
-    </w:p>
-    <w:p>
-      <w:pPr>
-        <w:numPr>
-          <w:ilvl w:val="1"/>
-          <w:numId w:val="1019"/>
-        </w:numPr>
-        <w:pStyle w:val="Compact"/>
-      </w:pPr>
-      <w:r>
-        <w:t xml:space="preserve">Sticky bar line (</w:t>
-      </w:r>
-      <w:r>
-        <w:t xml:space="preserve">“</w:t>
-      </w:r>
-      <w:r>
-        <w:t xml:space="preserve">53% off your first order</w:t>
-      </w:r>
-      <w:r>
-        <w:t xml:space="preserve">”</w:t>
-      </w:r>
-      <w:r>
-        <w:t xml:space="preserve">):</w:t>
-      </w:r>
-      <w:r>
-        <w:t xml:space="preserve"> </w:t>
-      </w:r>
-      <w:r>
-        <w:rPr>
-          <w:rStyle w:val="VerbatimChar"/>
-        </w:rPr>
-        <w:t xml:space="preserve">muto-bf-offer.liquid</w:t>
-      </w:r>
-      <w:r>
-        <w:t xml:space="preserve">.</w:t>
-      </w:r>
-    </w:p>
-    <w:p>
-      <w:pPr>
-        <w:numPr>
-          <w:ilvl w:val="0"/>
-          <w:numId w:val="1018"/>
         </w:numPr>
         <w:pStyle w:val="Compact"/>
       </w:pPr>
@@ -2821,7 +3020,7 @@
       <w:pPr>
         <w:numPr>
           <w:ilvl w:val="0"/>
-          <w:numId w:val="1018"/>
+          <w:numId w:val="1019"/>
         </w:numPr>
         <w:pStyle w:val="Compact"/>
       </w:pPr>
@@ -2855,7 +3054,7 @@
       <w:pPr>
         <w:numPr>
           <w:ilvl w:val="1"/>
-          <w:numId w:val="1020"/>
+          <w:numId w:val="1021"/>
         </w:numPr>
         <w:pStyle w:val="Compact"/>
       </w:pPr>
@@ -2885,7 +3084,7 @@
       <w:pPr>
         <w:numPr>
           <w:ilvl w:val="1"/>
-          <w:numId w:val="1020"/>
+          <w:numId w:val="1021"/>
         </w:numPr>
         <w:pStyle w:val="Compact"/>
       </w:pPr>
@@ -2897,7 +3096,7 @@
       <w:pPr>
         <w:numPr>
           <w:ilvl w:val="0"/>
-          <w:numId w:val="1018"/>
+          <w:numId w:val="1019"/>
         </w:numPr>
         <w:pStyle w:val="Compact"/>
       </w:pPr>
@@ -2962,7 +3161,7 @@
       <w:pPr>
         <w:numPr>
           <w:ilvl w:val="0"/>
-          <w:numId w:val="1021"/>
+          <w:numId w:val="1022"/>
         </w:numPr>
         <w:pStyle w:val="Compact"/>
       </w:pPr>
@@ -2992,7 +3191,7 @@
       <w:pPr>
         <w:numPr>
           <w:ilvl w:val="0"/>
-          <w:numId w:val="1021"/>
+          <w:numId w:val="1022"/>
         </w:numPr>
         <w:pStyle w:val="Compact"/>
       </w:pPr>
@@ -3046,7 +3245,31 @@
       <w:pPr>
         <w:numPr>
           <w:ilvl w:val="0"/>
-          <w:numId w:val="1021"/>
+          <w:numId w:val="1022"/>
+        </w:numPr>
+        <w:pStyle w:val="Compact"/>
+      </w:pPr>
+      <w:r>
+        <w:t xml:space="preserve">The comparison’s footnote (</w:t>
+      </w:r>
+      <w:r>
+        <w:t xml:space="preserve">“</w:t>
+      </w:r>
+      <w:r>
+        <w:t xml:space="preserve">Your first 3-Month Supply is £99…</w:t>
+      </w:r>
+      <w:r>
+        <w:t xml:space="preserve">”</w:t>
+      </w:r>
+      <w:r>
+        <w:t xml:space="preserve">) also shows on the science page; update or remove it when the offer ends.</w:t>
+      </w:r>
+    </w:p>
+    <w:p>
+      <w:pPr>
+        <w:numPr>
+          <w:ilvl w:val="0"/>
+          <w:numId w:val="1022"/>
         </w:numPr>
         <w:pStyle w:val="Compact"/>
       </w:pPr>
@@ -3389,6 +3612,9 @@
     <w:abstractNumId w:val="991"/>
   </w:num>
   <w:num w:numId="1014">
+    <w:abstractNumId w:val="991"/>
+  </w:num>
+  <w:num w:numId="1015">
     <w:abstractNumId w:val="99411"/>
     <w:lvlOverride w:ilvl="0">
       <w:startOverride w:val="1"/>
@@ -3418,9 +3644,6 @@
       <w:startOverride w:val="1"/>
     </w:lvlOverride>
   </w:num>
-  <w:num w:numId="1015">
-    <w:abstractNumId w:val="991"/>
-  </w:num>
   <w:num w:numId="1016">
     <w:abstractNumId w:val="991"/>
   </w:num>
@@ -3437,6 +3660,9 @@
     <w:abstractNumId w:val="991"/>
   </w:num>
   <w:num w:numId="1021">
+    <w:abstractNumId w:val="991"/>
+  </w:num>
+  <w:num w:numId="1022">
     <w:abstractNumId w:val="991"/>
   </w:num>
 </w:numbering>
@@ -3928,7 +4154,7 @@
       <w:color w:themeColor="accent1" w:themeShade="BF" w:val="365F91"/>
     </w:rPr>
   </w:style>
-  <w:style w:customStyle="1" w:styleId="SourceCode" w:type="paragraph">
+  <w:style w:type="paragraph" w:customStyle="1" w:styleId="SourceCode">
     <w:name w:val="Source Code"/>
     <w:basedOn w:val="Normal"/>
     <w:link w:val="VerbatimChar"/>
@@ -3936,7 +4162,7 @@
       <w:wordWrap w:val="off"/>
     </w:pPr>
   </w:style>
-  <w:style w:customStyle="1" w:styleId="KeywordTok" w:type="character">
+  <w:style w:type="character" w:customStyle="1" w:styleId="KeywordTok">
     <w:name w:val="KeywordTok"/>
     <w:basedOn w:val="VerbatimChar"/>
     <w:rPr>
@@ -3944,77 +4170,77 @@
       <w:b/>
     </w:rPr>
   </w:style>
-  <w:style w:customStyle="1" w:styleId="DataTypeTok" w:type="character">
+  <w:style w:type="character" w:customStyle="1" w:styleId="DataTypeTok">
     <w:name w:val="DataTypeTok"/>
     <w:basedOn w:val="VerbatimChar"/>
     <w:rPr>
       <w:color w:val="902000"/>
     </w:rPr>
   </w:style>
-  <w:style w:customStyle="1" w:styleId="DecValTok" w:type="character">
+  <w:style w:type="character" w:customStyle="1" w:styleId="DecValTok">
     <w:name w:val="DecValTok"/>
     <w:basedOn w:val="VerbatimChar"/>
     <w:rPr>
       <w:color w:val="40a070"/>
     </w:rPr>
   </w:style>
-  <w:style w:customStyle="1" w:styleId="BaseNTok" w:type="character">
+  <w:style w:type="character" w:customStyle="1" w:styleId="BaseNTok">
     <w:name w:val="BaseNTok"/>
     <w:basedOn w:val="VerbatimChar"/>
     <w:rPr>
       <w:color w:val="40a070"/>
     </w:rPr>
   </w:style>
-  <w:style w:customStyle="1" w:styleId="FloatTok" w:type="character">
+  <w:style w:type="character" w:customStyle="1" w:styleId="FloatTok">
     <w:name w:val="FloatTok"/>
     <w:basedOn w:val="VerbatimChar"/>
     <w:rPr>
       <w:color w:val="40a070"/>
     </w:rPr>
   </w:style>
-  <w:style w:customStyle="1" w:styleId="ConstantTok" w:type="character">
+  <w:style w:type="character" w:customStyle="1" w:styleId="ConstantTok">
     <w:name w:val="ConstantTok"/>
     <w:basedOn w:val="VerbatimChar"/>
     <w:rPr>
       <w:color w:val="880000"/>
     </w:rPr>
   </w:style>
-  <w:style w:customStyle="1" w:styleId="CharTok" w:type="character">
+  <w:style w:type="character" w:customStyle="1" w:styleId="CharTok">
     <w:name w:val="CharTok"/>
     <w:basedOn w:val="VerbatimChar"/>
     <w:rPr>
       <w:color w:val="4070a0"/>
     </w:rPr>
   </w:style>
-  <w:style w:customStyle="1" w:styleId="SpecialCharTok" w:type="character">
+  <w:style w:type="character" w:customStyle="1" w:styleId="SpecialCharTok">
     <w:name w:val="SpecialCharTok"/>
     <w:basedOn w:val="VerbatimChar"/>
     <w:rPr>
       <w:color w:val="4070a0"/>
     </w:rPr>
   </w:style>
-  <w:style w:customStyle="1" w:styleId="StringTok" w:type="character">
+  <w:style w:type="character" w:customStyle="1" w:styleId="StringTok">
     <w:name w:val="StringTok"/>
     <w:basedOn w:val="VerbatimChar"/>
     <w:rPr>
       <w:color w:val="4070a0"/>
     </w:rPr>
   </w:style>
-  <w:style w:customStyle="1" w:styleId="VerbatimStringTok" w:type="character">
+  <w:style w:type="character" w:customStyle="1" w:styleId="VerbatimStringTok">
     <w:name w:val="VerbatimStringTok"/>
     <w:basedOn w:val="VerbatimChar"/>
     <w:rPr>
       <w:color w:val="4070a0"/>
     </w:rPr>
   </w:style>
-  <w:style w:customStyle="1" w:styleId="SpecialStringTok" w:type="character">
+  <w:style w:type="character" w:customStyle="1" w:styleId="SpecialStringTok">
     <w:name w:val="SpecialStringTok"/>
     <w:basedOn w:val="VerbatimChar"/>
     <w:rPr>
       <w:color w:val="bb6688"/>
     </w:rPr>
   </w:style>
-  <w:style w:customStyle="1" w:styleId="ImportTok" w:type="character">
+  <w:style w:type="character" w:customStyle="1" w:styleId="ImportTok">
     <w:name w:val="ImportTok"/>
     <w:basedOn w:val="VerbatimChar"/>
     <w:rPr>
@@ -4022,7 +4248,7 @@
       <w:b/>
     </w:rPr>
   </w:style>
-  <w:style w:customStyle="1" w:styleId="CommentTok" w:type="character">
+  <w:style w:type="character" w:customStyle="1" w:styleId="CommentTok">
     <w:name w:val="CommentTok"/>
     <w:basedOn w:val="VerbatimChar"/>
     <w:rPr>
@@ -4030,7 +4256,7 @@
       <w:i/>
     </w:rPr>
   </w:style>
-  <w:style w:customStyle="1" w:styleId="DocumentationTok" w:type="character">
+  <w:style w:type="character" w:customStyle="1" w:styleId="DocumentationTok">
     <w:name w:val="DocumentationTok"/>
     <w:basedOn w:val="VerbatimChar"/>
     <w:rPr>
@@ -4038,7 +4264,7 @@
       <w:i/>
     </w:rPr>
   </w:style>
-  <w:style w:customStyle="1" w:styleId="AnnotationTok" w:type="character">
+  <w:style w:type="character" w:customStyle="1" w:styleId="AnnotationTok">
     <w:name w:val="AnnotationTok"/>
     <w:basedOn w:val="VerbatimChar"/>
     <w:rPr>
@@ -4047,7 +4273,7 @@
       <w:i/>
     </w:rPr>
   </w:style>
-  <w:style w:customStyle="1" w:styleId="CommentVarTok" w:type="character">
+  <w:style w:type="character" w:customStyle="1" w:styleId="CommentVarTok">
     <w:name w:val="CommentVarTok"/>
     <w:basedOn w:val="VerbatimChar"/>
     <w:rPr>
@@ -4056,28 +4282,28 @@
       <w:i/>
     </w:rPr>
   </w:style>
-  <w:style w:customStyle="1" w:styleId="OtherTok" w:type="character">
+  <w:style w:type="character" w:customStyle="1" w:styleId="OtherTok">
     <w:name w:val="OtherTok"/>
     <w:basedOn w:val="VerbatimChar"/>
     <w:rPr>
       <w:color w:val="007020"/>
     </w:rPr>
   </w:style>
-  <w:style w:customStyle="1" w:styleId="FunctionTok" w:type="character">
+  <w:style w:type="character" w:customStyle="1" w:styleId="FunctionTok">
     <w:name w:val="FunctionTok"/>
     <w:basedOn w:val="VerbatimChar"/>
     <w:rPr>
       <w:color w:val="06287e"/>
     </w:rPr>
   </w:style>
-  <w:style w:customStyle="1" w:styleId="VariableTok" w:type="character">
+  <w:style w:type="character" w:customStyle="1" w:styleId="VariableTok">
     <w:name w:val="VariableTok"/>
     <w:basedOn w:val="VerbatimChar"/>
     <w:rPr>
       <w:color w:val="19177c"/>
     </w:rPr>
   </w:style>
-  <w:style w:customStyle="1" w:styleId="ControlFlowTok" w:type="character">
+  <w:style w:type="character" w:customStyle="1" w:styleId="ControlFlowTok">
     <w:name w:val="ControlFlowTok"/>
     <w:basedOn w:val="VerbatimChar"/>
     <w:rPr>
@@ -4085,45 +4311,45 @@
       <w:b/>
     </w:rPr>
   </w:style>
-  <w:style w:customStyle="1" w:styleId="OperatorTok" w:type="character">
+  <w:style w:type="character" w:customStyle="1" w:styleId="OperatorTok">
     <w:name w:val="OperatorTok"/>
     <w:basedOn w:val="VerbatimChar"/>
     <w:rPr>
       <w:color w:val="666666"/>
     </w:rPr>
   </w:style>
-  <w:style w:customStyle="1" w:styleId="BuiltInTok" w:type="character">
+  <w:style w:type="character" w:customStyle="1" w:styleId="BuiltInTok">
     <w:name w:val="BuiltInTok"/>
     <w:basedOn w:val="VerbatimChar"/>
     <w:rPr>
       <w:color w:val="008000"/>
     </w:rPr>
   </w:style>
-  <w:style w:customStyle="1" w:styleId="ExtensionTok" w:type="character">
+  <w:style w:type="character" w:customStyle="1" w:styleId="ExtensionTok">
     <w:name w:val="ExtensionTok"/>
     <w:basedOn w:val="VerbatimChar"/>
     <w:rPr/>
   </w:style>
-  <w:style w:customStyle="1" w:styleId="PreprocessorTok" w:type="character">
+  <w:style w:type="character" w:customStyle="1" w:styleId="PreprocessorTok">
     <w:name w:val="PreprocessorTok"/>
     <w:basedOn w:val="VerbatimChar"/>
     <w:rPr>
       <w:color w:val="bc7a00"/>
     </w:rPr>
   </w:style>
-  <w:style w:customStyle="1" w:styleId="AttributeTok" w:type="character">
+  <w:style w:type="character" w:customStyle="1" w:styleId="AttributeTok">
     <w:name w:val="AttributeTok"/>
     <w:basedOn w:val="VerbatimChar"/>
     <w:rPr>
       <w:color w:val="7d9029"/>
     </w:rPr>
   </w:style>
-  <w:style w:customStyle="1" w:styleId="RegionMarkerTok" w:type="character">
+  <w:style w:type="character" w:customStyle="1" w:styleId="RegionMarkerTok">
     <w:name w:val="RegionMarkerTok"/>
     <w:basedOn w:val="VerbatimChar"/>
     <w:rPr/>
   </w:style>
-  <w:style w:customStyle="1" w:styleId="InformationTok" w:type="character">
+  <w:style w:type="character" w:customStyle="1" w:styleId="InformationTok">
     <w:name w:val="InformationTok"/>
     <w:basedOn w:val="VerbatimChar"/>
     <w:rPr>
@@ -4132,7 +4358,7 @@
       <w:i/>
     </w:rPr>
   </w:style>
-  <w:style w:customStyle="1" w:styleId="WarningTok" w:type="character">
+  <w:style w:type="character" w:customStyle="1" w:styleId="WarningTok">
     <w:name w:val="WarningTok"/>
     <w:basedOn w:val="VerbatimChar"/>
     <w:rPr>
@@ -4141,7 +4367,7 @@
       <w:i/>
     </w:rPr>
   </w:style>
-  <w:style w:customStyle="1" w:styleId="AlertTok" w:type="character">
+  <w:style w:type="character" w:customStyle="1" w:styleId="AlertTok">
     <w:name w:val="AlertTok"/>
     <w:basedOn w:val="VerbatimChar"/>
     <w:rPr>
@@ -4149,7 +4375,7 @@
       <w:b/>
     </w:rPr>
   </w:style>
-  <w:style w:customStyle="1" w:styleId="ErrorTok" w:type="character">
+  <w:style w:type="character" w:customStyle="1" w:styleId="ErrorTok">
     <w:name w:val="ErrorTok"/>
     <w:basedOn w:val="VerbatimChar"/>
     <w:rPr>
@@ -4157,7 +4383,7 @@
       <w:b/>
     </w:rPr>
   </w:style>
-  <w:style w:customStyle="1" w:styleId="NormalTok" w:type="character">
+  <w:style w:type="character" w:customStyle="1" w:styleId="NormalTok">
     <w:name w:val="NormalTok"/>
     <w:basedOn w:val="VerbatimChar"/>
     <w:rPr/>

</xml_diff>

<commit_message>
Handoff: home page results videos
Co-Authored-By: Claude Opus 5.5 <noreply@anthropic.com>
Claude-Session: https://claude.ai/code/session_01VYMABo11xv71mQ7912r49G
</commit_message>
<xml_diff>
--- a/handoff/MUTO_Dev_Handoff_BF_PDP_31Oct2026.docx
+++ b/handoff/MUTO_Dev_Handoff_BF_PDP_31Oct2026.docx
@@ -1529,6 +1529,102 @@
     <w:p>
       <w:pPr>
         <w:pStyle w:val="FirstParagraph"/>
+      </w:pPr>
+      <w:r>
+        <w:rPr>
+          <w:bCs/>
+          <w:b/>
+        </w:rPr>
+        <w:t xml:space="preserve">Home page (</w:t>
+      </w:r>
+      <w:r>
+        <w:rPr>
+          <w:rStyle w:val="VerbatimChar"/>
+          <w:bCs/>
+          <w:b/>
+        </w:rPr>
+        <w:t xml:space="preserve">templates/index.json</w:t>
+      </w:r>
+      <w:r>
+        <w:rPr>
+          <w:bCs/>
+          <w:b/>
+        </w:rPr>
+        <w:t xml:space="preserve">):</w:t>
+      </w:r>
+      <w:r>
+        <w:t xml:space="preserve"> </w:t>
+      </w:r>
+      <w:r>
+        <w:t xml:space="preserve">the</w:t>
+      </w:r>
+      <w:r>
+        <w:t xml:space="preserve"> </w:t>
+      </w:r>
+      <w:r>
+        <w:t xml:space="preserve">“</w:t>
+      </w:r>
+      <w:r>
+        <w:t xml:space="preserve">Still training. Still working. Not done yet.</w:t>
+      </w:r>
+      <w:r>
+        <w:t xml:space="preserve">”</w:t>
+      </w:r>
+      <w:r>
+        <w:t xml:space="preserve"> </w:t>
+      </w:r>
+      <w:r>
+        <w:t xml:space="preserve">athletes block is replaced, in the same place, by the product page’s</w:t>
+      </w:r>
+      <w:r>
+        <w:t xml:space="preserve"> </w:t>
+      </w:r>
+      <w:r>
+        <w:t xml:space="preserve">“</w:t>
+      </w:r>
+      <w:r>
+        <w:t xml:space="preserve">Don’t take our word for it.</w:t>
+      </w:r>
+      <w:r>
+        <w:t xml:space="preserve">”</w:t>
+      </w:r>
+      <w:r>
+        <w:t xml:space="preserve"> </w:t>
+      </w:r>
+      <w:r>
+        <w:t xml:space="preserve">customer results videos (all 8). Nothing else on the home page changed. The file is in the zip under</w:t>
+      </w:r>
+      <w:r>
+        <w:t xml:space="preserve"> </w:t>
+      </w:r>
+      <w:r>
+        <w:rPr>
+          <w:rStyle w:val="VerbatimChar"/>
+        </w:rPr>
+        <w:t xml:space="preserve">templates/</w:t>
+      </w:r>
+      <w:r>
+        <w:t xml:space="preserve"> </w:t>
+      </w:r>
+      <w:r>
+        <w:t xml:space="preserve">and in GitHub at</w:t>
+      </w:r>
+      <w:r>
+        <w:t xml:space="preserve"> </w:t>
+      </w:r>
+      <w:r>
+        <w:rPr>
+          <w:rStyle w:val="VerbatimChar"/>
+        </w:rPr>
+        <w:t xml:space="preserve">shopify/home-videos/theme/templates/index.json</w:t>
+      </w:r>
+      <w:r>
+        <w:t xml:space="preserve">. If the live home page has been edited since 31 October, re-make this change in Customize instead of copying the file.</w:t>
+      </w:r>
+    </w:p>
+    <w:p>
+      <w:pPr>
+        <w:pStyle w:val="BodyText"/>
       </w:pPr>
       <w:r>
         <w:rPr>
@@ -2749,6 +2845,18 @@
       </w:pPr>
       <w:r>
         <w:t xml:space="preserve">☐ Doesn’t collide with chat or popup widgets at the bottom of the screen.</w:t>
+      </w:r>
+    </w:p>
+    <w:p>
+      <w:pPr>
+        <w:numPr>
+          <w:ilvl w:val="0"/>
+          <w:numId w:val="1017"/>
+        </w:numPr>
+        <w:pStyle w:val="Compact"/>
+      </w:pPr>
+      <w:r>
+        <w:t xml:space="preserve">☐ Home page: the results videos play, and the athletes block is gone.</w:t>
       </w:r>
     </w:p>
     <w:p>

</xml_diff>

<commit_message>
Handoff: simplified science page
Co-Authored-By: Claude Opus 5.5 <noreply@anthropic.com>
Claude-Session: https://claude.ai/code/session_01VYMABo11xv71mQ7912r49G
</commit_message>
<xml_diff>
--- a/handoff/MUTO_Dev_Handoff_BF_PDP_31Oct2026.docx
+++ b/handoff/MUTO_Dev_Handoff_BF_PDP_31Oct2026.docx
@@ -1403,19 +1403,518 @@
           <w:bCs/>
           <w:b/>
         </w:rPr>
+        <w:t xml:space="preserve">), redesigned and simpler</w:t>
+      </w:r>
+    </w:p>
+    <w:p>
+      <w:pPr>
+        <w:pStyle w:val="BodyText"/>
+      </w:pPr>
+      <w:r>
+        <w:t xml:space="preserve">The template is replaced (</w:t>
+      </w:r>
+      <w:r>
+        <w:rPr>
+          <w:rStyle w:val="VerbatimChar"/>
+        </w:rPr>
+        <w:t xml:space="preserve">templates/page.science-simple.json</w:t>
+      </w:r>
+      <w:r>
+        <w:t xml:space="preserve">) and uses a new section,</w:t>
+      </w:r>
+      <w:r>
+        <w:t xml:space="preserve"> </w:t>
+      </w:r>
+      <w:r>
+        <w:rPr>
+          <w:rStyle w:val="VerbatimChar"/>
+        </w:rPr>
+        <w:t xml:space="preserve">sections/muto-sci.liquid</w:t>
+      </w:r>
+      <w:r>
+        <w:t xml:space="preserve"> </w:t>
+      </w:r>
+      <w:r>
+        <w:t xml:space="preserve">(</w:t>
+      </w:r>
+      <w:r>
+        <w:t xml:space="preserve">“</w:t>
+      </w:r>
+      <w:r>
+        <w:t xml:space="preserve">MUTO — Science (simple)</w:t>
+      </w:r>
+      <w:r>
+        <w:t xml:space="preserve">”</w:t>
+      </w:r>
+      <w:r>
+        <w:t xml:space="preserve">). Top to bottom:</w:t>
+      </w:r>
+    </w:p>
+    <w:p>
+      <w:pPr>
+        <w:numPr>
+          <w:ilvl w:val="0"/>
+          <w:numId w:val="1013"/>
+        </w:numPr>
+        <w:pStyle w:val="Compact"/>
+      </w:pPr>
+      <w:r>
+        <w:rPr>
+          <w:bCs/>
+          <w:b/>
+        </w:rPr>
+        <w:t xml:space="preserve">Hero:</w:t>
+      </w:r>
+      <w:r>
+        <w:t xml:space="preserve"> </w:t>
+      </w:r>
+      <w:r>
+        <w:t xml:space="preserve">“</w:t>
+      </w:r>
+      <w:r>
+        <w:t xml:space="preserve">What changes in your body after 35, and what to do about it.</w:t>
+      </w:r>
+      <w:r>
+        <w:t xml:space="preserve">”</w:t>
+      </w:r>
+      <w:r>
+        <w:t xml:space="preserve">, the Black Friday descriptor and a</w:t>
+      </w:r>
+      <w:r>
+        <w:t xml:space="preserve"> </w:t>
+      </w:r>
+      <w:r>
+        <w:t xml:space="preserve">“</w:t>
+      </w:r>
+      <w:r>
+        <w:t xml:space="preserve">See the Black Friday offer</w:t>
+      </w:r>
+      <w:r>
+        <w:t xml:space="preserve">”</w:t>
+      </w:r>
+      <w:r>
+        <w:t xml:space="preserve"> </w:t>
+      </w:r>
+      <w:r>
+        <w:t xml:space="preserve">button. Three grey cards on the right:</w:t>
+      </w:r>
+    </w:p>
+    <w:p>
+      <w:pPr>
+        <w:numPr>
+          <w:ilvl w:val="1"/>
+          <w:numId w:val="1014"/>
+        </w:numPr>
+        <w:pStyle w:val="Compact"/>
+      </w:pPr>
+      <w:r>
+        <w:rPr>
+          <w:bCs/>
+          <w:b/>
+        </w:rPr>
+        <w:t xml:space="preserve">NAD+ +51%:</w:t>
+      </w:r>
+      <w:r>
+        <w:t xml:space="preserve"> </w:t>
+      </w:r>
+      <w:r>
+        <w:t xml:space="preserve">the NR study, with a footnote saying it tested NR on its own, not MUTO.</w:t>
+      </w:r>
+    </w:p>
+    <w:p>
+      <w:pPr>
+        <w:numPr>
+          <w:ilvl w:val="1"/>
+          <w:numId w:val="1014"/>
+        </w:numPr>
+        <w:pStyle w:val="Compact"/>
+      </w:pPr>
+      <w:r>
+        <w:rPr>
+          <w:bCs/>
+          <w:b/>
+        </w:rPr>
+        <w:t xml:space="preserve">Energy:</w:t>
+      </w:r>
+      <w:r>
+        <w:t xml:space="preserve"> </w:t>
+      </w:r>
+      <w:r>
+        <w:t xml:space="preserve">a photo, with the authorised B6/B12 claim.</w:t>
+      </w:r>
+    </w:p>
+    <w:p>
+      <w:pPr>
+        <w:numPr>
+          <w:ilvl w:val="1"/>
+          <w:numId w:val="1014"/>
+        </w:numPr>
+        <w:pStyle w:val="Compact"/>
+      </w:pPr>
+      <w:r>
+        <w:rPr>
+          <w:bCs/>
+          <w:b/>
+        </w:rPr>
+        <w:t xml:space="preserve">Recovery:</w:t>
+      </w:r>
+      <w:r>
+        <w:t xml:space="preserve"> </w:t>
+      </w:r>
+      <w:r>
+        <w:t xml:space="preserve">2,000 IU, with the vitamin D claim.</w:t>
+      </w:r>
+    </w:p>
+    <w:p>
+      <w:pPr>
+        <w:numPr>
+          <w:ilvl w:val="0"/>
+          <w:numId w:val="1013"/>
+        </w:numPr>
+        <w:pStyle w:val="Compact"/>
+      </w:pPr>
+      <w:r>
+        <w:rPr>
+          <w:bCs/>
+          <w:b/>
+        </w:rPr>
+        <w:t xml:space="preserve">Why you feel it:</w:t>
+      </w:r>
+      <w:r>
+        <w:t xml:space="preserve"> </w:t>
+      </w:r>
+      <w:r>
+        <w:t xml:space="preserve">a photo and the NAD+ story.</w:t>
+      </w:r>
+    </w:p>
+    <w:p>
+      <w:pPr>
+        <w:numPr>
+          <w:ilvl w:val="0"/>
+          <w:numId w:val="1013"/>
+        </w:numPr>
+        <w:pStyle w:val="Compact"/>
+      </w:pPr>
+      <w:r>
+        <w:rPr>
+          <w:bCs/>
+          <w:b/>
+        </w:rPr>
+        <w:t xml:space="preserve">Founder quote:</w:t>
+      </w:r>
+      <w:r>
+        <w:t xml:space="preserve"> </w:t>
+      </w:r>
+      <w:r>
+        <w:t xml:space="preserve">Richie’s photo.</w:t>
+      </w:r>
+    </w:p>
+    <w:p>
+      <w:pPr>
+        <w:numPr>
+          <w:ilvl w:val="0"/>
+          <w:numId w:val="1013"/>
+        </w:numPr>
+        <w:pStyle w:val="Compact"/>
+      </w:pPr>
+      <w:r>
+        <w:rPr>
+          <w:bCs/>
+          <w:b/>
+        </w:rPr>
+        <w:t xml:space="preserve">The same</w:t>
+      </w:r>
+      <w:r>
+        <w:rPr>
+          <w:bCs/>
+          <w:b/>
+        </w:rPr>
+        <w:t xml:space="preserve"> </w:t>
+      </w:r>
+      <w:r>
+        <w:rPr>
+          <w:bCs/>
+          <w:b/>
+        </w:rPr>
+        <w:t xml:space="preserve">“</w:t>
+      </w:r>
+      <w:r>
+        <w:rPr>
+          <w:bCs/>
+          <w:b/>
+        </w:rPr>
+        <w:t xml:space="preserve">MUTO vs the usual</w:t>
+      </w:r>
+      <w:r>
+        <w:rPr>
+          <w:bCs/>
+          <w:b/>
+        </w:rPr>
+        <w:t xml:space="preserve">”</w:t>
+      </w:r>
+      <w:r>
+        <w:rPr>
+          <w:bCs/>
+          <w:b/>
+        </w:rPr>
+        <w:t xml:space="preserve"> </w:t>
+      </w:r>
+      <w:r>
+        <w:rPr>
+          <w:bCs/>
+          <w:b/>
+        </w:rPr>
+        <w:t xml:space="preserve">comparison</w:t>
+      </w:r>
+      <w:r>
+        <w:t xml:space="preserve"> </w:t>
+      </w:r>
+      <w:r>
+        <w:t xml:space="preserve">as the product page. It’s swapped into the empty</w:t>
+      </w:r>
+      <w:r>
+        <w:t xml:space="preserve"> </w:t>
+      </w:r>
+      <w:r>
+        <w:rPr>
+          <w:rStyle w:val="VerbatimChar"/>
+        </w:rPr>
+        <w:t xml:space="preserve">compare</w:t>
+      </w:r>
+      <w:r>
+        <w:t xml:space="preserve"> </w:t>
+      </w:r>
+      <w:r>
+        <w:t xml:space="preserve">slot by</w:t>
+      </w:r>
+      <w:r>
+        <w:t xml:space="preserve"> </w:t>
+      </w:r>
+      <w:r>
+        <w:rPr>
+          <w:rStyle w:val="VerbatimChar"/>
+        </w:rPr>
+        <w:t xml:space="preserve">muto-bf-head.liquid</w:t>
+      </w:r>
+      <w:r>
+        <w:t xml:space="preserve">.</w:t>
+      </w:r>
+    </w:p>
+    <w:p>
+      <w:pPr>
+        <w:numPr>
+          <w:ilvl w:val="0"/>
+          <w:numId w:val="1013"/>
+        </w:numPr>
+        <w:pStyle w:val="Compact"/>
+      </w:pPr>
+      <w:r>
+        <w:rPr>
+          <w:bCs/>
+          <w:b/>
+        </w:rPr>
+        <w:t xml:space="preserve">Standards:</w:t>
+      </w:r>
+      <w:r>
+        <w:t xml:space="preserve"> </w:t>
+      </w:r>
+      <w:r>
+        <w:t xml:space="preserve">a statement, then 19 ingredients, 300mg NR, 7 scientists and 4 UK universities.</w:t>
+      </w:r>
+    </w:p>
+    <w:p>
+      <w:pPr>
+        <w:numPr>
+          <w:ilvl w:val="0"/>
+          <w:numId w:val="1013"/>
+        </w:numPr>
+        <w:pStyle w:val="Compact"/>
+      </w:pPr>
+      <w:r>
+        <w:rPr>
+          <w:bCs/>
+          <w:b/>
+        </w:rPr>
+        <w:t xml:space="preserve">The scientific board:</w:t>
+      </w:r>
+      <w:r>
+        <w:t xml:space="preserve"> </w:t>
+      </w:r>
+      <w:r>
+        <w:t xml:space="preserve">the existing section, unchanged.</w:t>
+      </w:r>
+    </w:p>
+    <w:p>
+      <w:pPr>
+        <w:numPr>
+          <w:ilvl w:val="0"/>
+          <w:numId w:val="1013"/>
+        </w:numPr>
+        <w:pStyle w:val="Compact"/>
+      </w:pPr>
+      <w:r>
+        <w:rPr>
+          <w:bCs/>
+          <w:b/>
+        </w:rPr>
+        <w:t xml:space="preserve">Research:</w:t>
+      </w:r>
+      <w:r>
+        <w:t xml:space="preserve"> </w:t>
+      </w:r>
+      <w:r>
+        <w:t xml:space="preserve">“</w:t>
+      </w:r>
+      <w:r>
+        <w:t xml:space="preserve">Tested properly, published honestly</w:t>
+      </w:r>
+      <w:r>
+        <w:t xml:space="preserve">”</w:t>
+      </w:r>
+      <w:r>
+        <w:t xml:space="preserve">, with the</w:t>
+      </w:r>
+      <w:r>
+        <w:t xml:space="preserve"> </w:t>
+      </w:r>
+      <w:r>
+        <w:t xml:space="preserve">“</w:t>
+      </w:r>
+      <w:r>
+        <w:t xml:space="preserve">no results yet</w:t>
+      </w:r>
+      <w:r>
+        <w:t xml:space="preserve">”</w:t>
+      </w:r>
+      <w:r>
+        <w:t xml:space="preserve"> </w:t>
+      </w:r>
+      <w:r>
+        <w:t xml:space="preserve">wording.</w:t>
+      </w:r>
+    </w:p>
+    <w:p>
+      <w:pPr>
+        <w:numPr>
+          <w:ilvl w:val="0"/>
+          <w:numId w:val="1013"/>
+        </w:numPr>
+        <w:pStyle w:val="Compact"/>
+      </w:pPr>
+      <w:r>
+        <w:rPr>
+          <w:bCs/>
+          <w:b/>
+        </w:rPr>
+        <w:t xml:space="preserve">Black Friday band:</w:t>
+      </w:r>
+      <w:r>
+        <w:t xml:space="preserve"> </w:t>
+      </w:r>
+      <w:r>
+        <w:t xml:space="preserve">“</w:t>
+      </w:r>
+      <w:r>
+        <w:t xml:space="preserve">3 months for £99. Save 53%</w:t>
+      </w:r>
+      <w:r>
+        <w:t xml:space="preserve">”</w:t>
+      </w:r>
+      <w:r>
+        <w:t xml:space="preserve">, with a Claim offer button.</w:t>
+      </w:r>
+    </w:p>
+    <w:p>
+      <w:pPr>
+        <w:numPr>
+          <w:ilvl w:val="0"/>
+          <w:numId w:val="1013"/>
+        </w:numPr>
+        <w:pStyle w:val="Compact"/>
+      </w:pPr>
+      <w:r>
+        <w:rPr>
+          <w:bCs/>
+          <w:b/>
+        </w:rPr>
+        <w:t xml:space="preserve">Reviews:</w:t>
+      </w:r>
+      <w:r>
+        <w:t xml:space="preserve"> </w:t>
+      </w:r>
+      <w:r>
+        <w:t xml:space="preserve">the existing section, unchanged.</w:t>
+      </w:r>
+    </w:p>
+    <w:p>
+      <w:pPr>
+        <w:pStyle w:val="FirstParagraph"/>
+      </w:pPr>
+      <w:r>
+        <w:t xml:space="preserve">Removed: chapters 01–03, the 90-day timeline and the</w:t>
+      </w:r>
+      <w:r>
+        <w:t xml:space="preserve"> </w:t>
+      </w:r>
+      <w:r>
+        <w:t xml:space="preserve">“</w:t>
+      </w:r>
+      <w:r>
+        <w:t xml:space="preserve">Start your 90 days</w:t>
+      </w:r>
+      <w:r>
+        <w:t xml:space="preserve">”</w:t>
+      </w:r>
+      <w:r>
+        <w:t xml:space="preserve"> </w:t>
+      </w:r>
+      <w:r>
+        <w:t xml:space="preserve">box, which had the old £60 price. In GitHub at</w:t>
+      </w:r>
+      <w:r>
+        <w:t xml:space="preserve"> </w:t>
+      </w:r>
+      <w:r>
+        <w:rPr>
+          <w:rStyle w:val="VerbatimChar"/>
+        </w:rPr>
+        <w:t xml:space="preserve">shopify/science-v2/</w:t>
+      </w:r>
+      <w:r>
+        <w:t xml:space="preserve">. After Black Friday, change the hero button, the offer band and the comparison footnote in Customize.</w:t>
+      </w:r>
+    </w:p>
+    <w:p>
+      <w:pPr>
+        <w:pStyle w:val="BodyText"/>
+      </w:pPr>
+      <w:r>
+        <w:rPr>
+          <w:bCs/>
+          <w:b/>
+        </w:rPr>
+        <w:t xml:space="preserve">Home page (</w:t>
+      </w:r>
+      <w:r>
+        <w:rPr>
+          <w:rStyle w:val="VerbatimChar"/>
+          <w:bCs/>
+          <w:b/>
+        </w:rPr>
+        <w:t xml:space="preserve">templates/index.json</w:t>
+      </w:r>
+      <w:r>
+        <w:rPr>
+          <w:bCs/>
+          <w:b/>
+        </w:rPr>
         <w:t xml:space="preserve">):</w:t>
       </w:r>
-    </w:p>
-    <w:p>
-      <w:pPr>
-        <w:numPr>
-          <w:ilvl w:val="0"/>
-          <w:numId w:val="1013"/>
-        </w:numPr>
-        <w:pStyle w:val="Compact"/>
-      </w:pPr>
-      <w:r>
-        <w:t xml:space="preserve">Chapter 04’s table is replaced by the same</w:t>
+      <w:r>
+        <w:t xml:space="preserve"> </w:t>
+      </w:r>
+      <w:r>
+        <w:t xml:space="preserve">the</w:t>
       </w:r>
       <w:r>
         <w:t xml:space="preserve"> </w:t>
@@ -1424,7 +1923,7 @@
         <w:t xml:space="preserve">“</w:t>
       </w:r>
       <w:r>
-        <w:t xml:space="preserve">MUTO vs the usual</w:t>
+        <w:t xml:space="preserve">Still training. Still working. Not done yet.</w:t>
       </w:r>
       <w:r>
         <w:t xml:space="preserve">”</w:t>
@@ -1433,7 +1932,7 @@
         <w:t xml:space="preserve"> </w:t>
       </w:r>
       <w:r>
-        <w:t xml:space="preserve">comparison. The chapter menu’s</w:t>
+        <w:t xml:space="preserve">athletes block is replaced, in the same place, by the product page’s</w:t>
       </w:r>
       <w:r>
         <w:t xml:space="preserve"> </w:t>
@@ -1442,7 +1941,7 @@
         <w:t xml:space="preserve">“</w:t>
       </w:r>
       <w:r>
-        <w:t xml:space="preserve">Comparison</w:t>
+        <w:t xml:space="preserve">Don’t take our word for it.</w:t>
       </w:r>
       <w:r>
         <w:t xml:space="preserve">”</w:t>
@@ -1451,49 +1950,7 @@
         <w:t xml:space="preserve"> </w:t>
       </w:r>
       <w:r>
-        <w:t xml:space="preserve">link still jumps to it.</w:t>
-      </w:r>
-    </w:p>
-    <w:p>
-      <w:pPr>
-        <w:numPr>
-          <w:ilvl w:val="0"/>
-          <w:numId w:val="1013"/>
-        </w:numPr>
-        <w:pStyle w:val="Compact"/>
-      </w:pPr>
-      <w:r>
-        <w:t xml:space="preserve">Simplified: chapter 01’s takeaway line (repeated in chapter 02), and chapter 03’s</w:t>
-      </w:r>
-      <w:r>
-        <w:t xml:space="preserve"> </w:t>
-      </w:r>
-      <w:r>
-        <w:t xml:space="preserve">“</w:t>
-      </w:r>
-      <w:r>
-        <w:t xml:space="preserve">How the 19 ingredients work together</w:t>
-      </w:r>
-      <w:r>
-        <w:t xml:space="preserve">”</w:t>
-      </w:r>
-      <w:r>
-        <w:t xml:space="preserve"> </w:t>
-      </w:r>
-      <w:r>
-        <w:t xml:space="preserve">table and BioPerine line are hidden.</w:t>
-      </w:r>
-    </w:p>
-    <w:p>
-      <w:pPr>
-        <w:numPr>
-          <w:ilvl w:val="0"/>
-          <w:numId w:val="1013"/>
-        </w:numPr>
-        <w:pStyle w:val="Compact"/>
-      </w:pPr>
-      <w:r>
-        <w:t xml:space="preserve">Done from</w:t>
+        <w:t xml:space="preserve">customer results videos (all 8). Nothing else on the home page changed. The file is in the zip under</w:t>
       </w:r>
       <w:r>
         <w:t xml:space="preserve"> </w:t>
@@ -1502,13 +1959,13 @@
         <w:rPr>
           <w:rStyle w:val="VerbatimChar"/>
         </w:rPr>
-        <w:t xml:space="preserve">muto-bf-head.liquid</w:t>
-      </w:r>
-      <w:r>
-        <w:t xml:space="preserve"> </w:t>
-      </w:r>
-      <w:r>
-        <w:t xml:space="preserve">(its second</w:t>
+        <w:t xml:space="preserve">templates/</w:t>
+      </w:r>
+      <w:r>
+        <w:t xml:space="preserve"> </w:t>
+      </w:r>
+      <w:r>
+        <w:t xml:space="preserve">and in GitHub at</w:t>
       </w:r>
       <w:r>
         <w:t xml:space="preserve"> </w:t>
@@ -1517,105 +1974,6 @@
         <w:rPr>
           <w:rStyle w:val="VerbatimChar"/>
         </w:rPr>
-        <w:t xml:space="preserve">if</w:t>
-      </w:r>
-      <w:r>
-        <w:t xml:space="preserve"> </w:t>
-      </w:r>
-      <w:r>
-        <w:t xml:space="preserve">block). The science template itself is unchanged.</w:t>
-      </w:r>
-    </w:p>
-    <w:p>
-      <w:pPr>
-        <w:pStyle w:val="FirstParagraph"/>
-      </w:pPr>
-      <w:r>
-        <w:rPr>
-          <w:bCs/>
-          <w:b/>
-        </w:rPr>
-        <w:t xml:space="preserve">Home page (</w:t>
-      </w:r>
-      <w:r>
-        <w:rPr>
-          <w:rStyle w:val="VerbatimChar"/>
-          <w:bCs/>
-          <w:b/>
-        </w:rPr>
-        <w:t xml:space="preserve">templates/index.json</w:t>
-      </w:r>
-      <w:r>
-        <w:rPr>
-          <w:bCs/>
-          <w:b/>
-        </w:rPr>
-        <w:t xml:space="preserve">):</w:t>
-      </w:r>
-      <w:r>
-        <w:t xml:space="preserve"> </w:t>
-      </w:r>
-      <w:r>
-        <w:t xml:space="preserve">the</w:t>
-      </w:r>
-      <w:r>
-        <w:t xml:space="preserve"> </w:t>
-      </w:r>
-      <w:r>
-        <w:t xml:space="preserve">“</w:t>
-      </w:r>
-      <w:r>
-        <w:t xml:space="preserve">Still training. Still working. Not done yet.</w:t>
-      </w:r>
-      <w:r>
-        <w:t xml:space="preserve">”</w:t>
-      </w:r>
-      <w:r>
-        <w:t xml:space="preserve"> </w:t>
-      </w:r>
-      <w:r>
-        <w:t xml:space="preserve">athletes block is replaced, in the same place, by the product page’s</w:t>
-      </w:r>
-      <w:r>
-        <w:t xml:space="preserve"> </w:t>
-      </w:r>
-      <w:r>
-        <w:t xml:space="preserve">“</w:t>
-      </w:r>
-      <w:r>
-        <w:t xml:space="preserve">Don’t take our word for it.</w:t>
-      </w:r>
-      <w:r>
-        <w:t xml:space="preserve">”</w:t>
-      </w:r>
-      <w:r>
-        <w:t xml:space="preserve"> </w:t>
-      </w:r>
-      <w:r>
-        <w:t xml:space="preserve">customer results videos (all 8). Nothing else on the home page changed. The file is in the zip under</w:t>
-      </w:r>
-      <w:r>
-        <w:t xml:space="preserve"> </w:t>
-      </w:r>
-      <w:r>
-        <w:rPr>
-          <w:rStyle w:val="VerbatimChar"/>
-        </w:rPr>
-        <w:t xml:space="preserve">templates/</w:t>
-      </w:r>
-      <w:r>
-        <w:t xml:space="preserve"> </w:t>
-      </w:r>
-      <w:r>
-        <w:t xml:space="preserve">and in GitHub at</w:t>
-      </w:r>
-      <w:r>
-        <w:t xml:space="preserve"> </w:t>
-      </w:r>
-      <w:r>
-        <w:rPr>
-          <w:rStyle w:val="VerbatimChar"/>
-        </w:rPr>
         <w:t xml:space="preserve">shopify/home-videos/theme/templates/index.json</w:t>
       </w:r>
       <w:r>
@@ -1644,7 +2002,7 @@
       <w:pPr>
         <w:numPr>
           <w:ilvl w:val="0"/>
-          <w:numId w:val="1014"/>
+          <w:numId w:val="1015"/>
         </w:numPr>
         <w:pStyle w:val="Compact"/>
       </w:pPr>
@@ -1656,7 +2014,7 @@
       <w:pPr>
         <w:numPr>
           <w:ilvl w:val="0"/>
-          <w:numId w:val="1014"/>
+          <w:numId w:val="1015"/>
         </w:numPr>
         <w:pStyle w:val="Compact"/>
       </w:pPr>
@@ -1668,7 +2026,7 @@
       <w:pPr>
         <w:numPr>
           <w:ilvl w:val="0"/>
-          <w:numId w:val="1014"/>
+          <w:numId w:val="1015"/>
         </w:numPr>
         <w:pStyle w:val="Compact"/>
       </w:pPr>
@@ -2454,7 +2812,7 @@
       <w:pPr>
         <w:numPr>
           <w:ilvl w:val="0"/>
-          <w:numId w:val="1015"/>
+          <w:numId w:val="1016"/>
         </w:numPr>
         <w:pStyle w:val="Compact"/>
       </w:pPr>
@@ -2532,7 +2890,7 @@
       <w:pPr>
         <w:numPr>
           <w:ilvl w:val="0"/>
-          <w:numId w:val="1015"/>
+          <w:numId w:val="1016"/>
         </w:numPr>
         <w:pStyle w:val="Compact"/>
       </w:pPr>
@@ -2544,7 +2902,7 @@
       <w:pPr>
         <w:numPr>
           <w:ilvl w:val="1"/>
-          <w:numId w:val="1016"/>
+          <w:numId w:val="1017"/>
         </w:numPr>
         <w:pStyle w:val="Compact"/>
       </w:pPr>
@@ -2565,7 +2923,7 @@
       <w:pPr>
         <w:numPr>
           <w:ilvl w:val="1"/>
-          <w:numId w:val="1016"/>
+          <w:numId w:val="1017"/>
         </w:numPr>
         <w:pStyle w:val="Compact"/>
       </w:pPr>
@@ -2618,7 +2976,7 @@
       <w:pPr>
         <w:numPr>
           <w:ilvl w:val="1"/>
-          <w:numId w:val="1016"/>
+          <w:numId w:val="1017"/>
         </w:numPr>
         <w:pStyle w:val="Compact"/>
       </w:pPr>
@@ -2655,7 +3013,7 @@
       <w:pPr>
         <w:numPr>
           <w:ilvl w:val="1"/>
-          <w:numId w:val="1016"/>
+          <w:numId w:val="1017"/>
         </w:numPr>
         <w:pStyle w:val="Compact"/>
       </w:pPr>
@@ -2677,7 +3035,7 @@
       <w:pPr>
         <w:numPr>
           <w:ilvl w:val="0"/>
-          <w:numId w:val="1017"/>
+          <w:numId w:val="1018"/>
         </w:numPr>
         <w:pStyle w:val="Compact"/>
       </w:pPr>
@@ -2702,63 +3060,63 @@
       <w:pPr>
         <w:numPr>
           <w:ilvl w:val="1"/>
+          <w:numId w:val="1019"/>
+        </w:numPr>
+        <w:pStyle w:val="Compact"/>
+      </w:pPr>
+      <w:r>
+        <w:t xml:space="preserve">Check the first box is</w:t>
+      </w:r>
+      <w:r>
+        <w:t xml:space="preserve"> </w:t>
+      </w:r>
+      <w:r>
+        <w:rPr>
+          <w:bCs/>
+          <w:b/>
+        </w:rPr>
+        <w:t xml:space="preserve">£99</w:t>
+      </w:r>
+      <w:r>
+        <w:t xml:space="preserve"> </w:t>
+      </w:r>
+      <w:r>
+        <w:t xml:space="preserve">(Skio’s intro price) and the welcome kit gifts are there.</w:t>
+      </w:r>
+    </w:p>
+    <w:p>
+      <w:pPr>
+        <w:numPr>
+          <w:ilvl w:val="1"/>
+          <w:numId w:val="1019"/>
+        </w:numPr>
+        <w:pStyle w:val="Compact"/>
+      </w:pPr>
+      <w:r>
+        <w:t xml:space="preserve">Claim skips the cart drawer. If any gift is added by something in the drawer, it won’t be added this way.</w:t>
+      </w:r>
+    </w:p>
+    <w:p>
+      <w:pPr>
+        <w:numPr>
+          <w:ilvl w:val="0"/>
           <w:numId w:val="1018"/>
         </w:numPr>
         <w:pStyle w:val="Compact"/>
       </w:pPr>
       <w:r>
-        <w:t xml:space="preserve">Check the first box is</w:t>
-      </w:r>
-      <w:r>
-        <w:t xml:space="preserve"> </w:t>
-      </w:r>
-      <w:r>
-        <w:rPr>
-          <w:bCs/>
-          <w:b/>
-        </w:rPr>
-        <w:t xml:space="preserve">£99</w:t>
-      </w:r>
-      <w:r>
-        <w:t xml:space="preserve"> </w:t>
-      </w:r>
-      <w:r>
-        <w:t xml:space="preserve">(Skio’s intro price) and the welcome kit gifts are there.</w:t>
-      </w:r>
-    </w:p>
-    <w:p>
-      <w:pPr>
-        <w:numPr>
-          <w:ilvl w:val="1"/>
+        <w:t xml:space="preserve">☐ Place test orders through the main button, the sticky bar (both plans) and the one-time purchase. Check the right variant and plan in each.</w:t>
+      </w:r>
+    </w:p>
+    <w:p>
+      <w:pPr>
+        <w:numPr>
+          <w:ilvl w:val="0"/>
           <w:numId w:val="1018"/>
         </w:numPr>
         <w:pStyle w:val="Compact"/>
       </w:pPr>
       <w:r>
-        <w:t xml:space="preserve">Claim skips the cart drawer. If any gift is added by something in the drawer, it won’t be added this way.</w:t>
-      </w:r>
-    </w:p>
-    <w:p>
-      <w:pPr>
-        <w:numPr>
-          <w:ilvl w:val="0"/>
-          <w:numId w:val="1017"/>
-        </w:numPr>
-        <w:pStyle w:val="Compact"/>
-      </w:pPr>
-      <w:r>
-        <w:t xml:space="preserve">☐ Place test orders through the main button, the sticky bar (both plans) and the one-time purchase. Check the right variant and plan in each.</w:t>
-      </w:r>
-    </w:p>
-    <w:p>
-      <w:pPr>
-        <w:numPr>
-          <w:ilvl w:val="0"/>
-          <w:numId w:val="1017"/>
-        </w:numPr>
-        <w:pStyle w:val="Compact"/>
-      </w:pPr>
-      <w:r>
         <w:t xml:space="preserve">☐ Do the same on the -2 product.</w:t>
       </w:r>
     </w:p>
@@ -2766,7 +3124,7 @@
       <w:pPr>
         <w:numPr>
           <w:ilvl w:val="0"/>
-          <w:numId w:val="1017"/>
+          <w:numId w:val="1018"/>
         </w:numPr>
         <w:pStyle w:val="Compact"/>
       </w:pPr>
@@ -2778,7 +3136,7 @@
       <w:pPr>
         <w:numPr>
           <w:ilvl w:val="0"/>
-          <w:numId w:val="1017"/>
+          <w:numId w:val="1018"/>
         </w:numPr>
         <w:pStyle w:val="Compact"/>
       </w:pPr>
@@ -2790,7 +3148,7 @@
       <w:pPr>
         <w:numPr>
           <w:ilvl w:val="0"/>
-          <w:numId w:val="1017"/>
+          <w:numId w:val="1018"/>
         </w:numPr>
         <w:pStyle w:val="Compact"/>
       </w:pPr>
@@ -2802,7 +3160,7 @@
       <w:pPr>
         <w:numPr>
           <w:ilvl w:val="0"/>
-          <w:numId w:val="1017"/>
+          <w:numId w:val="1018"/>
         </w:numPr>
         <w:pStyle w:val="Compact"/>
       </w:pPr>
@@ -2814,7 +3172,7 @@
       <w:pPr>
         <w:numPr>
           <w:ilvl w:val="0"/>
-          <w:numId w:val="1017"/>
+          <w:numId w:val="1018"/>
         </w:numPr>
         <w:pStyle w:val="Compact"/>
       </w:pPr>
@@ -2839,7 +3197,7 @@
       <w:pPr>
         <w:numPr>
           <w:ilvl w:val="0"/>
-          <w:numId w:val="1017"/>
+          <w:numId w:val="1018"/>
         </w:numPr>
         <w:pStyle w:val="Compact"/>
       </w:pPr>
@@ -2851,7 +3209,7 @@
       <w:pPr>
         <w:numPr>
           <w:ilvl w:val="0"/>
-          <w:numId w:val="1017"/>
+          <w:numId w:val="1018"/>
         </w:numPr>
         <w:pStyle w:val="Compact"/>
       </w:pPr>
@@ -2863,30 +3221,12 @@
       <w:pPr>
         <w:numPr>
           <w:ilvl w:val="0"/>
-          <w:numId w:val="1017"/>
-        </w:numPr>
-        <w:pStyle w:val="Compact"/>
-      </w:pPr>
-      <w:r>
-        <w:t xml:space="preserve">☐ Science page: the comparison shows in chapter 04, the</w:t>
-      </w:r>
-      <w:r>
-        <w:t xml:space="preserve"> </w:t>
-      </w:r>
-      <w:r>
-        <w:t xml:space="preserve">“</w:t>
-      </w:r>
-      <w:r>
-        <w:t xml:space="preserve">Comparison</w:t>
-      </w:r>
-      <w:r>
-        <w:t xml:space="preserve">”</w:t>
-      </w:r>
-      <w:r>
-        <w:t xml:space="preserve"> </w:t>
-      </w:r>
-      <w:r>
-        <w:t xml:space="preserve">chapter link jumps to it, and nothing else looks missing.</w:t>
+          <w:numId w:val="1018"/>
+        </w:numPr>
+        <w:pStyle w:val="Compact"/>
+      </w:pPr>
+      <w:r>
+        <w:t xml:space="preserve">☐ Science page: the new layout on phone and desktop, the Energy photo, the comparison in place, and the board videos playing.</w:t>
       </w:r>
     </w:p>
     <w:bookmarkEnd w:id="26"/>
@@ -2903,7 +3243,7 @@
       <w:pPr>
         <w:numPr>
           <w:ilvl w:val="0"/>
-          <w:numId w:val="1019"/>
+          <w:numId w:val="1020"/>
         </w:numPr>
         <w:pStyle w:val="Compact"/>
       </w:pPr>
@@ -2952,7 +3292,7 @@
       <w:pPr>
         <w:numPr>
           <w:ilvl w:val="0"/>
-          <w:numId w:val="1019"/>
+          <w:numId w:val="1020"/>
         </w:numPr>
         <w:pStyle w:val="Compact"/>
       </w:pPr>
@@ -2962,200 +3302,6 @@
           <w:b/>
         </w:rPr>
         <w:t xml:space="preserve">Offer wording:</w:t>
-      </w:r>
-    </w:p>
-    <w:p>
-      <w:pPr>
-        <w:numPr>
-          <w:ilvl w:val="1"/>
-          <w:numId w:val="1020"/>
-        </w:numPr>
-        <w:pStyle w:val="Compact"/>
-      </w:pPr>
-      <w:r>
-        <w:t xml:space="preserve">Top bar:</w:t>
-      </w:r>
-      <w:r>
-        <w:t xml:space="preserve"> </w:t>
-      </w:r>
-      <w:r>
-        <w:rPr>
-          <w:rStyle w:val="VerbatimChar"/>
-        </w:rPr>
-        <w:t xml:space="preserve">muto-bf-bar.liquid</w:t>
-      </w:r>
-      <w:r>
-        <w:t xml:space="preserve">.</w:t>
-      </w:r>
-    </w:p>
-    <w:p>
-      <w:pPr>
-        <w:numPr>
-          <w:ilvl w:val="1"/>
-          <w:numId w:val="1020"/>
-        </w:numPr>
-        <w:pStyle w:val="Compact"/>
-      </w:pPr>
-      <w:r>
-        <w:t xml:space="preserve">Black Friday line (</w:t>
-      </w:r>
-      <w:r>
-        <w:t xml:space="preserve">“</w:t>
-      </w:r>
-      <w:r>
-        <w:t xml:space="preserve">Ends 30 Nov</w:t>
-      </w:r>
-      <w:r>
-        <w:t xml:space="preserve">”</w:t>
-      </w:r>
-      <w:r>
-        <w:t xml:space="preserve">):</w:t>
-      </w:r>
-      <w:r>
-        <w:t xml:space="preserve"> </w:t>
-      </w:r>
-      <w:r>
-        <w:rPr>
-          <w:rStyle w:val="VerbatimChar"/>
-        </w:rPr>
-        <w:t xml:space="preserve">muto-bf-copy.css</w:t>
-      </w:r>
-      <w:r>
-        <w:t xml:space="preserve">.</w:t>
-      </w:r>
-    </w:p>
-    <w:p>
-      <w:pPr>
-        <w:numPr>
-          <w:ilvl w:val="1"/>
-          <w:numId w:val="1020"/>
-        </w:numPr>
-        <w:pStyle w:val="Compact"/>
-      </w:pPr>
-      <w:r>
-        <w:t xml:space="preserve">Sticky bar line (</w:t>
-      </w:r>
-      <w:r>
-        <w:t xml:space="preserve">“</w:t>
-      </w:r>
-      <w:r>
-        <w:t xml:space="preserve">53% off your first order</w:t>
-      </w:r>
-      <w:r>
-        <w:t xml:space="preserve">”</w:t>
-      </w:r>
-      <w:r>
-        <w:t xml:space="preserve">):</w:t>
-      </w:r>
-      <w:r>
-        <w:t xml:space="preserve"> </w:t>
-      </w:r>
-      <w:r>
-        <w:rPr>
-          <w:rStyle w:val="VerbatimChar"/>
-        </w:rPr>
-        <w:t xml:space="preserve">muto-bf-offer.liquid</w:t>
-      </w:r>
-      <w:r>
-        <w:t xml:space="preserve">.</w:t>
-      </w:r>
-    </w:p>
-    <w:p>
-      <w:pPr>
-        <w:numPr>
-          <w:ilvl w:val="0"/>
-          <w:numId w:val="1019"/>
-        </w:numPr>
-        <w:pStyle w:val="Compact"/>
-      </w:pPr>
-      <w:r>
-        <w:rPr>
-          <w:bCs/>
-          <w:b/>
-        </w:rPr>
-        <w:t xml:space="preserve">Copy swapped in by script</w:t>
-      </w:r>
-      <w:r>
-        <w:t xml:space="preserve"> </w:t>
-      </w:r>
-      <w:r>
-        <w:t xml:space="preserve">(statement line,</w:t>
-      </w:r>
-      <w:r>
-        <w:t xml:space="preserve"> </w:t>
-      </w:r>
-      <w:r>
-        <w:t xml:space="preserve">“</w:t>
-      </w:r>
-      <w:r>
-        <w:t xml:space="preserve">Who it’s for</w:t>
-      </w:r>
-      <w:r>
-        <w:t xml:space="preserve">”</w:t>
-      </w:r>
-      <w:r>
-        <w:t xml:space="preserve">,</w:t>
-      </w:r>
-      <w:r>
-        <w:t xml:space="preserve"> </w:t>
-      </w:r>
-      <w:r>
-        <w:t xml:space="preserve">“</w:t>
-      </w:r>
-      <w:r>
-        <w:t xml:space="preserve">Science-Backed Benefits</w:t>
-      </w:r>
-      <w:r>
-        <w:t xml:space="preserve">”</w:t>
-      </w:r>
-      <w:r>
-        <w:t xml:space="preserve">):</w:t>
-      </w:r>
-      <w:r>
-        <w:t xml:space="preserve"> </w:t>
-      </w:r>
-      <w:r>
-        <w:rPr>
-          <w:rStyle w:val="VerbatimChar"/>
-        </w:rPr>
-        <w:t xml:space="preserve">muto-bf-bar.liquid</w:t>
-      </w:r>
-      <w:r>
-        <w:t xml:space="preserve">. To make it permanent, edit the template’s settings in Customize.</w:t>
-      </w:r>
-    </w:p>
-    <w:p>
-      <w:pPr>
-        <w:numPr>
-          <w:ilvl w:val="0"/>
-          <w:numId w:val="1019"/>
-        </w:numPr>
-        <w:pStyle w:val="Compact"/>
-      </w:pPr>
-      <w:r>
-        <w:rPr>
-          <w:bCs/>
-          <w:b/>
-        </w:rPr>
-        <w:t xml:space="preserve">Comparison</w:t>
-      </w:r>
-      <w:r>
-        <w:t xml:space="preserve"> </w:t>
-      </w:r>
-      <w:r>
-        <w:t xml:space="preserve">rows, prices and footnote:</w:t>
-      </w:r>
-      <w:r>
-        <w:t xml:space="preserve"> </w:t>
-      </w:r>
-      <w:r>
-        <w:rPr>
-          <w:rStyle w:val="VerbatimChar"/>
-        </w:rPr>
-        <w:t xml:space="preserve">muto-bf-compare.liquid</w:t>
-      </w:r>
-      <w:r>
-        <w:t xml:space="preserve">.</w:t>
       </w:r>
     </w:p>
     <w:p>
@@ -3167,25 +3313,19 @@
         <w:pStyle w:val="Compact"/>
       </w:pPr>
       <w:r>
-        <w:t xml:space="preserve">The greens powder price</w:t>
-      </w:r>
-      <w:r>
-        <w:t xml:space="preserve"> </w:t>
-      </w:r>
-      <w:r>
-        <w:t xml:space="preserve">“</w:t>
-      </w:r>
-      <w:r>
-        <w:t xml:space="preserve">£40–80</w:t>
-      </w:r>
-      <w:r>
-        <w:t xml:space="preserve">”</w:t>
-      </w:r>
-      <w:r>
-        <w:t xml:space="preserve"> </w:t>
-      </w:r>
-      <w:r>
-        <w:t xml:space="preserve">is an estimate. Please confirm it.</w:t>
+        <w:t xml:space="preserve">Top bar:</w:t>
+      </w:r>
+      <w:r>
+        <w:t xml:space="preserve"> </w:t>
+      </w:r>
+      <w:r>
+        <w:rPr>
+          <w:rStyle w:val="VerbatimChar"/>
+        </w:rPr>
+        <w:t xml:space="preserve">muto-bf-bar.liquid</w:t>
+      </w:r>
+      <w:r>
+        <w:t xml:space="preserve">.</w:t>
       </w:r>
     </w:p>
     <w:p>
@@ -3197,6 +3337,206 @@
         <w:pStyle w:val="Compact"/>
       </w:pPr>
       <w:r>
+        <w:t xml:space="preserve">Black Friday line (</w:t>
+      </w:r>
+      <w:r>
+        <w:t xml:space="preserve">“</w:t>
+      </w:r>
+      <w:r>
+        <w:t xml:space="preserve">Ends 30 Nov</w:t>
+      </w:r>
+      <w:r>
+        <w:t xml:space="preserve">”</w:t>
+      </w:r>
+      <w:r>
+        <w:t xml:space="preserve">):</w:t>
+      </w:r>
+      <w:r>
+        <w:t xml:space="preserve"> </w:t>
+      </w:r>
+      <w:r>
+        <w:rPr>
+          <w:rStyle w:val="VerbatimChar"/>
+        </w:rPr>
+        <w:t xml:space="preserve">muto-bf-copy.css</w:t>
+      </w:r>
+      <w:r>
+        <w:t xml:space="preserve">.</w:t>
+      </w:r>
+    </w:p>
+    <w:p>
+      <w:pPr>
+        <w:numPr>
+          <w:ilvl w:val="1"/>
+          <w:numId w:val="1021"/>
+        </w:numPr>
+        <w:pStyle w:val="Compact"/>
+      </w:pPr>
+      <w:r>
+        <w:t xml:space="preserve">Sticky bar line (</w:t>
+      </w:r>
+      <w:r>
+        <w:t xml:space="preserve">“</w:t>
+      </w:r>
+      <w:r>
+        <w:t xml:space="preserve">53% off your first order</w:t>
+      </w:r>
+      <w:r>
+        <w:t xml:space="preserve">”</w:t>
+      </w:r>
+      <w:r>
+        <w:t xml:space="preserve">):</w:t>
+      </w:r>
+      <w:r>
+        <w:t xml:space="preserve"> </w:t>
+      </w:r>
+      <w:r>
+        <w:rPr>
+          <w:rStyle w:val="VerbatimChar"/>
+        </w:rPr>
+        <w:t xml:space="preserve">muto-bf-offer.liquid</w:t>
+      </w:r>
+      <w:r>
+        <w:t xml:space="preserve">.</w:t>
+      </w:r>
+    </w:p>
+    <w:p>
+      <w:pPr>
+        <w:numPr>
+          <w:ilvl w:val="0"/>
+          <w:numId w:val="1020"/>
+        </w:numPr>
+        <w:pStyle w:val="Compact"/>
+      </w:pPr>
+      <w:r>
+        <w:rPr>
+          <w:bCs/>
+          <w:b/>
+        </w:rPr>
+        <w:t xml:space="preserve">Copy swapped in by script</w:t>
+      </w:r>
+      <w:r>
+        <w:t xml:space="preserve"> </w:t>
+      </w:r>
+      <w:r>
+        <w:t xml:space="preserve">(statement line,</w:t>
+      </w:r>
+      <w:r>
+        <w:t xml:space="preserve"> </w:t>
+      </w:r>
+      <w:r>
+        <w:t xml:space="preserve">“</w:t>
+      </w:r>
+      <w:r>
+        <w:t xml:space="preserve">Who it’s for</w:t>
+      </w:r>
+      <w:r>
+        <w:t xml:space="preserve">”</w:t>
+      </w:r>
+      <w:r>
+        <w:t xml:space="preserve">,</w:t>
+      </w:r>
+      <w:r>
+        <w:t xml:space="preserve"> </w:t>
+      </w:r>
+      <w:r>
+        <w:t xml:space="preserve">“</w:t>
+      </w:r>
+      <w:r>
+        <w:t xml:space="preserve">Science-Backed Benefits</w:t>
+      </w:r>
+      <w:r>
+        <w:t xml:space="preserve">”</w:t>
+      </w:r>
+      <w:r>
+        <w:t xml:space="preserve">):</w:t>
+      </w:r>
+      <w:r>
+        <w:t xml:space="preserve"> </w:t>
+      </w:r>
+      <w:r>
+        <w:rPr>
+          <w:rStyle w:val="VerbatimChar"/>
+        </w:rPr>
+        <w:t xml:space="preserve">muto-bf-bar.liquid</w:t>
+      </w:r>
+      <w:r>
+        <w:t xml:space="preserve">. To make it permanent, edit the template’s settings in Customize.</w:t>
+      </w:r>
+    </w:p>
+    <w:p>
+      <w:pPr>
+        <w:numPr>
+          <w:ilvl w:val="0"/>
+          <w:numId w:val="1020"/>
+        </w:numPr>
+        <w:pStyle w:val="Compact"/>
+      </w:pPr>
+      <w:r>
+        <w:rPr>
+          <w:bCs/>
+          <w:b/>
+        </w:rPr>
+        <w:t xml:space="preserve">Comparison</w:t>
+      </w:r>
+      <w:r>
+        <w:t xml:space="preserve"> </w:t>
+      </w:r>
+      <w:r>
+        <w:t xml:space="preserve">rows, prices and footnote:</w:t>
+      </w:r>
+      <w:r>
+        <w:t xml:space="preserve"> </w:t>
+      </w:r>
+      <w:r>
+        <w:rPr>
+          <w:rStyle w:val="VerbatimChar"/>
+        </w:rPr>
+        <w:t xml:space="preserve">muto-bf-compare.liquid</w:t>
+      </w:r>
+      <w:r>
+        <w:t xml:space="preserve">.</w:t>
+      </w:r>
+    </w:p>
+    <w:p>
+      <w:pPr>
+        <w:numPr>
+          <w:ilvl w:val="1"/>
+          <w:numId w:val="1022"/>
+        </w:numPr>
+        <w:pStyle w:val="Compact"/>
+      </w:pPr>
+      <w:r>
+        <w:t xml:space="preserve">The greens powder price</w:t>
+      </w:r>
+      <w:r>
+        <w:t xml:space="preserve"> </w:t>
+      </w:r>
+      <w:r>
+        <w:t xml:space="preserve">“</w:t>
+      </w:r>
+      <w:r>
+        <w:t xml:space="preserve">£40–80</w:t>
+      </w:r>
+      <w:r>
+        <w:t xml:space="preserve">”</w:t>
+      </w:r>
+      <w:r>
+        <w:t xml:space="preserve"> </w:t>
+      </w:r>
+      <w:r>
+        <w:t xml:space="preserve">is an estimate. Please confirm it.</w:t>
+      </w:r>
+    </w:p>
+    <w:p>
+      <w:pPr>
+        <w:numPr>
+          <w:ilvl w:val="1"/>
+          <w:numId w:val="1022"/>
+        </w:numPr>
+        <w:pStyle w:val="Compact"/>
+      </w:pPr>
+      <w:r>
         <w:t xml:space="preserve">The three drawings are placeholders until real photos are uploaded to Content → Files. They should show no other brand’s logos, and you need the rights to use them.</w:t>
       </w:r>
     </w:p>
@@ -3204,7 +3544,7 @@
       <w:pPr>
         <w:numPr>
           <w:ilvl w:val="0"/>
-          <w:numId w:val="1019"/>
+          <w:numId w:val="1020"/>
         </w:numPr>
         <w:pStyle w:val="Compact"/>
       </w:pPr>
@@ -3269,7 +3609,7 @@
       <w:pPr>
         <w:numPr>
           <w:ilvl w:val="0"/>
-          <w:numId w:val="1022"/>
+          <w:numId w:val="1023"/>
         </w:numPr>
         <w:pStyle w:val="Compact"/>
       </w:pPr>
@@ -3299,7 +3639,7 @@
       <w:pPr>
         <w:numPr>
           <w:ilvl w:val="0"/>
-          <w:numId w:val="1022"/>
+          <w:numId w:val="1023"/>
         </w:numPr>
         <w:pStyle w:val="Compact"/>
       </w:pPr>
@@ -3353,7 +3693,7 @@
       <w:pPr>
         <w:numPr>
           <w:ilvl w:val="0"/>
-          <w:numId w:val="1022"/>
+          <w:numId w:val="1023"/>
         </w:numPr>
         <w:pStyle w:val="Compact"/>
       </w:pPr>
@@ -3377,7 +3717,7 @@
       <w:pPr>
         <w:numPr>
           <w:ilvl w:val="0"/>
-          <w:numId w:val="1022"/>
+          <w:numId w:val="1023"/>
         </w:numPr>
         <w:pStyle w:val="Compact"/>
       </w:pPr>
@@ -3717,12 +4057,6 @@
     <w:abstractNumId w:val="991"/>
   </w:num>
   <w:num w:numId="1013">
-    <w:abstractNumId w:val="991"/>
-  </w:num>
-  <w:num w:numId="1014">
-    <w:abstractNumId w:val="991"/>
-  </w:num>
-  <w:num w:numId="1015">
     <w:abstractNumId w:val="99411"/>
     <w:lvlOverride w:ilvl="0">
       <w:startOverride w:val="1"/>
@@ -3752,8 +4086,41 @@
       <w:startOverride w:val="1"/>
     </w:lvlOverride>
   </w:num>
+  <w:num w:numId="1014">
+    <w:abstractNumId w:val="991"/>
+  </w:num>
+  <w:num w:numId="1015">
+    <w:abstractNumId w:val="991"/>
+  </w:num>
   <w:num w:numId="1016">
-    <w:abstractNumId w:val="991"/>
+    <w:abstractNumId w:val="99411"/>
+    <w:lvlOverride w:ilvl="0">
+      <w:startOverride w:val="1"/>
+    </w:lvlOverride>
+    <w:lvlOverride w:ilvl="1">
+      <w:startOverride w:val="1"/>
+    </w:lvlOverride>
+    <w:lvlOverride w:ilvl="2">
+      <w:startOverride w:val="1"/>
+    </w:lvlOverride>
+    <w:lvlOverride w:ilvl="3">
+      <w:startOverride w:val="1"/>
+    </w:lvlOverride>
+    <w:lvlOverride w:ilvl="4">
+      <w:startOverride w:val="1"/>
+    </w:lvlOverride>
+    <w:lvlOverride w:ilvl="5">
+      <w:startOverride w:val="1"/>
+    </w:lvlOverride>
+    <w:lvlOverride w:ilvl="6">
+      <w:startOverride w:val="1"/>
+    </w:lvlOverride>
+    <w:lvlOverride w:ilvl="7">
+      <w:startOverride w:val="1"/>
+    </w:lvlOverride>
+    <w:lvlOverride w:ilvl="8">
+      <w:startOverride w:val="1"/>
+    </w:lvlOverride>
   </w:num>
   <w:num w:numId="1017">
     <w:abstractNumId w:val="991"/>
@@ -3771,6 +4138,9 @@
     <w:abstractNumId w:val="991"/>
   </w:num>
   <w:num w:numId="1022">
+    <w:abstractNumId w:val="991"/>
+  </w:num>
+  <w:num w:numId="1023">
     <w:abstractNumId w:val="991"/>
   </w:num>
 </w:numbering>

</xml_diff>

<commit_message>
Handoff: science page v2
Co-Authored-By: Claude Opus 5.5 <noreply@anthropic.com>
Claude-Session: https://claude.ai/code/session_01VYMABo11xv71mQ7912r49G
</commit_message>
<xml_diff>
--- a/handoff/MUTO_Dev_Handoff_BF_PDP_31Oct2026.docx
+++ b/handoff/MUTO_Dev_Handoff_BF_PDP_31Oct2026.docx
@@ -1403,7 +1403,7 @@
           <w:bCs/>
           <w:b/>
         </w:rPr>
-        <w:t xml:space="preserve">), redesigned and simpler</w:t>
+        <w:t xml:space="preserve">), redesigned: all white, science-led</w:t>
       </w:r>
     </w:p>
     <w:p>
@@ -1447,7 +1447,15 @@
         <w:t xml:space="preserve">”</w:t>
       </w:r>
       <w:r>
-        <w:t xml:space="preserve">). Top to bottom:</w:t>
+        <w:t xml:space="preserve">). It uses the same type system as the ingredients page: the site’s uppercase weight-500 heading, mono eyebrows, hairline rules, 21px item titles and doses in the teal mono. There are no dark or grey panels.</w:t>
+      </w:r>
+    </w:p>
+    <w:p>
+      <w:pPr>
+        <w:pStyle w:val="BodyText"/>
+      </w:pPr>
+      <w:r>
+        <w:t xml:space="preserve">The story is that what your body needs after 35 is different from what it needed at 20, and MUTO is formulated for that stage. Top to bottom:</w:t>
       </w:r>
     </w:p>
     <w:p>
@@ -1463,7 +1471,7 @@
           <w:bCs/>
           <w:b/>
         </w:rPr>
-        <w:t xml:space="preserve">Hero:</w:t>
+        <w:t xml:space="preserve">Intro:</w:t>
       </w:r>
       <w:r>
         <w:t xml:space="preserve"> </w:t>
@@ -1472,13 +1480,16 @@
         <w:t xml:space="preserve">“</w:t>
       </w:r>
       <w:r>
-        <w:t xml:space="preserve">What changes in your body after 35, and what to do about it.</w:t>
+        <w:t xml:space="preserve">Your body after 35 needs something different.</w:t>
       </w:r>
       <w:r>
         <w:t xml:space="preserve">”</w:t>
       </w:r>
       <w:r>
-        <w:t xml:space="preserve">, the Black Friday descriptor and a</w:t>
+        <w:t xml:space="preserve"> </w:t>
+      </w:r>
+      <w:r>
+        <w:t xml:space="preserve">with an</w:t>
       </w:r>
       <w:r>
         <w:t xml:space="preserve"> </w:t>
@@ -1487,6 +1498,24 @@
         <w:t xml:space="preserve">“</w:t>
       </w:r>
       <w:r>
+        <w:t xml:space="preserve">At 20 / After 35</w:t>
+      </w:r>
+      <w:r>
+        <w:t xml:space="preserve">”</w:t>
+      </w:r>
+      <w:r>
+        <w:t xml:space="preserve"> </w:t>
+      </w:r>
+      <w:r>
+        <w:t xml:space="preserve">table, a turquoise</w:t>
+      </w:r>
+      <w:r>
+        <w:t xml:space="preserve"> </w:t>
+      </w:r>
+      <w:r>
+        <w:t xml:space="preserve">“</w:t>
+      </w:r>
+      <w:r>
         <w:t xml:space="preserve">See the Black Friday offer</w:t>
       </w:r>
       <w:r>
@@ -1496,537 +1525,390 @@
         <w:t xml:space="preserve"> </w:t>
       </w:r>
       <w:r>
-        <w:t xml:space="preserve">button. Three grey cards on the right:</w:t>
-      </w:r>
-    </w:p>
-    <w:p>
-      <w:pPr>
-        <w:numPr>
-          <w:ilvl w:val="1"/>
+        <w:t xml:space="preserve">button and a link to the ingredients.</w:t>
+      </w:r>
+    </w:p>
+    <w:p>
+      <w:pPr>
+        <w:numPr>
+          <w:ilvl w:val="0"/>
+          <w:numId w:val="1013"/>
+        </w:numPr>
+        <w:pStyle w:val="Compact"/>
+      </w:pPr>
+      <w:r>
+        <w:rPr>
+          <w:bCs/>
+          <w:b/>
+        </w:rPr>
+        <w:t xml:space="preserve">Three shifts:</w:t>
+      </w:r>
+      <w:r>
+        <w:t xml:space="preserve"> </w:t>
+      </w:r>
+      <w:r>
+        <w:t xml:space="preserve">the NAD+ decline chart, marked at 35, then three numbered shifts: less NAD+, anabolic resistance, slower cell maintenance.</w:t>
+      </w:r>
+    </w:p>
+    <w:p>
+      <w:pPr>
+        <w:numPr>
+          <w:ilvl w:val="0"/>
+          <w:numId w:val="1013"/>
+        </w:numPr>
+        <w:pStyle w:val="Compact"/>
+      </w:pPr>
+      <w:r>
+        <w:rPr>
+          <w:bCs/>
+          <w:b/>
+        </w:rPr>
+        <w:t xml:space="preserve">Five jobs, one jar:</w:t>
+      </w:r>
+      <w:r>
+        <w:t xml:space="preserve"> </w:t>
+      </w:r>
+      <w:r>
+        <w:t xml:space="preserve">Energy, Recovery, Stress, Longevity and Immunity, each with its key doses in mono and the authorised claim.</w:t>
+      </w:r>
+    </w:p>
+    <w:p>
+      <w:pPr>
+        <w:numPr>
+          <w:ilvl w:val="0"/>
+          <w:numId w:val="1013"/>
+        </w:numPr>
+        <w:pStyle w:val="Compact"/>
+      </w:pPr>
+      <w:r>
+        <w:rPr>
+          <w:bCs/>
+          <w:b/>
+        </w:rPr>
+        <w:t xml:space="preserve">The numbers:</w:t>
+      </w:r>
+      <w:r>
+        <w:t xml:space="preserve"> </w:t>
+      </w:r>
+      <w:r>
+        <w:t xml:space="preserve">+51% NAD+ (footnoted as the NR study), 19 ingredients, 300mg NR, 0 proprietary blends.</w:t>
+      </w:r>
+    </w:p>
+    <w:p>
+      <w:pPr>
+        <w:numPr>
+          <w:ilvl w:val="0"/>
+          <w:numId w:val="1013"/>
+        </w:numPr>
+        <w:pStyle w:val="Compact"/>
+      </w:pPr>
+      <w:r>
+        <w:rPr>
+          <w:bCs/>
+          <w:b/>
+        </w:rPr>
+        <w:t xml:space="preserve">The same comparison</w:t>
+      </w:r>
+      <w:r>
+        <w:t xml:space="preserve"> </w:t>
+      </w:r>
+      <w:r>
+        <w:t xml:space="preserve">as the product page, on white with the site’s heading. It’s swapped into the empty</w:t>
+      </w:r>
+      <w:r>
+        <w:t xml:space="preserve"> </w:t>
+      </w:r>
+      <w:r>
+        <w:rPr>
+          <w:rStyle w:val="VerbatimChar"/>
+        </w:rPr>
+        <w:t xml:space="preserve">compare</w:t>
+      </w:r>
+      <w:r>
+        <w:t xml:space="preserve"> </w:t>
+      </w:r>
+      <w:r>
+        <w:t xml:space="preserve">slot by</w:t>
+      </w:r>
+      <w:r>
+        <w:t xml:space="preserve"> </w:t>
+      </w:r>
+      <w:r>
+        <w:rPr>
+          <w:rStyle w:val="VerbatimChar"/>
+        </w:rPr>
+        <w:t xml:space="preserve">muto-bf-head.liquid</w:t>
+      </w:r>
+      <w:r>
+        <w:t xml:space="preserve">.</w:t>
+      </w:r>
+    </w:p>
+    <w:p>
+      <w:pPr>
+        <w:numPr>
+          <w:ilvl w:val="0"/>
+          <w:numId w:val="1013"/>
+        </w:numPr>
+        <w:pStyle w:val="Compact"/>
+      </w:pPr>
+      <w:r>
+        <w:rPr>
+          <w:bCs/>
+          <w:b/>
+        </w:rPr>
+        <w:t xml:space="preserve">The scientific board:</w:t>
+      </w:r>
+      <w:r>
+        <w:t xml:space="preserve"> </w:t>
+      </w:r>
+      <w:r>
+        <w:t xml:space="preserve">the existing section, on white.</w:t>
+      </w:r>
+    </w:p>
+    <w:p>
+      <w:pPr>
+        <w:numPr>
+          <w:ilvl w:val="0"/>
+          <w:numId w:val="1013"/>
+        </w:numPr>
+        <w:pStyle w:val="Compact"/>
+      </w:pPr>
+      <w:r>
+        <w:rPr>
+          <w:bCs/>
+          <w:b/>
+        </w:rPr>
+        <w:t xml:space="preserve">Our research:</w:t>
+      </w:r>
+      <w:r>
+        <w:t xml:space="preserve"> </w:t>
+      </w:r>
+      <w:r>
+        <w:t xml:space="preserve">a statement and the four universities.</w:t>
+      </w:r>
+    </w:p>
+    <w:p>
+      <w:pPr>
+        <w:numPr>
+          <w:ilvl w:val="0"/>
+          <w:numId w:val="1013"/>
+        </w:numPr>
+        <w:pStyle w:val="Compact"/>
+      </w:pPr>
+      <w:r>
+        <w:rPr>
+          <w:bCs/>
+          <w:b/>
+        </w:rPr>
+        <w:t xml:space="preserve">Black Friday:</w:t>
+      </w:r>
+      <w:r>
+        <w:t xml:space="preserve"> </w:t>
+      </w:r>
+      <w:r>
+        <w:t xml:space="preserve">an outlined box with</w:t>
+      </w:r>
+      <w:r>
+        <w:t xml:space="preserve"> </w:t>
+      </w:r>
+      <w:r>
+        <w:t xml:space="preserve">“</w:t>
+      </w:r>
+      <w:r>
+        <w:t xml:space="preserve">3 months for £99</w:t>
+      </w:r>
+      <w:r>
+        <w:t xml:space="preserve">”</w:t>
+      </w:r>
+      <w:r>
+        <w:t xml:space="preserve">, a turquoise button.</w:t>
+      </w:r>
+    </w:p>
+    <w:p>
+      <w:pPr>
+        <w:numPr>
+          <w:ilvl w:val="0"/>
+          <w:numId w:val="1013"/>
+        </w:numPr>
+        <w:pStyle w:val="Compact"/>
+      </w:pPr>
+      <w:r>
+        <w:rPr>
+          <w:bCs/>
+          <w:b/>
+        </w:rPr>
+        <w:t xml:space="preserve">Reviews:</w:t>
+      </w:r>
+      <w:r>
+        <w:t xml:space="preserve"> </w:t>
+      </w:r>
+      <w:r>
+        <w:t xml:space="preserve">unchanged.</w:t>
+      </w:r>
+    </w:p>
+    <w:p>
+      <w:pPr>
+        <w:pStyle w:val="FirstParagraph"/>
+      </w:pPr>
+      <w:r>
+        <w:t xml:space="preserve">In GitHub at</w:t>
+      </w:r>
+      <w:r>
+        <w:t xml:space="preserve"> </w:t>
+      </w:r>
+      <w:r>
+        <w:rPr>
+          <w:rStyle w:val="VerbatimChar"/>
+        </w:rPr>
+        <w:t xml:space="preserve">shopify/science-v2/</w:t>
+      </w:r>
+      <w:r>
+        <w:t xml:space="preserve">. After Black Friday, change the intro button and the offer box in Customize.</w:t>
+      </w:r>
+    </w:p>
+    <w:p>
+      <w:pPr>
+        <w:pStyle w:val="BodyText"/>
+      </w:pPr>
+      <w:r>
+        <w:rPr>
+          <w:bCs/>
+          <w:b/>
+        </w:rPr>
+        <w:t xml:space="preserve">Home page (</w:t>
+      </w:r>
+      <w:r>
+        <w:rPr>
+          <w:rStyle w:val="VerbatimChar"/>
+          <w:bCs/>
+          <w:b/>
+        </w:rPr>
+        <w:t xml:space="preserve">templates/index.json</w:t>
+      </w:r>
+      <w:r>
+        <w:rPr>
+          <w:bCs/>
+          <w:b/>
+        </w:rPr>
+        <w:t xml:space="preserve">):</w:t>
+      </w:r>
+      <w:r>
+        <w:t xml:space="preserve"> </w:t>
+      </w:r>
+      <w:r>
+        <w:t xml:space="preserve">the</w:t>
+      </w:r>
+      <w:r>
+        <w:t xml:space="preserve"> </w:t>
+      </w:r>
+      <w:r>
+        <w:t xml:space="preserve">“</w:t>
+      </w:r>
+      <w:r>
+        <w:t xml:space="preserve">Still training. Still working. Not done yet.</w:t>
+      </w:r>
+      <w:r>
+        <w:t xml:space="preserve">”</w:t>
+      </w:r>
+      <w:r>
+        <w:t xml:space="preserve"> </w:t>
+      </w:r>
+      <w:r>
+        <w:t xml:space="preserve">athletes block is replaced, in the same place, by the product page’s</w:t>
+      </w:r>
+      <w:r>
+        <w:t xml:space="preserve"> </w:t>
+      </w:r>
+      <w:r>
+        <w:t xml:space="preserve">“</w:t>
+      </w:r>
+      <w:r>
+        <w:t xml:space="preserve">Don’t take our word for it.</w:t>
+      </w:r>
+      <w:r>
+        <w:t xml:space="preserve">”</w:t>
+      </w:r>
+      <w:r>
+        <w:t xml:space="preserve"> </w:t>
+      </w:r>
+      <w:r>
+        <w:t xml:space="preserve">customer results videos (all 8). Nothing else on the home page changed. The file is in the zip under</w:t>
+      </w:r>
+      <w:r>
+        <w:t xml:space="preserve"> </w:t>
+      </w:r>
+      <w:r>
+        <w:rPr>
+          <w:rStyle w:val="VerbatimChar"/>
+        </w:rPr>
+        <w:t xml:space="preserve">templates/</w:t>
+      </w:r>
+      <w:r>
+        <w:t xml:space="preserve"> </w:t>
+      </w:r>
+      <w:r>
+        <w:t xml:space="preserve">and in GitHub at</w:t>
+      </w:r>
+      <w:r>
+        <w:t xml:space="preserve"> </w:t>
+      </w:r>
+      <w:r>
+        <w:rPr>
+          <w:rStyle w:val="VerbatimChar"/>
+        </w:rPr>
+        <w:t xml:space="preserve">shopify/home-videos/theme/templates/index.json</w:t>
+      </w:r>
+      <w:r>
+        <w:t xml:space="preserve">. If the live home page has been edited since 31 October, re-make this change in Customize instead of copying the file.</w:t>
+      </w:r>
+    </w:p>
+    <w:p>
+      <w:pPr>
+        <w:pStyle w:val="BodyText"/>
+      </w:pPr>
+      <w:r>
+        <w:rPr>
+          <w:bCs/>
+          <w:b/>
+        </w:rPr>
+        <w:t xml:space="preserve">Site-wide (all pages, phones and tablets under 990px):</w:t>
+      </w:r>
+      <w:r>
+        <w:t xml:space="preserve"> </w:t>
+      </w:r>
+      <w:r>
+        <w:t xml:space="preserve">a shorter header bar.</w:t>
+      </w:r>
+    </w:p>
+    <w:p>
+      <w:pPr>
+        <w:numPr>
+          <w:ilvl w:val="0"/>
           <w:numId w:val="1014"/>
         </w:numPr>
         <w:pStyle w:val="Compact"/>
       </w:pPr>
       <w:r>
-        <w:rPr>
-          <w:bCs/>
-          <w:b/>
-        </w:rPr>
-        <w:t xml:space="preserve">NAD+ +51%:</w:t>
-      </w:r>
-      <w:r>
-        <w:t xml:space="preserve"> </w:t>
-      </w:r>
-      <w:r>
-        <w:t xml:space="preserve">the NR study, with a footnote saying it tested NR on its own, not MUTO.</w:t>
-      </w:r>
-    </w:p>
-    <w:p>
-      <w:pPr>
-        <w:numPr>
-          <w:ilvl w:val="1"/>
+        <w:t xml:space="preserve">About 44px instead of about 76px, with a smaller logo, caption and icons.</w:t>
+      </w:r>
+    </w:p>
+    <w:p>
+      <w:pPr>
+        <w:numPr>
+          <w:ilvl w:val="0"/>
           <w:numId w:val="1014"/>
         </w:numPr>
         <w:pStyle w:val="Compact"/>
       </w:pPr>
       <w:r>
-        <w:rPr>
-          <w:bCs/>
-          <w:b/>
-        </w:rPr>
-        <w:t xml:space="preserve">Energy:</w:t>
-      </w:r>
-      <w:r>
-        <w:t xml:space="preserve"> </w:t>
-      </w:r>
-      <w:r>
-        <w:t xml:space="preserve">a photo, with the authorised B6/B12 claim.</w:t>
-      </w:r>
-    </w:p>
-    <w:p>
-      <w:pPr>
-        <w:numPr>
-          <w:ilvl w:val="1"/>
+        <w:t xml:space="preserve">Pages that start under the see-through header move up by the new height.</w:t>
+      </w:r>
+    </w:p>
+    <w:p>
+      <w:pPr>
+        <w:numPr>
+          <w:ilvl w:val="0"/>
           <w:numId w:val="1014"/>
-        </w:numPr>
-        <w:pStyle w:val="Compact"/>
-      </w:pPr>
-      <w:r>
-        <w:rPr>
-          <w:bCs/>
-          <w:b/>
-        </w:rPr>
-        <w:t xml:space="preserve">Recovery:</w:t>
-      </w:r>
-      <w:r>
-        <w:t xml:space="preserve"> </w:t>
-      </w:r>
-      <w:r>
-        <w:t xml:space="preserve">2,000 IU, with the vitamin D claim.</w:t>
-      </w:r>
-    </w:p>
-    <w:p>
-      <w:pPr>
-        <w:numPr>
-          <w:ilvl w:val="0"/>
-          <w:numId w:val="1013"/>
-        </w:numPr>
-        <w:pStyle w:val="Compact"/>
-      </w:pPr>
-      <w:r>
-        <w:rPr>
-          <w:bCs/>
-          <w:b/>
-        </w:rPr>
-        <w:t xml:space="preserve">Why you feel it:</w:t>
-      </w:r>
-      <w:r>
-        <w:t xml:space="preserve"> </w:t>
-      </w:r>
-      <w:r>
-        <w:t xml:space="preserve">a photo and the NAD+ story.</w:t>
-      </w:r>
-    </w:p>
-    <w:p>
-      <w:pPr>
-        <w:numPr>
-          <w:ilvl w:val="0"/>
-          <w:numId w:val="1013"/>
-        </w:numPr>
-        <w:pStyle w:val="Compact"/>
-      </w:pPr>
-      <w:r>
-        <w:rPr>
-          <w:bCs/>
-          <w:b/>
-        </w:rPr>
-        <w:t xml:space="preserve">Founder quote:</w:t>
-      </w:r>
-      <w:r>
-        <w:t xml:space="preserve"> </w:t>
-      </w:r>
-      <w:r>
-        <w:t xml:space="preserve">Richie’s photo.</w:t>
-      </w:r>
-    </w:p>
-    <w:p>
-      <w:pPr>
-        <w:numPr>
-          <w:ilvl w:val="0"/>
-          <w:numId w:val="1013"/>
-        </w:numPr>
-        <w:pStyle w:val="Compact"/>
-      </w:pPr>
-      <w:r>
-        <w:rPr>
-          <w:bCs/>
-          <w:b/>
-        </w:rPr>
-        <w:t xml:space="preserve">The same</w:t>
-      </w:r>
-      <w:r>
-        <w:rPr>
-          <w:bCs/>
-          <w:b/>
-        </w:rPr>
-        <w:t xml:space="preserve"> </w:t>
-      </w:r>
-      <w:r>
-        <w:rPr>
-          <w:bCs/>
-          <w:b/>
-        </w:rPr>
-        <w:t xml:space="preserve">“</w:t>
-      </w:r>
-      <w:r>
-        <w:rPr>
-          <w:bCs/>
-          <w:b/>
-        </w:rPr>
-        <w:t xml:space="preserve">MUTO vs the usual</w:t>
-      </w:r>
-      <w:r>
-        <w:rPr>
-          <w:bCs/>
-          <w:b/>
-        </w:rPr>
-        <w:t xml:space="preserve">”</w:t>
-      </w:r>
-      <w:r>
-        <w:rPr>
-          <w:bCs/>
-          <w:b/>
-        </w:rPr>
-        <w:t xml:space="preserve"> </w:t>
-      </w:r>
-      <w:r>
-        <w:rPr>
-          <w:bCs/>
-          <w:b/>
-        </w:rPr>
-        <w:t xml:space="preserve">comparison</w:t>
-      </w:r>
-      <w:r>
-        <w:t xml:space="preserve"> </w:t>
-      </w:r>
-      <w:r>
-        <w:t xml:space="preserve">as the product page. It’s swapped into the empty</w:t>
-      </w:r>
-      <w:r>
-        <w:t xml:space="preserve"> </w:t>
-      </w:r>
-      <w:r>
-        <w:rPr>
-          <w:rStyle w:val="VerbatimChar"/>
-        </w:rPr>
-        <w:t xml:space="preserve">compare</w:t>
-      </w:r>
-      <w:r>
-        <w:t xml:space="preserve"> </w:t>
-      </w:r>
-      <w:r>
-        <w:t xml:space="preserve">slot by</w:t>
-      </w:r>
-      <w:r>
-        <w:t xml:space="preserve"> </w:t>
-      </w:r>
-      <w:r>
-        <w:rPr>
-          <w:rStyle w:val="VerbatimChar"/>
-        </w:rPr>
-        <w:t xml:space="preserve">muto-bf-head.liquid</w:t>
-      </w:r>
-      <w:r>
-        <w:t xml:space="preserve">.</w:t>
-      </w:r>
-    </w:p>
-    <w:p>
-      <w:pPr>
-        <w:numPr>
-          <w:ilvl w:val="0"/>
-          <w:numId w:val="1013"/>
-        </w:numPr>
-        <w:pStyle w:val="Compact"/>
-      </w:pPr>
-      <w:r>
-        <w:rPr>
-          <w:bCs/>
-          <w:b/>
-        </w:rPr>
-        <w:t xml:space="preserve">Standards:</w:t>
-      </w:r>
-      <w:r>
-        <w:t xml:space="preserve"> </w:t>
-      </w:r>
-      <w:r>
-        <w:t xml:space="preserve">a statement, then 19 ingredients, 300mg NR, 7 scientists and 4 UK universities.</w:t>
-      </w:r>
-    </w:p>
-    <w:p>
-      <w:pPr>
-        <w:numPr>
-          <w:ilvl w:val="0"/>
-          <w:numId w:val="1013"/>
-        </w:numPr>
-        <w:pStyle w:val="Compact"/>
-      </w:pPr>
-      <w:r>
-        <w:rPr>
-          <w:bCs/>
-          <w:b/>
-        </w:rPr>
-        <w:t xml:space="preserve">The scientific board:</w:t>
-      </w:r>
-      <w:r>
-        <w:t xml:space="preserve"> </w:t>
-      </w:r>
-      <w:r>
-        <w:t xml:space="preserve">the existing section, unchanged.</w:t>
-      </w:r>
-    </w:p>
-    <w:p>
-      <w:pPr>
-        <w:numPr>
-          <w:ilvl w:val="0"/>
-          <w:numId w:val="1013"/>
-        </w:numPr>
-        <w:pStyle w:val="Compact"/>
-      </w:pPr>
-      <w:r>
-        <w:rPr>
-          <w:bCs/>
-          <w:b/>
-        </w:rPr>
-        <w:t xml:space="preserve">Research:</w:t>
-      </w:r>
-      <w:r>
-        <w:t xml:space="preserve"> </w:t>
-      </w:r>
-      <w:r>
-        <w:t xml:space="preserve">“</w:t>
-      </w:r>
-      <w:r>
-        <w:t xml:space="preserve">Tested properly, published honestly</w:t>
-      </w:r>
-      <w:r>
-        <w:t xml:space="preserve">”</w:t>
-      </w:r>
-      <w:r>
-        <w:t xml:space="preserve">, with the</w:t>
-      </w:r>
-      <w:r>
-        <w:t xml:space="preserve"> </w:t>
-      </w:r>
-      <w:r>
-        <w:t xml:space="preserve">“</w:t>
-      </w:r>
-      <w:r>
-        <w:t xml:space="preserve">no results yet</w:t>
-      </w:r>
-      <w:r>
-        <w:t xml:space="preserve">”</w:t>
-      </w:r>
-      <w:r>
-        <w:t xml:space="preserve"> </w:t>
-      </w:r>
-      <w:r>
-        <w:t xml:space="preserve">wording.</w:t>
-      </w:r>
-    </w:p>
-    <w:p>
-      <w:pPr>
-        <w:numPr>
-          <w:ilvl w:val="0"/>
-          <w:numId w:val="1013"/>
-        </w:numPr>
-        <w:pStyle w:val="Compact"/>
-      </w:pPr>
-      <w:r>
-        <w:rPr>
-          <w:bCs/>
-          <w:b/>
-        </w:rPr>
-        <w:t xml:space="preserve">Black Friday band:</w:t>
-      </w:r>
-      <w:r>
-        <w:t xml:space="preserve"> </w:t>
-      </w:r>
-      <w:r>
-        <w:t xml:space="preserve">“</w:t>
-      </w:r>
-      <w:r>
-        <w:t xml:space="preserve">3 months for £99. Save 53%</w:t>
-      </w:r>
-      <w:r>
-        <w:t xml:space="preserve">”</w:t>
-      </w:r>
-      <w:r>
-        <w:t xml:space="preserve">, with a Claim offer button.</w:t>
-      </w:r>
-    </w:p>
-    <w:p>
-      <w:pPr>
-        <w:numPr>
-          <w:ilvl w:val="0"/>
-          <w:numId w:val="1013"/>
-        </w:numPr>
-        <w:pStyle w:val="Compact"/>
-      </w:pPr>
-      <w:r>
-        <w:rPr>
-          <w:bCs/>
-          <w:b/>
-        </w:rPr>
-        <w:t xml:space="preserve">Reviews:</w:t>
-      </w:r>
-      <w:r>
-        <w:t xml:space="preserve"> </w:t>
-      </w:r>
-      <w:r>
-        <w:t xml:space="preserve">the existing section, unchanged.</w:t>
-      </w:r>
-    </w:p>
-    <w:p>
-      <w:pPr>
-        <w:pStyle w:val="FirstParagraph"/>
-      </w:pPr>
-      <w:r>
-        <w:t xml:space="preserve">Removed: chapters 01–03, the 90-day timeline and the</w:t>
-      </w:r>
-      <w:r>
-        <w:t xml:space="preserve"> </w:t>
-      </w:r>
-      <w:r>
-        <w:t xml:space="preserve">“</w:t>
-      </w:r>
-      <w:r>
-        <w:t xml:space="preserve">Start your 90 days</w:t>
-      </w:r>
-      <w:r>
-        <w:t xml:space="preserve">”</w:t>
-      </w:r>
-      <w:r>
-        <w:t xml:space="preserve"> </w:t>
-      </w:r>
-      <w:r>
-        <w:t xml:space="preserve">box, which had the old £60 price. In GitHub at</w:t>
-      </w:r>
-      <w:r>
-        <w:t xml:space="preserve"> </w:t>
-      </w:r>
-      <w:r>
-        <w:rPr>
-          <w:rStyle w:val="VerbatimChar"/>
-        </w:rPr>
-        <w:t xml:space="preserve">shopify/science-v2/</w:t>
-      </w:r>
-      <w:r>
-        <w:t xml:space="preserve">. After Black Friday, change the hero button, the offer band and the comparison footnote in Customize.</w:t>
-      </w:r>
-    </w:p>
-    <w:p>
-      <w:pPr>
-        <w:pStyle w:val="BodyText"/>
-      </w:pPr>
-      <w:r>
-        <w:rPr>
-          <w:bCs/>
-          <w:b/>
-        </w:rPr>
-        <w:t xml:space="preserve">Home page (</w:t>
-      </w:r>
-      <w:r>
-        <w:rPr>
-          <w:rStyle w:val="VerbatimChar"/>
-          <w:bCs/>
-          <w:b/>
-        </w:rPr>
-        <w:t xml:space="preserve">templates/index.json</w:t>
-      </w:r>
-      <w:r>
-        <w:rPr>
-          <w:bCs/>
-          <w:b/>
-        </w:rPr>
-        <w:t xml:space="preserve">):</w:t>
-      </w:r>
-      <w:r>
-        <w:t xml:space="preserve"> </w:t>
-      </w:r>
-      <w:r>
-        <w:t xml:space="preserve">the</w:t>
-      </w:r>
-      <w:r>
-        <w:t xml:space="preserve"> </w:t>
-      </w:r>
-      <w:r>
-        <w:t xml:space="preserve">“</w:t>
-      </w:r>
-      <w:r>
-        <w:t xml:space="preserve">Still training. Still working. Not done yet.</w:t>
-      </w:r>
-      <w:r>
-        <w:t xml:space="preserve">”</w:t>
-      </w:r>
-      <w:r>
-        <w:t xml:space="preserve"> </w:t>
-      </w:r>
-      <w:r>
-        <w:t xml:space="preserve">athletes block is replaced, in the same place, by the product page’s</w:t>
-      </w:r>
-      <w:r>
-        <w:t xml:space="preserve"> </w:t>
-      </w:r>
-      <w:r>
-        <w:t xml:space="preserve">“</w:t>
-      </w:r>
-      <w:r>
-        <w:t xml:space="preserve">Don’t take our word for it.</w:t>
-      </w:r>
-      <w:r>
-        <w:t xml:space="preserve">”</w:t>
-      </w:r>
-      <w:r>
-        <w:t xml:space="preserve"> </w:t>
-      </w:r>
-      <w:r>
-        <w:t xml:space="preserve">customer results videos (all 8). Nothing else on the home page changed. The file is in the zip under</w:t>
-      </w:r>
-      <w:r>
-        <w:t xml:space="preserve"> </w:t>
-      </w:r>
-      <w:r>
-        <w:rPr>
-          <w:rStyle w:val="VerbatimChar"/>
-        </w:rPr>
-        <w:t xml:space="preserve">templates/</w:t>
-      </w:r>
-      <w:r>
-        <w:t xml:space="preserve"> </w:t>
-      </w:r>
-      <w:r>
-        <w:t xml:space="preserve">and in GitHub at</w:t>
-      </w:r>
-      <w:r>
-        <w:t xml:space="preserve"> </w:t>
-      </w:r>
-      <w:r>
-        <w:rPr>
-          <w:rStyle w:val="VerbatimChar"/>
-        </w:rPr>
-        <w:t xml:space="preserve">shopify/home-videos/theme/templates/index.json</w:t>
-      </w:r>
-      <w:r>
-        <w:t xml:space="preserve">. If the live home page has been edited since 31 October, re-make this change in Customize instead of copying the file.</w:t>
-      </w:r>
-    </w:p>
-    <w:p>
-      <w:pPr>
-        <w:pStyle w:val="BodyText"/>
-      </w:pPr>
-      <w:r>
-        <w:rPr>
-          <w:bCs/>
-          <w:b/>
-        </w:rPr>
-        <w:t xml:space="preserve">Site-wide (all pages, phones and tablets under 990px):</w:t>
-      </w:r>
-      <w:r>
-        <w:t xml:space="preserve"> </w:t>
-      </w:r>
-      <w:r>
-        <w:t xml:space="preserve">a shorter header bar.</w:t>
-      </w:r>
-    </w:p>
-    <w:p>
-      <w:pPr>
-        <w:numPr>
-          <w:ilvl w:val="0"/>
-          <w:numId w:val="1015"/>
-        </w:numPr>
-        <w:pStyle w:val="Compact"/>
-      </w:pPr>
-      <w:r>
-        <w:t xml:space="preserve">About 44px instead of about 76px, with a smaller logo, caption and icons.</w:t>
-      </w:r>
-    </w:p>
-    <w:p>
-      <w:pPr>
-        <w:numPr>
-          <w:ilvl w:val="0"/>
-          <w:numId w:val="1015"/>
-        </w:numPr>
-        <w:pStyle w:val="Compact"/>
-      </w:pPr>
-      <w:r>
-        <w:t xml:space="preserve">Pages that start under the see-through header move up by the new height.</w:t>
-      </w:r>
-    </w:p>
-    <w:p>
-      <w:pPr>
-        <w:numPr>
-          <w:ilvl w:val="0"/>
-          <w:numId w:val="1015"/>
         </w:numPr>
         <w:pStyle w:val="Compact"/>
       </w:pPr>
@@ -2812,208 +2694,208 @@
       <w:pPr>
         <w:numPr>
           <w:ilvl w:val="0"/>
+          <w:numId w:val="1015"/>
+        </w:numPr>
+        <w:pStyle w:val="Compact"/>
+      </w:pPr>
+      <w:r>
+        <w:t xml:space="preserve">In the live theme’s code editor, add the 18 files from the zip: everything in</w:t>
+      </w:r>
+      <w:r>
+        <w:t xml:space="preserve"> </w:t>
+      </w:r>
+      <w:r>
+        <w:rPr>
+          <w:rStyle w:val="VerbatimChar"/>
+        </w:rPr>
+        <w:t xml:space="preserve">assets/</w:t>
+      </w:r>
+      <w:r>
+        <w:t xml:space="preserve">,</w:t>
+      </w:r>
+      <w:r>
+        <w:t xml:space="preserve"> </w:t>
+      </w:r>
+      <w:r>
+        <w:rPr>
+          <w:rStyle w:val="VerbatimChar"/>
+        </w:rPr>
+        <w:t xml:space="preserve">snippets/</w:t>
+      </w:r>
+      <w:r>
+        <w:t xml:space="preserve">, and</w:t>
+      </w:r>
+      <w:r>
+        <w:t xml:space="preserve"> </w:t>
+      </w:r>
+      <w:r>
+        <w:rPr>
+          <w:rStyle w:val="VerbatimChar"/>
+        </w:rPr>
+        <w:t xml:space="preserve">sections/muto-bf-head.liquid</w:t>
+      </w:r>
+      <w:r>
+        <w:t xml:space="preserve"> </w:t>
+      </w:r>
+      <w:r>
+        <w:t xml:space="preserve">and</w:t>
+      </w:r>
+      <w:r>
+        <w:t xml:space="preserve"> </w:t>
+      </w:r>
+      <w:r>
+        <w:rPr>
+          <w:rStyle w:val="VerbatimChar"/>
+        </w:rPr>
+        <w:t xml:space="preserve">sections/muto-bf-offer.liquid</w:t>
+      </w:r>
+      <w:r>
+        <w:t xml:space="preserve">. Don’t add the two</w:t>
+      </w:r>
+      <w:r>
+        <w:t xml:space="preserve"> </w:t>
+      </w:r>
+      <w:r>
+        <w:rPr>
+          <w:rStyle w:val="VerbatimChar"/>
+        </w:rPr>
+        <w:t xml:space="preserve">-group.json</w:t>
+      </w:r>
+      <w:r>
+        <w:t xml:space="preserve"> </w:t>
+      </w:r>
+      <w:r>
+        <w:t xml:space="preserve">files.</w:t>
+      </w:r>
+    </w:p>
+    <w:p>
+      <w:pPr>
+        <w:numPr>
+          <w:ilvl w:val="0"/>
+          <w:numId w:val="1015"/>
+        </w:numPr>
+        <w:pStyle w:val="Compact"/>
+      </w:pPr>
+      <w:r>
+        <w:t xml:space="preserve">In Customize on live:</w:t>
+      </w:r>
+    </w:p>
+    <w:p>
+      <w:pPr>
+        <w:numPr>
+          <w:ilvl w:val="1"/>
           <w:numId w:val="1016"/>
         </w:numPr>
         <w:pStyle w:val="Compact"/>
       </w:pPr>
       <w:r>
-        <w:t xml:space="preserve">In the live theme’s code editor, add the 18 files from the zip: everything in</w:t>
-      </w:r>
-      <w:r>
-        <w:t xml:space="preserve"> </w:t>
+        <w:t xml:space="preserve">Open a BF product, e.g. </w:t>
       </w:r>
       <w:r>
         <w:rPr>
           <w:rStyle w:val="VerbatimChar"/>
         </w:rPr>
-        <w:t xml:space="preserve">assets/</w:t>
-      </w:r>
-      <w:r>
-        <w:t xml:space="preserve">,</w:t>
-      </w:r>
-      <w:r>
-        <w:t xml:space="preserve"> </w:t>
-      </w:r>
-      <w:r>
-        <w:rPr>
-          <w:rStyle w:val="VerbatimChar"/>
-        </w:rPr>
-        <w:t xml:space="preserve">snippets/</w:t>
-      </w:r>
-      <w:r>
-        <w:t xml:space="preserve">, and</w:t>
-      </w:r>
-      <w:r>
-        <w:t xml:space="preserve"> </w:t>
-      </w:r>
-      <w:r>
-        <w:rPr>
-          <w:rStyle w:val="VerbatimChar"/>
-        </w:rPr>
-        <w:t xml:space="preserve">sections/muto-bf-head.liquid</w:t>
-      </w:r>
-      <w:r>
-        <w:t xml:space="preserve"> </w:t>
-      </w:r>
-      <w:r>
-        <w:t xml:space="preserve">and</w:t>
-      </w:r>
-      <w:r>
-        <w:t xml:space="preserve"> </w:t>
-      </w:r>
-      <w:r>
-        <w:rPr>
-          <w:rStyle w:val="VerbatimChar"/>
-        </w:rPr>
-        <w:t xml:space="preserve">sections/muto-bf-offer.liquid</w:t>
-      </w:r>
-      <w:r>
-        <w:t xml:space="preserve">. Don’t add the two</w:t>
-      </w:r>
-      <w:r>
-        <w:t xml:space="preserve"> </w:t>
-      </w:r>
-      <w:r>
-        <w:rPr>
-          <w:rStyle w:val="VerbatimChar"/>
-        </w:rPr>
-        <w:t xml:space="preserve">-group.json</w:t>
-      </w:r>
-      <w:r>
-        <w:t xml:space="preserve"> </w:t>
-      </w:r>
-      <w:r>
-        <w:t xml:space="preserve">files.</w:t>
-      </w:r>
-    </w:p>
-    <w:p>
-      <w:pPr>
-        <w:numPr>
-          <w:ilvl w:val="0"/>
+        <w:t xml:space="preserve">muto-nad-cellular-complex</w:t>
+      </w:r>
+      <w:r>
+        <w:t xml:space="preserve">.</w:t>
+      </w:r>
+    </w:p>
+    <w:p>
+      <w:pPr>
+        <w:numPr>
+          <w:ilvl w:val="1"/>
           <w:numId w:val="1016"/>
         </w:numPr>
         <w:pStyle w:val="Compact"/>
       </w:pPr>
       <w:r>
-        <w:t xml:space="preserve">In Customize on live:</w:t>
+        <w:rPr>
+          <w:bCs/>
+          <w:b/>
+        </w:rPr>
+        <w:t xml:space="preserve">Header:</w:t>
+      </w:r>
+      <w:r>
+        <w:t xml:space="preserve"> </w:t>
+      </w:r>
+      <w:r>
+        <w:t xml:space="preserve">Add section →</w:t>
+      </w:r>
+      <w:r>
+        <w:t xml:space="preserve"> </w:t>
+      </w:r>
+      <w:r>
+        <w:t xml:space="preserve">“</w:t>
+      </w:r>
+      <w:r>
+        <w:t xml:space="preserve">MUTO — Black Friday head</w:t>
+      </w:r>
+      <w:r>
+        <w:t xml:space="preserve">”</w:t>
+      </w:r>
+      <w:r>
+        <w:t xml:space="preserve">, and drag it to the</w:t>
+      </w:r>
+      <w:r>
+        <w:t xml:space="preserve"> </w:t>
+      </w:r>
+      <w:r>
+        <w:rPr>
+          <w:bCs/>
+          <w:b/>
+        </w:rPr>
+        <w:t xml:space="preserve">top</w:t>
+      </w:r>
+      <w:r>
+        <w:t xml:space="preserve"> </w:t>
+      </w:r>
+      <w:r>
+        <w:t xml:space="preserve">of the header group, above the announcement bars and the header.</w:t>
       </w:r>
     </w:p>
     <w:p>
       <w:pPr>
         <w:numPr>
           <w:ilvl w:val="1"/>
-          <w:numId w:val="1017"/>
-        </w:numPr>
-        <w:pStyle w:val="Compact"/>
-      </w:pPr>
-      <w:r>
-        <w:t xml:space="preserve">Open a BF product, e.g. </w:t>
-      </w:r>
-      <w:r>
-        <w:rPr>
-          <w:rStyle w:val="VerbatimChar"/>
-        </w:rPr>
-        <w:t xml:space="preserve">muto-nad-cellular-complex</w:t>
-      </w:r>
-      <w:r>
-        <w:t xml:space="preserve">.</w:t>
+          <w:numId w:val="1016"/>
+        </w:numPr>
+        <w:pStyle w:val="Compact"/>
+      </w:pPr>
+      <w:r>
+        <w:rPr>
+          <w:bCs/>
+          <w:b/>
+        </w:rPr>
+        <w:t xml:space="preserve">Footer:</w:t>
+      </w:r>
+      <w:r>
+        <w:t xml:space="preserve"> </w:t>
+      </w:r>
+      <w:r>
+        <w:t xml:space="preserve">Add section →</w:t>
+      </w:r>
+      <w:r>
+        <w:t xml:space="preserve"> </w:t>
+      </w:r>
+      <w:r>
+        <w:t xml:space="preserve">“</w:t>
+      </w:r>
+      <w:r>
+        <w:t xml:space="preserve">MUTO — Black Friday offer</w:t>
+      </w:r>
+      <w:r>
+        <w:t xml:space="preserve">”</w:t>
+      </w:r>
+      <w:r>
+        <w:t xml:space="preserve">, below the footer.</w:t>
       </w:r>
     </w:p>
     <w:p>
       <w:pPr>
         <w:numPr>
           <w:ilvl w:val="1"/>
-          <w:numId w:val="1017"/>
-        </w:numPr>
-        <w:pStyle w:val="Compact"/>
-      </w:pPr>
-      <w:r>
-        <w:rPr>
-          <w:bCs/>
-          <w:b/>
-        </w:rPr>
-        <w:t xml:space="preserve">Header:</w:t>
-      </w:r>
-      <w:r>
-        <w:t xml:space="preserve"> </w:t>
-      </w:r>
-      <w:r>
-        <w:t xml:space="preserve">Add section →</w:t>
-      </w:r>
-      <w:r>
-        <w:t xml:space="preserve"> </w:t>
-      </w:r>
-      <w:r>
-        <w:t xml:space="preserve">“</w:t>
-      </w:r>
-      <w:r>
-        <w:t xml:space="preserve">MUTO — Black Friday head</w:t>
-      </w:r>
-      <w:r>
-        <w:t xml:space="preserve">”</w:t>
-      </w:r>
-      <w:r>
-        <w:t xml:space="preserve">, and drag it to the</w:t>
-      </w:r>
-      <w:r>
-        <w:t xml:space="preserve"> </w:t>
-      </w:r>
-      <w:r>
-        <w:rPr>
-          <w:bCs/>
-          <w:b/>
-        </w:rPr>
-        <w:t xml:space="preserve">top</w:t>
-      </w:r>
-      <w:r>
-        <w:t xml:space="preserve"> </w:t>
-      </w:r>
-      <w:r>
-        <w:t xml:space="preserve">of the header group, above the announcement bars and the header.</w:t>
-      </w:r>
-    </w:p>
-    <w:p>
-      <w:pPr>
-        <w:numPr>
-          <w:ilvl w:val="1"/>
-          <w:numId w:val="1017"/>
-        </w:numPr>
-        <w:pStyle w:val="Compact"/>
-      </w:pPr>
-      <w:r>
-        <w:rPr>
-          <w:bCs/>
-          <w:b/>
-        </w:rPr>
-        <w:t xml:space="preserve">Footer:</w:t>
-      </w:r>
-      <w:r>
-        <w:t xml:space="preserve"> </w:t>
-      </w:r>
-      <w:r>
-        <w:t xml:space="preserve">Add section →</w:t>
-      </w:r>
-      <w:r>
-        <w:t xml:space="preserve"> </w:t>
-      </w:r>
-      <w:r>
-        <w:t xml:space="preserve">“</w:t>
-      </w:r>
-      <w:r>
-        <w:t xml:space="preserve">MUTO — Black Friday offer</w:t>
-      </w:r>
-      <w:r>
-        <w:t xml:space="preserve">”</w:t>
-      </w:r>
-      <w:r>
-        <w:t xml:space="preserve">, below the footer.</w:t>
-      </w:r>
-    </w:p>
-    <w:p>
-      <w:pPr>
-        <w:numPr>
-          <w:ilvl w:val="1"/>
-          <w:numId w:val="1017"/>
+          <w:numId w:val="1016"/>
         </w:numPr>
         <w:pStyle w:val="Compact"/>
       </w:pPr>
@@ -3035,11 +2917,148 @@
       <w:pPr>
         <w:numPr>
           <w:ilvl w:val="0"/>
+          <w:numId w:val="1017"/>
+        </w:numPr>
+        <w:pStyle w:val="Compact"/>
+      </w:pPr>
+      <w:r>
+        <w:t xml:space="preserve">☐</w:t>
+      </w:r>
+      <w:r>
+        <w:t xml:space="preserve"> </w:t>
+      </w:r>
+      <w:r>
+        <w:rPr>
+          <w:bCs/>
+          <w:b/>
+        </w:rPr>
+        <w:t xml:space="preserve">Claim</w:t>
+      </w:r>
+      <w:r>
+        <w:t xml:space="preserve">: tap it. The 3-month plan is added and checkout opens.</w:t>
+      </w:r>
+    </w:p>
+    <w:p>
+      <w:pPr>
+        <w:numPr>
+          <w:ilvl w:val="1"/>
           <w:numId w:val="1018"/>
         </w:numPr>
         <w:pStyle w:val="Compact"/>
       </w:pPr>
       <w:r>
+        <w:t xml:space="preserve">Check the first box is</w:t>
+      </w:r>
+      <w:r>
+        <w:t xml:space="preserve"> </w:t>
+      </w:r>
+      <w:r>
+        <w:rPr>
+          <w:bCs/>
+          <w:b/>
+        </w:rPr>
+        <w:t xml:space="preserve">£99</w:t>
+      </w:r>
+      <w:r>
+        <w:t xml:space="preserve"> </w:t>
+      </w:r>
+      <w:r>
+        <w:t xml:space="preserve">(Skio’s intro price) and the welcome kit gifts are there.</w:t>
+      </w:r>
+    </w:p>
+    <w:p>
+      <w:pPr>
+        <w:numPr>
+          <w:ilvl w:val="1"/>
+          <w:numId w:val="1018"/>
+        </w:numPr>
+        <w:pStyle w:val="Compact"/>
+      </w:pPr>
+      <w:r>
+        <w:t xml:space="preserve">Claim skips the cart drawer. If any gift is added by something in the drawer, it won’t be added this way.</w:t>
+      </w:r>
+    </w:p>
+    <w:p>
+      <w:pPr>
+        <w:numPr>
+          <w:ilvl w:val="0"/>
+          <w:numId w:val="1017"/>
+        </w:numPr>
+        <w:pStyle w:val="Compact"/>
+      </w:pPr>
+      <w:r>
+        <w:t xml:space="preserve">☐ Place test orders through the main button, the sticky bar (both plans) and the one-time purchase. Check the right variant and plan in each.</w:t>
+      </w:r>
+    </w:p>
+    <w:p>
+      <w:pPr>
+        <w:numPr>
+          <w:ilvl w:val="0"/>
+          <w:numId w:val="1017"/>
+        </w:numPr>
+        <w:pStyle w:val="Compact"/>
+      </w:pPr>
+      <w:r>
+        <w:t xml:space="preserve">☐ Do the same on the -2 product.</w:t>
+      </w:r>
+    </w:p>
+    <w:p>
+      <w:pPr>
+        <w:numPr>
+          <w:ilvl w:val="0"/>
+          <w:numId w:val="1017"/>
+        </w:numPr>
+        <w:pStyle w:val="Compact"/>
+      </w:pPr>
+      <w:r>
+        <w:t xml:space="preserve">☐ Load the page and check the old design doesn’t flash: old text, prices, the BF box or thumbnails.</w:t>
+      </w:r>
+    </w:p>
+    <w:p>
+      <w:pPr>
+        <w:numPr>
+          <w:ilvl w:val="0"/>
+          <w:numId w:val="1017"/>
+        </w:numPr>
+        <w:pStyle w:val="Compact"/>
+      </w:pPr>
+      <w:r>
+        <w:t xml:space="preserve">☐ Gallery arrows and swipe on a phone. The image sits right under the header with no gap or overlap; the 46px space is an estimate.</w:t>
+      </w:r>
+    </w:p>
+    <w:p>
+      <w:pPr>
+        <w:numPr>
+          <w:ilvl w:val="0"/>
+          <w:numId w:val="1017"/>
+        </w:numPr>
+        <w:pStyle w:val="Compact"/>
+      </w:pPr>
+      <w:r>
+        <w:t xml:space="preserve">☐ Sticky bar: hides while the main button is on screen, and the picker and plan cards stay in step.</w:t>
+      </w:r>
+    </w:p>
+    <w:p>
+      <w:pPr>
+        <w:numPr>
+          <w:ilvl w:val="0"/>
+          <w:numId w:val="1017"/>
+        </w:numPr>
+        <w:pStyle w:val="Compact"/>
+      </w:pPr>
+      <w:r>
+        <w:t xml:space="preserve">☐ The comparison appears in place of the old table and scrolls sideways on phones.</w:t>
+      </w:r>
+    </w:p>
+    <w:p>
+      <w:pPr>
+        <w:numPr>
+          <w:ilvl w:val="0"/>
+          <w:numId w:val="1017"/>
+        </w:numPr>
+        <w:pStyle w:val="Compact"/>
+      </w:pPr>
+      <w:r>
         <w:t xml:space="preserve">☐</w:t>
       </w:r>
       <w:r>
@@ -3050,143 +3069,6 @@
           <w:bCs/>
           <w:b/>
         </w:rPr>
-        <w:t xml:space="preserve">Claim</w:t>
-      </w:r>
-      <w:r>
-        <w:t xml:space="preserve">: tap it. The 3-month plan is added and checkout opens.</w:t>
-      </w:r>
-    </w:p>
-    <w:p>
-      <w:pPr>
-        <w:numPr>
-          <w:ilvl w:val="1"/>
-          <w:numId w:val="1019"/>
-        </w:numPr>
-        <w:pStyle w:val="Compact"/>
-      </w:pPr>
-      <w:r>
-        <w:t xml:space="preserve">Check the first box is</w:t>
-      </w:r>
-      <w:r>
-        <w:t xml:space="preserve"> </w:t>
-      </w:r>
-      <w:r>
-        <w:rPr>
-          <w:bCs/>
-          <w:b/>
-        </w:rPr>
-        <w:t xml:space="preserve">£99</w:t>
-      </w:r>
-      <w:r>
-        <w:t xml:space="preserve"> </w:t>
-      </w:r>
-      <w:r>
-        <w:t xml:space="preserve">(Skio’s intro price) and the welcome kit gifts are there.</w:t>
-      </w:r>
-    </w:p>
-    <w:p>
-      <w:pPr>
-        <w:numPr>
-          <w:ilvl w:val="1"/>
-          <w:numId w:val="1019"/>
-        </w:numPr>
-        <w:pStyle w:val="Compact"/>
-      </w:pPr>
-      <w:r>
-        <w:t xml:space="preserve">Claim skips the cart drawer. If any gift is added by something in the drawer, it won’t be added this way.</w:t>
-      </w:r>
-    </w:p>
-    <w:p>
-      <w:pPr>
-        <w:numPr>
-          <w:ilvl w:val="0"/>
-          <w:numId w:val="1018"/>
-        </w:numPr>
-        <w:pStyle w:val="Compact"/>
-      </w:pPr>
-      <w:r>
-        <w:t xml:space="preserve">☐ Place test orders through the main button, the sticky bar (both plans) and the one-time purchase. Check the right variant and plan in each.</w:t>
-      </w:r>
-    </w:p>
-    <w:p>
-      <w:pPr>
-        <w:numPr>
-          <w:ilvl w:val="0"/>
-          <w:numId w:val="1018"/>
-        </w:numPr>
-        <w:pStyle w:val="Compact"/>
-      </w:pPr>
-      <w:r>
-        <w:t xml:space="preserve">☐ Do the same on the -2 product.</w:t>
-      </w:r>
-    </w:p>
-    <w:p>
-      <w:pPr>
-        <w:numPr>
-          <w:ilvl w:val="0"/>
-          <w:numId w:val="1018"/>
-        </w:numPr>
-        <w:pStyle w:val="Compact"/>
-      </w:pPr>
-      <w:r>
-        <w:t xml:space="preserve">☐ Load the page and check the old design doesn’t flash: old text, prices, the BF box or thumbnails.</w:t>
-      </w:r>
-    </w:p>
-    <w:p>
-      <w:pPr>
-        <w:numPr>
-          <w:ilvl w:val="0"/>
-          <w:numId w:val="1018"/>
-        </w:numPr>
-        <w:pStyle w:val="Compact"/>
-      </w:pPr>
-      <w:r>
-        <w:t xml:space="preserve">☐ Gallery arrows and swipe on a phone. The image sits right under the header with no gap or overlap; the 46px space is an estimate.</w:t>
-      </w:r>
-    </w:p>
-    <w:p>
-      <w:pPr>
-        <w:numPr>
-          <w:ilvl w:val="0"/>
-          <w:numId w:val="1018"/>
-        </w:numPr>
-        <w:pStyle w:val="Compact"/>
-      </w:pPr>
-      <w:r>
-        <w:t xml:space="preserve">☐ Sticky bar: hides while the main button is on screen, and the picker and plan cards stay in step.</w:t>
-      </w:r>
-    </w:p>
-    <w:p>
-      <w:pPr>
-        <w:numPr>
-          <w:ilvl w:val="0"/>
-          <w:numId w:val="1018"/>
-        </w:numPr>
-        <w:pStyle w:val="Compact"/>
-      </w:pPr>
-      <w:r>
-        <w:t xml:space="preserve">☐ The comparison appears in place of the old table and scrolls sideways on phones.</w:t>
-      </w:r>
-    </w:p>
-    <w:p>
-      <w:pPr>
-        <w:numPr>
-          <w:ilvl w:val="0"/>
-          <w:numId w:val="1018"/>
-        </w:numPr>
-        <w:pStyle w:val="Compact"/>
-      </w:pPr>
-      <w:r>
-        <w:t xml:space="preserve">☐</w:t>
-      </w:r>
-      <w:r>
-        <w:t xml:space="preserve"> </w:t>
-      </w:r>
-      <w:r>
-        <w:rPr>
-          <w:bCs/>
-          <w:b/>
-        </w:rPr>
         <w:t xml:space="preserve">Site-wide compact header</w:t>
       </w:r>
       <w:r>
@@ -3197,7 +3079,7 @@
       <w:pPr>
         <w:numPr>
           <w:ilvl w:val="0"/>
-          <w:numId w:val="1018"/>
+          <w:numId w:val="1017"/>
         </w:numPr>
         <w:pStyle w:val="Compact"/>
       </w:pPr>
@@ -3209,7 +3091,7 @@
       <w:pPr>
         <w:numPr>
           <w:ilvl w:val="0"/>
-          <w:numId w:val="1018"/>
+          <w:numId w:val="1017"/>
         </w:numPr>
         <w:pStyle w:val="Compact"/>
       </w:pPr>
@@ -3221,12 +3103,12 @@
       <w:pPr>
         <w:numPr>
           <w:ilvl w:val="0"/>
-          <w:numId w:val="1018"/>
-        </w:numPr>
-        <w:pStyle w:val="Compact"/>
-      </w:pPr>
-      <w:r>
-        <w:t xml:space="preserve">☐ Science page: the new layout on phone and desktop, the Energy photo, the comparison in place, and the board videos playing.</w:t>
+          <w:numId w:val="1017"/>
+        </w:numPr>
+        <w:pStyle w:val="Compact"/>
+      </w:pPr>
+      <w:r>
+        <w:t xml:space="preserve">☐ Science page: the new layout on phone and desktop, the comparison in place, and the board videos playing.</w:t>
       </w:r>
     </w:p>
     <w:bookmarkEnd w:id="26"/>
@@ -3243,22 +3125,77 @@
       <w:pPr>
         <w:numPr>
           <w:ilvl w:val="0"/>
+          <w:numId w:val="1019"/>
+        </w:numPr>
+        <w:pStyle w:val="Compact"/>
+      </w:pPr>
+      <w:r>
+        <w:rPr>
+          <w:bCs/>
+          <w:b/>
+        </w:rPr>
+        <w:t xml:space="preserve">Prices</w:t>
+      </w:r>
+      <w:r>
+        <w:t xml:space="preserve"> </w:t>
+      </w:r>
+      <w:r>
+        <w:t xml:space="preserve">in</w:t>
+      </w:r>
+      <w:r>
+        <w:t xml:space="preserve"> </w:t>
+      </w:r>
+      <w:r>
+        <w:rPr>
+          <w:rStyle w:val="VerbatimChar"/>
+        </w:rPr>
+        <w:t xml:space="preserve">muto-bf-copy.css</w:t>
+      </w:r>
+      <w:r>
+        <w:t xml:space="preserve">: £99 / £210 (3-month), £49.99 / £70 (1-month),</w:t>
+      </w:r>
+      <w:r>
+        <w:t xml:space="preserve"> </w:t>
+      </w:r>
+      <w:r>
+        <w:t xml:space="preserve">“</w:t>
+      </w:r>
+      <w:r>
+        <w:t xml:space="preserve">One-Time Purchase - £70</w:t>
+      </w:r>
+      <w:r>
+        <w:t xml:space="preserve">”</w:t>
+      </w:r>
+      <w:r>
+        <w:t xml:space="preserve">. The page’s own CSS also draws the daily pills (£1.10 and £1.79 a day).</w:t>
+      </w:r>
+    </w:p>
+    <w:p>
+      <w:pPr>
+        <w:numPr>
+          <w:ilvl w:val="0"/>
+          <w:numId w:val="1019"/>
+        </w:numPr>
+        <w:pStyle w:val="Compact"/>
+      </w:pPr>
+      <w:r>
+        <w:rPr>
+          <w:bCs/>
+          <w:b/>
+        </w:rPr>
+        <w:t xml:space="preserve">Offer wording:</w:t>
+      </w:r>
+    </w:p>
+    <w:p>
+      <w:pPr>
+        <w:numPr>
+          <w:ilvl w:val="1"/>
           <w:numId w:val="1020"/>
         </w:numPr>
         <w:pStyle w:val="Compact"/>
       </w:pPr>
       <w:r>
-        <w:rPr>
-          <w:bCs/>
-          <w:b/>
-        </w:rPr>
-        <w:t xml:space="preserve">Prices</w:t>
-      </w:r>
-      <w:r>
-        <w:t xml:space="preserve"> </w:t>
-      </w:r>
-      <w:r>
-        <w:t xml:space="preserve">in</w:t>
+        <w:t xml:space="preserve">Top bar:</w:t>
       </w:r>
       <w:r>
         <w:t xml:space="preserve"> </w:t>
@@ -3267,41 +3204,180 @@
         <w:rPr>
           <w:rStyle w:val="VerbatimChar"/>
         </w:rPr>
+        <w:t xml:space="preserve">muto-bf-bar.liquid</w:t>
+      </w:r>
+      <w:r>
+        <w:t xml:space="preserve">.</w:t>
+      </w:r>
+    </w:p>
+    <w:p>
+      <w:pPr>
+        <w:numPr>
+          <w:ilvl w:val="1"/>
+          <w:numId w:val="1020"/>
+        </w:numPr>
+        <w:pStyle w:val="Compact"/>
+      </w:pPr>
+      <w:r>
+        <w:t xml:space="preserve">Black Friday line (</w:t>
+      </w:r>
+      <w:r>
+        <w:t xml:space="preserve">“</w:t>
+      </w:r>
+      <w:r>
+        <w:t xml:space="preserve">Ends 30 Nov</w:t>
+      </w:r>
+      <w:r>
+        <w:t xml:space="preserve">”</w:t>
+      </w:r>
+      <w:r>
+        <w:t xml:space="preserve">):</w:t>
+      </w:r>
+      <w:r>
+        <w:t xml:space="preserve"> </w:t>
+      </w:r>
+      <w:r>
+        <w:rPr>
+          <w:rStyle w:val="VerbatimChar"/>
+        </w:rPr>
         <w:t xml:space="preserve">muto-bf-copy.css</w:t>
       </w:r>
       <w:r>
-        <w:t xml:space="preserve">: £99 / £210 (3-month), £49.99 / £70 (1-month),</w:t>
-      </w:r>
-      <w:r>
-        <w:t xml:space="preserve"> </w:t>
+        <w:t xml:space="preserve">.</w:t>
+      </w:r>
+    </w:p>
+    <w:p>
+      <w:pPr>
+        <w:numPr>
+          <w:ilvl w:val="1"/>
+          <w:numId w:val="1020"/>
+        </w:numPr>
+        <w:pStyle w:val="Compact"/>
+      </w:pPr>
+      <w:r>
+        <w:t xml:space="preserve">Sticky bar line (</w:t>
       </w:r>
       <w:r>
         <w:t xml:space="preserve">“</w:t>
       </w:r>
       <w:r>
-        <w:t xml:space="preserve">One-Time Purchase - £70</w:t>
+        <w:t xml:space="preserve">53% off your first order</w:t>
       </w:r>
       <w:r>
         <w:t xml:space="preserve">”</w:t>
       </w:r>
       <w:r>
-        <w:t xml:space="preserve">. The page’s own CSS also draws the daily pills (£1.10 and £1.79 a day).</w:t>
-      </w:r>
-    </w:p>
-    <w:p>
-      <w:pPr>
-        <w:numPr>
-          <w:ilvl w:val="0"/>
-          <w:numId w:val="1020"/>
-        </w:numPr>
-        <w:pStyle w:val="Compact"/>
-      </w:pPr>
-      <w:r>
-        <w:rPr>
-          <w:bCs/>
-          <w:b/>
-        </w:rPr>
-        <w:t xml:space="preserve">Offer wording:</w:t>
+        <w:t xml:space="preserve">):</w:t>
+      </w:r>
+      <w:r>
+        <w:t xml:space="preserve"> </w:t>
+      </w:r>
+      <w:r>
+        <w:rPr>
+          <w:rStyle w:val="VerbatimChar"/>
+        </w:rPr>
+        <w:t xml:space="preserve">muto-bf-offer.liquid</w:t>
+      </w:r>
+      <w:r>
+        <w:t xml:space="preserve">.</w:t>
+      </w:r>
+    </w:p>
+    <w:p>
+      <w:pPr>
+        <w:numPr>
+          <w:ilvl w:val="0"/>
+          <w:numId w:val="1019"/>
+        </w:numPr>
+        <w:pStyle w:val="Compact"/>
+      </w:pPr>
+      <w:r>
+        <w:rPr>
+          <w:bCs/>
+          <w:b/>
+        </w:rPr>
+        <w:t xml:space="preserve">Copy swapped in by script</w:t>
+      </w:r>
+      <w:r>
+        <w:t xml:space="preserve"> </w:t>
+      </w:r>
+      <w:r>
+        <w:t xml:space="preserve">(statement line,</w:t>
+      </w:r>
+      <w:r>
+        <w:t xml:space="preserve"> </w:t>
+      </w:r>
+      <w:r>
+        <w:t xml:space="preserve">“</w:t>
+      </w:r>
+      <w:r>
+        <w:t xml:space="preserve">Who it’s for</w:t>
+      </w:r>
+      <w:r>
+        <w:t xml:space="preserve">”</w:t>
+      </w:r>
+      <w:r>
+        <w:t xml:space="preserve">,</w:t>
+      </w:r>
+      <w:r>
+        <w:t xml:space="preserve"> </w:t>
+      </w:r>
+      <w:r>
+        <w:t xml:space="preserve">“</w:t>
+      </w:r>
+      <w:r>
+        <w:t xml:space="preserve">Science-Backed Benefits</w:t>
+      </w:r>
+      <w:r>
+        <w:t xml:space="preserve">”</w:t>
+      </w:r>
+      <w:r>
+        <w:t xml:space="preserve">):</w:t>
+      </w:r>
+      <w:r>
+        <w:t xml:space="preserve"> </w:t>
+      </w:r>
+      <w:r>
+        <w:rPr>
+          <w:rStyle w:val="VerbatimChar"/>
+        </w:rPr>
+        <w:t xml:space="preserve">muto-bf-bar.liquid</w:t>
+      </w:r>
+      <w:r>
+        <w:t xml:space="preserve">. To make it permanent, edit the template’s settings in Customize.</w:t>
+      </w:r>
+    </w:p>
+    <w:p>
+      <w:pPr>
+        <w:numPr>
+          <w:ilvl w:val="0"/>
+          <w:numId w:val="1019"/>
+        </w:numPr>
+        <w:pStyle w:val="Compact"/>
+      </w:pPr>
+      <w:r>
+        <w:rPr>
+          <w:bCs/>
+          <w:b/>
+        </w:rPr>
+        <w:t xml:space="preserve">Comparison</w:t>
+      </w:r>
+      <w:r>
+        <w:t xml:space="preserve"> </w:t>
+      </w:r>
+      <w:r>
+        <w:t xml:space="preserve">rows, prices and footnote:</w:t>
+      </w:r>
+      <w:r>
+        <w:t xml:space="preserve"> </w:t>
+      </w:r>
+      <w:r>
+        <w:rPr>
+          <w:rStyle w:val="VerbatimChar"/>
+        </w:rPr>
+        <w:t xml:space="preserve">muto-bf-compare.liquid</w:t>
+      </w:r>
+      <w:r>
+        <w:t xml:space="preserve">.</w:t>
       </w:r>
     </w:p>
     <w:p>
@@ -3313,19 +3389,25 @@
         <w:pStyle w:val="Compact"/>
       </w:pPr>
       <w:r>
-        <w:t xml:space="preserve">Top bar:</w:t>
-      </w:r>
-      <w:r>
-        <w:t xml:space="preserve"> </w:t>
-      </w:r>
-      <w:r>
-        <w:rPr>
-          <w:rStyle w:val="VerbatimChar"/>
-        </w:rPr>
-        <w:t xml:space="preserve">muto-bf-bar.liquid</w:t>
-      </w:r>
-      <w:r>
-        <w:t xml:space="preserve">.</w:t>
+        <w:t xml:space="preserve">The greens powder price</w:t>
+      </w:r>
+      <w:r>
+        <w:t xml:space="preserve"> </w:t>
+      </w:r>
+      <w:r>
+        <w:t xml:space="preserve">“</w:t>
+      </w:r>
+      <w:r>
+        <w:t xml:space="preserve">£40–80</w:t>
+      </w:r>
+      <w:r>
+        <w:t xml:space="preserve">”</w:t>
+      </w:r>
+      <w:r>
+        <w:t xml:space="preserve"> </w:t>
+      </w:r>
+      <w:r>
+        <w:t xml:space="preserve">is an estimate. Please confirm it.</w:t>
       </w:r>
     </w:p>
     <w:p>
@@ -3337,206 +3419,6 @@
         <w:pStyle w:val="Compact"/>
       </w:pPr>
       <w:r>
-        <w:t xml:space="preserve">Black Friday line (</w:t>
-      </w:r>
-      <w:r>
-        <w:t xml:space="preserve">“</w:t>
-      </w:r>
-      <w:r>
-        <w:t xml:space="preserve">Ends 30 Nov</w:t>
-      </w:r>
-      <w:r>
-        <w:t xml:space="preserve">”</w:t>
-      </w:r>
-      <w:r>
-        <w:t xml:space="preserve">):</w:t>
-      </w:r>
-      <w:r>
-        <w:t xml:space="preserve"> </w:t>
-      </w:r>
-      <w:r>
-        <w:rPr>
-          <w:rStyle w:val="VerbatimChar"/>
-        </w:rPr>
-        <w:t xml:space="preserve">muto-bf-copy.css</w:t>
-      </w:r>
-      <w:r>
-        <w:t xml:space="preserve">.</w:t>
-      </w:r>
-    </w:p>
-    <w:p>
-      <w:pPr>
-        <w:numPr>
-          <w:ilvl w:val="1"/>
-          <w:numId w:val="1021"/>
-        </w:numPr>
-        <w:pStyle w:val="Compact"/>
-      </w:pPr>
-      <w:r>
-        <w:t xml:space="preserve">Sticky bar line (</w:t>
-      </w:r>
-      <w:r>
-        <w:t xml:space="preserve">“</w:t>
-      </w:r>
-      <w:r>
-        <w:t xml:space="preserve">53% off your first order</w:t>
-      </w:r>
-      <w:r>
-        <w:t xml:space="preserve">”</w:t>
-      </w:r>
-      <w:r>
-        <w:t xml:space="preserve">):</w:t>
-      </w:r>
-      <w:r>
-        <w:t xml:space="preserve"> </w:t>
-      </w:r>
-      <w:r>
-        <w:rPr>
-          <w:rStyle w:val="VerbatimChar"/>
-        </w:rPr>
-        <w:t xml:space="preserve">muto-bf-offer.liquid</w:t>
-      </w:r>
-      <w:r>
-        <w:t xml:space="preserve">.</w:t>
-      </w:r>
-    </w:p>
-    <w:p>
-      <w:pPr>
-        <w:numPr>
-          <w:ilvl w:val="0"/>
-          <w:numId w:val="1020"/>
-        </w:numPr>
-        <w:pStyle w:val="Compact"/>
-      </w:pPr>
-      <w:r>
-        <w:rPr>
-          <w:bCs/>
-          <w:b/>
-        </w:rPr>
-        <w:t xml:space="preserve">Copy swapped in by script</w:t>
-      </w:r>
-      <w:r>
-        <w:t xml:space="preserve"> </w:t>
-      </w:r>
-      <w:r>
-        <w:t xml:space="preserve">(statement line,</w:t>
-      </w:r>
-      <w:r>
-        <w:t xml:space="preserve"> </w:t>
-      </w:r>
-      <w:r>
-        <w:t xml:space="preserve">“</w:t>
-      </w:r>
-      <w:r>
-        <w:t xml:space="preserve">Who it’s for</w:t>
-      </w:r>
-      <w:r>
-        <w:t xml:space="preserve">”</w:t>
-      </w:r>
-      <w:r>
-        <w:t xml:space="preserve">,</w:t>
-      </w:r>
-      <w:r>
-        <w:t xml:space="preserve"> </w:t>
-      </w:r>
-      <w:r>
-        <w:t xml:space="preserve">“</w:t>
-      </w:r>
-      <w:r>
-        <w:t xml:space="preserve">Science-Backed Benefits</w:t>
-      </w:r>
-      <w:r>
-        <w:t xml:space="preserve">”</w:t>
-      </w:r>
-      <w:r>
-        <w:t xml:space="preserve">):</w:t>
-      </w:r>
-      <w:r>
-        <w:t xml:space="preserve"> </w:t>
-      </w:r>
-      <w:r>
-        <w:rPr>
-          <w:rStyle w:val="VerbatimChar"/>
-        </w:rPr>
-        <w:t xml:space="preserve">muto-bf-bar.liquid</w:t>
-      </w:r>
-      <w:r>
-        <w:t xml:space="preserve">. To make it permanent, edit the template’s settings in Customize.</w:t>
-      </w:r>
-    </w:p>
-    <w:p>
-      <w:pPr>
-        <w:numPr>
-          <w:ilvl w:val="0"/>
-          <w:numId w:val="1020"/>
-        </w:numPr>
-        <w:pStyle w:val="Compact"/>
-      </w:pPr>
-      <w:r>
-        <w:rPr>
-          <w:bCs/>
-          <w:b/>
-        </w:rPr>
-        <w:t xml:space="preserve">Comparison</w:t>
-      </w:r>
-      <w:r>
-        <w:t xml:space="preserve"> </w:t>
-      </w:r>
-      <w:r>
-        <w:t xml:space="preserve">rows, prices and footnote:</w:t>
-      </w:r>
-      <w:r>
-        <w:t xml:space="preserve"> </w:t>
-      </w:r>
-      <w:r>
-        <w:rPr>
-          <w:rStyle w:val="VerbatimChar"/>
-        </w:rPr>
-        <w:t xml:space="preserve">muto-bf-compare.liquid</w:t>
-      </w:r>
-      <w:r>
-        <w:t xml:space="preserve">.</w:t>
-      </w:r>
-    </w:p>
-    <w:p>
-      <w:pPr>
-        <w:numPr>
-          <w:ilvl w:val="1"/>
-          <w:numId w:val="1022"/>
-        </w:numPr>
-        <w:pStyle w:val="Compact"/>
-      </w:pPr>
-      <w:r>
-        <w:t xml:space="preserve">The greens powder price</w:t>
-      </w:r>
-      <w:r>
-        <w:t xml:space="preserve"> </w:t>
-      </w:r>
-      <w:r>
-        <w:t xml:space="preserve">“</w:t>
-      </w:r>
-      <w:r>
-        <w:t xml:space="preserve">£40–80</w:t>
-      </w:r>
-      <w:r>
-        <w:t xml:space="preserve">”</w:t>
-      </w:r>
-      <w:r>
-        <w:t xml:space="preserve"> </w:t>
-      </w:r>
-      <w:r>
-        <w:t xml:space="preserve">is an estimate. Please confirm it.</w:t>
-      </w:r>
-    </w:p>
-    <w:p>
-      <w:pPr>
-        <w:numPr>
-          <w:ilvl w:val="1"/>
-          <w:numId w:val="1022"/>
-        </w:numPr>
-        <w:pStyle w:val="Compact"/>
-      </w:pPr>
-      <w:r>
         <w:t xml:space="preserve">The three drawings are placeholders until real photos are uploaded to Content → Files. They should show no other brand’s logos, and you need the rights to use them.</w:t>
       </w:r>
     </w:p>
@@ -3544,7 +3426,7 @@
       <w:pPr>
         <w:numPr>
           <w:ilvl w:val="0"/>
-          <w:numId w:val="1020"/>
+          <w:numId w:val="1019"/>
         </w:numPr>
         <w:pStyle w:val="Compact"/>
       </w:pPr>
@@ -3609,7 +3491,7 @@
       <w:pPr>
         <w:numPr>
           <w:ilvl w:val="0"/>
-          <w:numId w:val="1023"/>
+          <w:numId w:val="1022"/>
         </w:numPr>
         <w:pStyle w:val="Compact"/>
       </w:pPr>
@@ -3639,7 +3521,7 @@
       <w:pPr>
         <w:numPr>
           <w:ilvl w:val="0"/>
-          <w:numId w:val="1023"/>
+          <w:numId w:val="1022"/>
         </w:numPr>
         <w:pStyle w:val="Compact"/>
       </w:pPr>
@@ -3693,7 +3575,7 @@
       <w:pPr>
         <w:numPr>
           <w:ilvl w:val="0"/>
-          <w:numId w:val="1023"/>
+          <w:numId w:val="1022"/>
         </w:numPr>
         <w:pStyle w:val="Compact"/>
       </w:pPr>
@@ -3717,7 +3599,7 @@
       <w:pPr>
         <w:numPr>
           <w:ilvl w:val="0"/>
-          <w:numId w:val="1023"/>
+          <w:numId w:val="1022"/>
         </w:numPr>
         <w:pStyle w:val="Compact"/>
       </w:pPr>
@@ -4090,9 +3972,6 @@
     <w:abstractNumId w:val="991"/>
   </w:num>
   <w:num w:numId="1015">
-    <w:abstractNumId w:val="991"/>
-  </w:num>
-  <w:num w:numId="1016">
     <w:abstractNumId w:val="99411"/>
     <w:lvlOverride w:ilvl="0">
       <w:startOverride w:val="1"/>
@@ -4122,6 +4001,9 @@
       <w:startOverride w:val="1"/>
     </w:lvlOverride>
   </w:num>
+  <w:num w:numId="1016">
+    <w:abstractNumId w:val="991"/>
+  </w:num>
   <w:num w:numId="1017">
     <w:abstractNumId w:val="991"/>
   </w:num>
@@ -4138,9 +4020,6 @@
     <w:abstractNumId w:val="991"/>
   </w:num>
   <w:num w:numId="1022">
-    <w:abstractNumId w:val="991"/>
-  </w:num>
-  <w:num w:numId="1023">
     <w:abstractNumId w:val="991"/>
   </w:num>
 </w:numbering>

</xml_diff>

<commit_message>
Handoff: testing pop-up restyle
Co-Authored-By: Claude Opus 5.5 <noreply@anthropic.com>
Claude-Session: https://claude.ai/code/session_01VYMABo11xv71mQ7912r49G
</commit_message>
<xml_diff>
--- a/handoff/MUTO_Dev_Handoff_BF_PDP_31Oct2026.docx
+++ b/handoff/MUTO_Dev_Handoff_BF_PDP_31Oct2026.docx
@@ -1871,6 +1871,161 @@
           <w:bCs/>
           <w:b/>
         </w:rPr>
+        <w:t xml:space="preserve">Third-party testing pop-up (</w:t>
+      </w:r>
+      <w:r>
+        <w:rPr>
+          <w:rStyle w:val="VerbatimChar"/>
+          <w:bCs/>
+          <w:b/>
+        </w:rPr>
+        <w:t xml:space="preserve">sections/muto-test-results.liquid</w:t>
+      </w:r>
+      <w:r>
+        <w:rPr>
+          <w:bCs/>
+          <w:b/>
+        </w:rPr>
+        <w:t xml:space="preserve">), restyled to look clinical.</w:t>
+      </w:r>
+      <w:r>
+        <w:t xml:space="preserve"> </w:t>
+      </w:r>
+      <w:r>
+        <w:t xml:space="preserve">The markup, content and behaviour are the same; only the styles changed:</w:t>
+      </w:r>
+    </w:p>
+    <w:p>
+      <w:pPr>
+        <w:numPr>
+          <w:ilvl w:val="0"/>
+          <w:numId w:val="1014"/>
+        </w:numPr>
+        <w:pStyle w:val="Compact"/>
+      </w:pPr>
+      <w:r>
+        <w:t xml:space="preserve">a mono</w:t>
+      </w:r>
+      <w:r>
+        <w:t xml:space="preserve"> </w:t>
+      </w:r>
+      <w:r>
+        <w:t xml:space="preserve">“</w:t>
+      </w:r>
+      <w:r>
+        <w:t xml:space="preserve">Certificate of analysis</w:t>
+      </w:r>
+      <w:r>
+        <w:t xml:space="preserve">”</w:t>
+      </w:r>
+      <w:r>
+        <w:t xml:space="preserve"> </w:t>
+      </w:r>
+      <w:r>
+        <w:t xml:space="preserve">label and the batch as a mono reference</w:t>
+      </w:r>
+    </w:p>
+    <w:p>
+      <w:pPr>
+        <w:numPr>
+          <w:ilvl w:val="0"/>
+          <w:numId w:val="1014"/>
+        </w:numPr>
+        <w:pStyle w:val="Compact"/>
+      </w:pPr>
+      <w:r>
+        <w:t xml:space="preserve">a white side menu with a thin bar on the open tab</w:t>
+      </w:r>
+    </w:p>
+    <w:p>
+      <w:pPr>
+        <w:numPr>
+          <w:ilvl w:val="0"/>
+          <w:numId w:val="1014"/>
+        </w:numPr>
+        <w:pStyle w:val="Compact"/>
+      </w:pPr>
+      <w:r>
+        <w:t xml:space="preserve">normal-case headings</w:t>
+      </w:r>
+    </w:p>
+    <w:p>
+      <w:pPr>
+        <w:numPr>
+          <w:ilvl w:val="0"/>
+          <w:numId w:val="1014"/>
+        </w:numPr>
+        <w:pStyle w:val="Compact"/>
+      </w:pPr>
+      <w:r>
+        <w:t xml:space="preserve">results in tabular mono</w:t>
+      </w:r>
+    </w:p>
+    <w:p>
+      <w:pPr>
+        <w:numPr>
+          <w:ilvl w:val="0"/>
+          <w:numId w:val="1014"/>
+        </w:numPr>
+        <w:pStyle w:val="Compact"/>
+      </w:pPr>
+      <w:r>
+        <w:t xml:space="preserve">PASS as small teal badges</w:t>
+      </w:r>
+    </w:p>
+    <w:p>
+      <w:pPr>
+        <w:numPr>
+          <w:ilvl w:val="0"/>
+          <w:numId w:val="1014"/>
+        </w:numPr>
+        <w:pStyle w:val="Compact"/>
+      </w:pPr>
+      <w:r>
+        <w:t xml:space="preserve">hairline rules</w:t>
+      </w:r>
+    </w:p>
+    <w:p>
+      <w:pPr>
+        <w:pStyle w:val="FirstParagraph"/>
+      </w:pPr>
+      <w:r>
+        <w:t xml:space="preserve">It applies everywhere the pop-up opens. In the zip under</w:t>
+      </w:r>
+      <w:r>
+        <w:t xml:space="preserve"> </w:t>
+      </w:r>
+      <w:r>
+        <w:rPr>
+          <w:rStyle w:val="VerbatimChar"/>
+        </w:rPr>
+        <w:t xml:space="preserve">sections/</w:t>
+      </w:r>
+      <w:r>
+        <w:t xml:space="preserve">, and in GitHub at</w:t>
+      </w:r>
+      <w:r>
+        <w:t xml:space="preserve"> </w:t>
+      </w:r>
+      <w:r>
+        <w:rPr>
+          <w:rStyle w:val="VerbatimChar"/>
+        </w:rPr>
+        <w:t xml:space="preserve">shopify/tests-v2/</w:t>
+      </w:r>
+      <w:r>
+        <w:t xml:space="preserve">.</w:t>
+      </w:r>
+    </w:p>
+    <w:p>
+      <w:pPr>
+        <w:pStyle w:val="BodyText"/>
+      </w:pPr>
+      <w:r>
+        <w:rPr>
+          <w:bCs/>
+          <w:b/>
+        </w:rPr>
         <w:t xml:space="preserve">Site-wide (all pages, phones and tablets under 990px):</w:t>
       </w:r>
       <w:r>
@@ -1884,7 +2039,7 @@
       <w:pPr>
         <w:numPr>
           <w:ilvl w:val="0"/>
-          <w:numId w:val="1014"/>
+          <w:numId w:val="1015"/>
         </w:numPr>
         <w:pStyle w:val="Compact"/>
       </w:pPr>
@@ -1896,7 +2051,7 @@
       <w:pPr>
         <w:numPr>
           <w:ilvl w:val="0"/>
-          <w:numId w:val="1014"/>
+          <w:numId w:val="1015"/>
         </w:numPr>
         <w:pStyle w:val="Compact"/>
       </w:pPr>
@@ -1908,7 +2063,7 @@
       <w:pPr>
         <w:numPr>
           <w:ilvl w:val="0"/>
-          <w:numId w:val="1014"/>
+          <w:numId w:val="1015"/>
         </w:numPr>
         <w:pStyle w:val="Compact"/>
       </w:pPr>
@@ -2694,7 +2849,7 @@
       <w:pPr>
         <w:numPr>
           <w:ilvl w:val="0"/>
-          <w:numId w:val="1015"/>
+          <w:numId w:val="1016"/>
         </w:numPr>
         <w:pStyle w:val="Compact"/>
       </w:pPr>
@@ -2772,7 +2927,7 @@
       <w:pPr>
         <w:numPr>
           <w:ilvl w:val="0"/>
-          <w:numId w:val="1015"/>
+          <w:numId w:val="1016"/>
         </w:numPr>
         <w:pStyle w:val="Compact"/>
       </w:pPr>
@@ -2784,7 +2939,7 @@
       <w:pPr>
         <w:numPr>
           <w:ilvl w:val="1"/>
-          <w:numId w:val="1016"/>
+          <w:numId w:val="1017"/>
         </w:numPr>
         <w:pStyle w:val="Compact"/>
       </w:pPr>
@@ -2805,7 +2960,7 @@
       <w:pPr>
         <w:numPr>
           <w:ilvl w:val="1"/>
-          <w:numId w:val="1016"/>
+          <w:numId w:val="1017"/>
         </w:numPr>
         <w:pStyle w:val="Compact"/>
       </w:pPr>
@@ -2858,7 +3013,7 @@
       <w:pPr>
         <w:numPr>
           <w:ilvl w:val="1"/>
-          <w:numId w:val="1016"/>
+          <w:numId w:val="1017"/>
         </w:numPr>
         <w:pStyle w:val="Compact"/>
       </w:pPr>
@@ -2895,7 +3050,7 @@
       <w:pPr>
         <w:numPr>
           <w:ilvl w:val="1"/>
-          <w:numId w:val="1016"/>
+          <w:numId w:val="1017"/>
         </w:numPr>
         <w:pStyle w:val="Compact"/>
       </w:pPr>
@@ -2917,7 +3072,7 @@
       <w:pPr>
         <w:numPr>
           <w:ilvl w:val="0"/>
-          <w:numId w:val="1017"/>
+          <w:numId w:val="1018"/>
         </w:numPr>
         <w:pStyle w:val="Compact"/>
       </w:pPr>
@@ -2942,63 +3097,63 @@
       <w:pPr>
         <w:numPr>
           <w:ilvl w:val="1"/>
+          <w:numId w:val="1019"/>
+        </w:numPr>
+        <w:pStyle w:val="Compact"/>
+      </w:pPr>
+      <w:r>
+        <w:t xml:space="preserve">Check the first box is</w:t>
+      </w:r>
+      <w:r>
+        <w:t xml:space="preserve"> </w:t>
+      </w:r>
+      <w:r>
+        <w:rPr>
+          <w:bCs/>
+          <w:b/>
+        </w:rPr>
+        <w:t xml:space="preserve">£99</w:t>
+      </w:r>
+      <w:r>
+        <w:t xml:space="preserve"> </w:t>
+      </w:r>
+      <w:r>
+        <w:t xml:space="preserve">(Skio’s intro price) and the welcome kit gifts are there.</w:t>
+      </w:r>
+    </w:p>
+    <w:p>
+      <w:pPr>
+        <w:numPr>
+          <w:ilvl w:val="1"/>
+          <w:numId w:val="1019"/>
+        </w:numPr>
+        <w:pStyle w:val="Compact"/>
+      </w:pPr>
+      <w:r>
+        <w:t xml:space="preserve">Claim skips the cart drawer. If any gift is added by something in the drawer, it won’t be added this way.</w:t>
+      </w:r>
+    </w:p>
+    <w:p>
+      <w:pPr>
+        <w:numPr>
+          <w:ilvl w:val="0"/>
           <w:numId w:val="1018"/>
         </w:numPr>
         <w:pStyle w:val="Compact"/>
       </w:pPr>
       <w:r>
-        <w:t xml:space="preserve">Check the first box is</w:t>
-      </w:r>
-      <w:r>
-        <w:t xml:space="preserve"> </w:t>
-      </w:r>
-      <w:r>
-        <w:rPr>
-          <w:bCs/>
-          <w:b/>
-        </w:rPr>
-        <w:t xml:space="preserve">£99</w:t>
-      </w:r>
-      <w:r>
-        <w:t xml:space="preserve"> </w:t>
-      </w:r>
-      <w:r>
-        <w:t xml:space="preserve">(Skio’s intro price) and the welcome kit gifts are there.</w:t>
-      </w:r>
-    </w:p>
-    <w:p>
-      <w:pPr>
-        <w:numPr>
-          <w:ilvl w:val="1"/>
+        <w:t xml:space="preserve">☐ Place test orders through the main button, the sticky bar (both plans) and the one-time purchase. Check the right variant and plan in each.</w:t>
+      </w:r>
+    </w:p>
+    <w:p>
+      <w:pPr>
+        <w:numPr>
+          <w:ilvl w:val="0"/>
           <w:numId w:val="1018"/>
         </w:numPr>
         <w:pStyle w:val="Compact"/>
       </w:pPr>
       <w:r>
-        <w:t xml:space="preserve">Claim skips the cart drawer. If any gift is added by something in the drawer, it won’t be added this way.</w:t>
-      </w:r>
-    </w:p>
-    <w:p>
-      <w:pPr>
-        <w:numPr>
-          <w:ilvl w:val="0"/>
-          <w:numId w:val="1017"/>
-        </w:numPr>
-        <w:pStyle w:val="Compact"/>
-      </w:pPr>
-      <w:r>
-        <w:t xml:space="preserve">☐ Place test orders through the main button, the sticky bar (both plans) and the one-time purchase. Check the right variant and plan in each.</w:t>
-      </w:r>
-    </w:p>
-    <w:p>
-      <w:pPr>
-        <w:numPr>
-          <w:ilvl w:val="0"/>
-          <w:numId w:val="1017"/>
-        </w:numPr>
-        <w:pStyle w:val="Compact"/>
-      </w:pPr>
-      <w:r>
         <w:t xml:space="preserve">☐ Do the same on the -2 product.</w:t>
       </w:r>
     </w:p>
@@ -3006,7 +3161,7 @@
       <w:pPr>
         <w:numPr>
           <w:ilvl w:val="0"/>
-          <w:numId w:val="1017"/>
+          <w:numId w:val="1018"/>
         </w:numPr>
         <w:pStyle w:val="Compact"/>
       </w:pPr>
@@ -3018,7 +3173,7 @@
       <w:pPr>
         <w:numPr>
           <w:ilvl w:val="0"/>
-          <w:numId w:val="1017"/>
+          <w:numId w:val="1018"/>
         </w:numPr>
         <w:pStyle w:val="Compact"/>
       </w:pPr>
@@ -3030,7 +3185,7 @@
       <w:pPr>
         <w:numPr>
           <w:ilvl w:val="0"/>
-          <w:numId w:val="1017"/>
+          <w:numId w:val="1018"/>
         </w:numPr>
         <w:pStyle w:val="Compact"/>
       </w:pPr>
@@ -3042,7 +3197,7 @@
       <w:pPr>
         <w:numPr>
           <w:ilvl w:val="0"/>
-          <w:numId w:val="1017"/>
+          <w:numId w:val="1018"/>
         </w:numPr>
         <w:pStyle w:val="Compact"/>
       </w:pPr>
@@ -3054,7 +3209,7 @@
       <w:pPr>
         <w:numPr>
           <w:ilvl w:val="0"/>
-          <w:numId w:val="1017"/>
+          <w:numId w:val="1018"/>
         </w:numPr>
         <w:pStyle w:val="Compact"/>
       </w:pPr>
@@ -3079,7 +3234,7 @@
       <w:pPr>
         <w:numPr>
           <w:ilvl w:val="0"/>
-          <w:numId w:val="1017"/>
+          <w:numId w:val="1018"/>
         </w:numPr>
         <w:pStyle w:val="Compact"/>
       </w:pPr>
@@ -3091,7 +3246,19 @@
       <w:pPr>
         <w:numPr>
           <w:ilvl w:val="0"/>
-          <w:numId w:val="1017"/>
+          <w:numId w:val="1018"/>
+        </w:numPr>
+        <w:pStyle w:val="Compact"/>
+      </w:pPr>
+      <w:r>
+        <w:t xml:space="preserve">☐ Testing pop-up: open it from the product page and the ingredients page, then check all four tabs on a phone and on desktop.</w:t>
+      </w:r>
+    </w:p>
+    <w:p>
+      <w:pPr>
+        <w:numPr>
+          <w:ilvl w:val="0"/>
+          <w:numId w:val="1018"/>
         </w:numPr>
         <w:pStyle w:val="Compact"/>
       </w:pPr>
@@ -3103,7 +3270,7 @@
       <w:pPr>
         <w:numPr>
           <w:ilvl w:val="0"/>
-          <w:numId w:val="1017"/>
+          <w:numId w:val="1018"/>
         </w:numPr>
         <w:pStyle w:val="Compact"/>
       </w:pPr>
@@ -3125,7 +3292,7 @@
       <w:pPr>
         <w:numPr>
           <w:ilvl w:val="0"/>
-          <w:numId w:val="1019"/>
+          <w:numId w:val="1020"/>
         </w:numPr>
         <w:pStyle w:val="Compact"/>
       </w:pPr>
@@ -3174,7 +3341,7 @@
       <w:pPr>
         <w:numPr>
           <w:ilvl w:val="0"/>
-          <w:numId w:val="1019"/>
+          <w:numId w:val="1020"/>
         </w:numPr>
         <w:pStyle w:val="Compact"/>
       </w:pPr>
@@ -3184,200 +3351,6 @@
           <w:b/>
         </w:rPr>
         <w:t xml:space="preserve">Offer wording:</w:t>
-      </w:r>
-    </w:p>
-    <w:p>
-      <w:pPr>
-        <w:numPr>
-          <w:ilvl w:val="1"/>
-          <w:numId w:val="1020"/>
-        </w:numPr>
-        <w:pStyle w:val="Compact"/>
-      </w:pPr>
-      <w:r>
-        <w:t xml:space="preserve">Top bar:</w:t>
-      </w:r>
-      <w:r>
-        <w:t xml:space="preserve"> </w:t>
-      </w:r>
-      <w:r>
-        <w:rPr>
-          <w:rStyle w:val="VerbatimChar"/>
-        </w:rPr>
-        <w:t xml:space="preserve">muto-bf-bar.liquid</w:t>
-      </w:r>
-      <w:r>
-        <w:t xml:space="preserve">.</w:t>
-      </w:r>
-    </w:p>
-    <w:p>
-      <w:pPr>
-        <w:numPr>
-          <w:ilvl w:val="1"/>
-          <w:numId w:val="1020"/>
-        </w:numPr>
-        <w:pStyle w:val="Compact"/>
-      </w:pPr>
-      <w:r>
-        <w:t xml:space="preserve">Black Friday line (</w:t>
-      </w:r>
-      <w:r>
-        <w:t xml:space="preserve">“</w:t>
-      </w:r>
-      <w:r>
-        <w:t xml:space="preserve">Ends 30 Nov</w:t>
-      </w:r>
-      <w:r>
-        <w:t xml:space="preserve">”</w:t>
-      </w:r>
-      <w:r>
-        <w:t xml:space="preserve">):</w:t>
-      </w:r>
-      <w:r>
-        <w:t xml:space="preserve"> </w:t>
-      </w:r>
-      <w:r>
-        <w:rPr>
-          <w:rStyle w:val="VerbatimChar"/>
-        </w:rPr>
-        <w:t xml:space="preserve">muto-bf-copy.css</w:t>
-      </w:r>
-      <w:r>
-        <w:t xml:space="preserve">.</w:t>
-      </w:r>
-    </w:p>
-    <w:p>
-      <w:pPr>
-        <w:numPr>
-          <w:ilvl w:val="1"/>
-          <w:numId w:val="1020"/>
-        </w:numPr>
-        <w:pStyle w:val="Compact"/>
-      </w:pPr>
-      <w:r>
-        <w:t xml:space="preserve">Sticky bar line (</w:t>
-      </w:r>
-      <w:r>
-        <w:t xml:space="preserve">“</w:t>
-      </w:r>
-      <w:r>
-        <w:t xml:space="preserve">53% off your first order</w:t>
-      </w:r>
-      <w:r>
-        <w:t xml:space="preserve">”</w:t>
-      </w:r>
-      <w:r>
-        <w:t xml:space="preserve">):</w:t>
-      </w:r>
-      <w:r>
-        <w:t xml:space="preserve"> </w:t>
-      </w:r>
-      <w:r>
-        <w:rPr>
-          <w:rStyle w:val="VerbatimChar"/>
-        </w:rPr>
-        <w:t xml:space="preserve">muto-bf-offer.liquid</w:t>
-      </w:r>
-      <w:r>
-        <w:t xml:space="preserve">.</w:t>
-      </w:r>
-    </w:p>
-    <w:p>
-      <w:pPr>
-        <w:numPr>
-          <w:ilvl w:val="0"/>
-          <w:numId w:val="1019"/>
-        </w:numPr>
-        <w:pStyle w:val="Compact"/>
-      </w:pPr>
-      <w:r>
-        <w:rPr>
-          <w:bCs/>
-          <w:b/>
-        </w:rPr>
-        <w:t xml:space="preserve">Copy swapped in by script</w:t>
-      </w:r>
-      <w:r>
-        <w:t xml:space="preserve"> </w:t>
-      </w:r>
-      <w:r>
-        <w:t xml:space="preserve">(statement line,</w:t>
-      </w:r>
-      <w:r>
-        <w:t xml:space="preserve"> </w:t>
-      </w:r>
-      <w:r>
-        <w:t xml:space="preserve">“</w:t>
-      </w:r>
-      <w:r>
-        <w:t xml:space="preserve">Who it’s for</w:t>
-      </w:r>
-      <w:r>
-        <w:t xml:space="preserve">”</w:t>
-      </w:r>
-      <w:r>
-        <w:t xml:space="preserve">,</w:t>
-      </w:r>
-      <w:r>
-        <w:t xml:space="preserve"> </w:t>
-      </w:r>
-      <w:r>
-        <w:t xml:space="preserve">“</w:t>
-      </w:r>
-      <w:r>
-        <w:t xml:space="preserve">Science-Backed Benefits</w:t>
-      </w:r>
-      <w:r>
-        <w:t xml:space="preserve">”</w:t>
-      </w:r>
-      <w:r>
-        <w:t xml:space="preserve">):</w:t>
-      </w:r>
-      <w:r>
-        <w:t xml:space="preserve"> </w:t>
-      </w:r>
-      <w:r>
-        <w:rPr>
-          <w:rStyle w:val="VerbatimChar"/>
-        </w:rPr>
-        <w:t xml:space="preserve">muto-bf-bar.liquid</w:t>
-      </w:r>
-      <w:r>
-        <w:t xml:space="preserve">. To make it permanent, edit the template’s settings in Customize.</w:t>
-      </w:r>
-    </w:p>
-    <w:p>
-      <w:pPr>
-        <w:numPr>
-          <w:ilvl w:val="0"/>
-          <w:numId w:val="1019"/>
-        </w:numPr>
-        <w:pStyle w:val="Compact"/>
-      </w:pPr>
-      <w:r>
-        <w:rPr>
-          <w:bCs/>
-          <w:b/>
-        </w:rPr>
-        <w:t xml:space="preserve">Comparison</w:t>
-      </w:r>
-      <w:r>
-        <w:t xml:space="preserve"> </w:t>
-      </w:r>
-      <w:r>
-        <w:t xml:space="preserve">rows, prices and footnote:</w:t>
-      </w:r>
-      <w:r>
-        <w:t xml:space="preserve"> </w:t>
-      </w:r>
-      <w:r>
-        <w:rPr>
-          <w:rStyle w:val="VerbatimChar"/>
-        </w:rPr>
-        <w:t xml:space="preserve">muto-bf-compare.liquid</w:t>
-      </w:r>
-      <w:r>
-        <w:t xml:space="preserve">.</w:t>
       </w:r>
     </w:p>
     <w:p>
@@ -3389,25 +3362,19 @@
         <w:pStyle w:val="Compact"/>
       </w:pPr>
       <w:r>
-        <w:t xml:space="preserve">The greens powder price</w:t>
-      </w:r>
-      <w:r>
-        <w:t xml:space="preserve"> </w:t>
-      </w:r>
-      <w:r>
-        <w:t xml:space="preserve">“</w:t>
-      </w:r>
-      <w:r>
-        <w:t xml:space="preserve">£40–80</w:t>
-      </w:r>
-      <w:r>
-        <w:t xml:space="preserve">”</w:t>
-      </w:r>
-      <w:r>
-        <w:t xml:space="preserve"> </w:t>
-      </w:r>
-      <w:r>
-        <w:t xml:space="preserve">is an estimate. Please confirm it.</w:t>
+        <w:t xml:space="preserve">Top bar:</w:t>
+      </w:r>
+      <w:r>
+        <w:t xml:space="preserve"> </w:t>
+      </w:r>
+      <w:r>
+        <w:rPr>
+          <w:rStyle w:val="VerbatimChar"/>
+        </w:rPr>
+        <w:t xml:space="preserve">muto-bf-bar.liquid</w:t>
+      </w:r>
+      <w:r>
+        <w:t xml:space="preserve">.</w:t>
       </w:r>
     </w:p>
     <w:p>
@@ -3419,6 +3386,206 @@
         <w:pStyle w:val="Compact"/>
       </w:pPr>
       <w:r>
+        <w:t xml:space="preserve">Black Friday line (</w:t>
+      </w:r>
+      <w:r>
+        <w:t xml:space="preserve">“</w:t>
+      </w:r>
+      <w:r>
+        <w:t xml:space="preserve">Ends 30 Nov</w:t>
+      </w:r>
+      <w:r>
+        <w:t xml:space="preserve">”</w:t>
+      </w:r>
+      <w:r>
+        <w:t xml:space="preserve">):</w:t>
+      </w:r>
+      <w:r>
+        <w:t xml:space="preserve"> </w:t>
+      </w:r>
+      <w:r>
+        <w:rPr>
+          <w:rStyle w:val="VerbatimChar"/>
+        </w:rPr>
+        <w:t xml:space="preserve">muto-bf-copy.css</w:t>
+      </w:r>
+      <w:r>
+        <w:t xml:space="preserve">.</w:t>
+      </w:r>
+    </w:p>
+    <w:p>
+      <w:pPr>
+        <w:numPr>
+          <w:ilvl w:val="1"/>
+          <w:numId w:val="1021"/>
+        </w:numPr>
+        <w:pStyle w:val="Compact"/>
+      </w:pPr>
+      <w:r>
+        <w:t xml:space="preserve">Sticky bar line (</w:t>
+      </w:r>
+      <w:r>
+        <w:t xml:space="preserve">“</w:t>
+      </w:r>
+      <w:r>
+        <w:t xml:space="preserve">53% off your first order</w:t>
+      </w:r>
+      <w:r>
+        <w:t xml:space="preserve">”</w:t>
+      </w:r>
+      <w:r>
+        <w:t xml:space="preserve">):</w:t>
+      </w:r>
+      <w:r>
+        <w:t xml:space="preserve"> </w:t>
+      </w:r>
+      <w:r>
+        <w:rPr>
+          <w:rStyle w:val="VerbatimChar"/>
+        </w:rPr>
+        <w:t xml:space="preserve">muto-bf-offer.liquid</w:t>
+      </w:r>
+      <w:r>
+        <w:t xml:space="preserve">.</w:t>
+      </w:r>
+    </w:p>
+    <w:p>
+      <w:pPr>
+        <w:numPr>
+          <w:ilvl w:val="0"/>
+          <w:numId w:val="1020"/>
+        </w:numPr>
+        <w:pStyle w:val="Compact"/>
+      </w:pPr>
+      <w:r>
+        <w:rPr>
+          <w:bCs/>
+          <w:b/>
+        </w:rPr>
+        <w:t xml:space="preserve">Copy swapped in by script</w:t>
+      </w:r>
+      <w:r>
+        <w:t xml:space="preserve"> </w:t>
+      </w:r>
+      <w:r>
+        <w:t xml:space="preserve">(statement line,</w:t>
+      </w:r>
+      <w:r>
+        <w:t xml:space="preserve"> </w:t>
+      </w:r>
+      <w:r>
+        <w:t xml:space="preserve">“</w:t>
+      </w:r>
+      <w:r>
+        <w:t xml:space="preserve">Who it’s for</w:t>
+      </w:r>
+      <w:r>
+        <w:t xml:space="preserve">”</w:t>
+      </w:r>
+      <w:r>
+        <w:t xml:space="preserve">,</w:t>
+      </w:r>
+      <w:r>
+        <w:t xml:space="preserve"> </w:t>
+      </w:r>
+      <w:r>
+        <w:t xml:space="preserve">“</w:t>
+      </w:r>
+      <w:r>
+        <w:t xml:space="preserve">Science-Backed Benefits</w:t>
+      </w:r>
+      <w:r>
+        <w:t xml:space="preserve">”</w:t>
+      </w:r>
+      <w:r>
+        <w:t xml:space="preserve">):</w:t>
+      </w:r>
+      <w:r>
+        <w:t xml:space="preserve"> </w:t>
+      </w:r>
+      <w:r>
+        <w:rPr>
+          <w:rStyle w:val="VerbatimChar"/>
+        </w:rPr>
+        <w:t xml:space="preserve">muto-bf-bar.liquid</w:t>
+      </w:r>
+      <w:r>
+        <w:t xml:space="preserve">. To make it permanent, edit the template’s settings in Customize.</w:t>
+      </w:r>
+    </w:p>
+    <w:p>
+      <w:pPr>
+        <w:numPr>
+          <w:ilvl w:val="0"/>
+          <w:numId w:val="1020"/>
+        </w:numPr>
+        <w:pStyle w:val="Compact"/>
+      </w:pPr>
+      <w:r>
+        <w:rPr>
+          <w:bCs/>
+          <w:b/>
+        </w:rPr>
+        <w:t xml:space="preserve">Comparison</w:t>
+      </w:r>
+      <w:r>
+        <w:t xml:space="preserve"> </w:t>
+      </w:r>
+      <w:r>
+        <w:t xml:space="preserve">rows, prices and footnote:</w:t>
+      </w:r>
+      <w:r>
+        <w:t xml:space="preserve"> </w:t>
+      </w:r>
+      <w:r>
+        <w:rPr>
+          <w:rStyle w:val="VerbatimChar"/>
+        </w:rPr>
+        <w:t xml:space="preserve">muto-bf-compare.liquid</w:t>
+      </w:r>
+      <w:r>
+        <w:t xml:space="preserve">.</w:t>
+      </w:r>
+    </w:p>
+    <w:p>
+      <w:pPr>
+        <w:numPr>
+          <w:ilvl w:val="1"/>
+          <w:numId w:val="1022"/>
+        </w:numPr>
+        <w:pStyle w:val="Compact"/>
+      </w:pPr>
+      <w:r>
+        <w:t xml:space="preserve">The greens powder price</w:t>
+      </w:r>
+      <w:r>
+        <w:t xml:space="preserve"> </w:t>
+      </w:r>
+      <w:r>
+        <w:t xml:space="preserve">“</w:t>
+      </w:r>
+      <w:r>
+        <w:t xml:space="preserve">£40–80</w:t>
+      </w:r>
+      <w:r>
+        <w:t xml:space="preserve">”</w:t>
+      </w:r>
+      <w:r>
+        <w:t xml:space="preserve"> </w:t>
+      </w:r>
+      <w:r>
+        <w:t xml:space="preserve">is an estimate. Please confirm it.</w:t>
+      </w:r>
+    </w:p>
+    <w:p>
+      <w:pPr>
+        <w:numPr>
+          <w:ilvl w:val="1"/>
+          <w:numId w:val="1022"/>
+        </w:numPr>
+        <w:pStyle w:val="Compact"/>
+      </w:pPr>
+      <w:r>
         <w:t xml:space="preserve">The three drawings are placeholders until real photos are uploaded to Content → Files. They should show no other brand’s logos, and you need the rights to use them.</w:t>
       </w:r>
     </w:p>
@@ -3426,7 +3593,7 @@
       <w:pPr>
         <w:numPr>
           <w:ilvl w:val="0"/>
-          <w:numId w:val="1019"/>
+          <w:numId w:val="1020"/>
         </w:numPr>
         <w:pStyle w:val="Compact"/>
       </w:pPr>
@@ -3491,7 +3658,7 @@
       <w:pPr>
         <w:numPr>
           <w:ilvl w:val="0"/>
-          <w:numId w:val="1022"/>
+          <w:numId w:val="1023"/>
         </w:numPr>
         <w:pStyle w:val="Compact"/>
       </w:pPr>
@@ -3521,7 +3688,7 @@
       <w:pPr>
         <w:numPr>
           <w:ilvl w:val="0"/>
-          <w:numId w:val="1022"/>
+          <w:numId w:val="1023"/>
         </w:numPr>
         <w:pStyle w:val="Compact"/>
       </w:pPr>
@@ -3575,7 +3742,7 @@
       <w:pPr>
         <w:numPr>
           <w:ilvl w:val="0"/>
-          <w:numId w:val="1022"/>
+          <w:numId w:val="1023"/>
         </w:numPr>
         <w:pStyle w:val="Compact"/>
       </w:pPr>
@@ -3599,7 +3766,7 @@
       <w:pPr>
         <w:numPr>
           <w:ilvl w:val="0"/>
-          <w:numId w:val="1022"/>
+          <w:numId w:val="1023"/>
         </w:numPr>
         <w:pStyle w:val="Compact"/>
       </w:pPr>
@@ -3972,6 +4139,9 @@
     <w:abstractNumId w:val="991"/>
   </w:num>
   <w:num w:numId="1015">
+    <w:abstractNumId w:val="991"/>
+  </w:num>
+  <w:num w:numId="1016">
     <w:abstractNumId w:val="99411"/>
     <w:lvlOverride w:ilvl="0">
       <w:startOverride w:val="1"/>
@@ -4001,9 +4171,6 @@
       <w:startOverride w:val="1"/>
     </w:lvlOverride>
   </w:num>
-  <w:num w:numId="1016">
-    <w:abstractNumId w:val="991"/>
-  </w:num>
   <w:num w:numId="1017">
     <w:abstractNumId w:val="991"/>
   </w:num>
@@ -4020,6 +4187,9 @@
     <w:abstractNumId w:val="991"/>
   </w:num>
   <w:num w:numId="1022">
+    <w:abstractNumId w:val="991"/>
+  </w:num>
+  <w:num w:numId="1023">
     <w:abstractNumId w:val="991"/>
   </w:num>
 </w:numbering>

</xml_diff>

<commit_message>
Handoff: heading weight, science testing link and sticky add to cart
Co-Authored-By: Claude Opus 5.5 <noreply@anthropic.com>
Claude-Session: https://claude.ai/code/session_01VYMABo11xv71mQ7912r49G
</commit_message>
<xml_diff>
--- a/handoff/MUTO_Dev_Handoff_BF_PDP_31Oct2026.docx
+++ b/handoff/MUTO_Dev_Handoff_BF_PDP_31Oct2026.docx
@@ -1751,6 +1751,68 @@
         <w:pStyle w:val="FirstParagraph"/>
       </w:pPr>
       <w:r>
+        <w:t xml:space="preserve">Also on the science page:</w:t>
+      </w:r>
+      <w:r>
+        <w:t xml:space="preserve"> </w:t>
+      </w:r>
+      <w:r>
+        <w:t xml:space="preserve">- A</w:t>
+      </w:r>
+      <w:r>
+        <w:t xml:space="preserve"> </w:t>
+      </w:r>
+      <w:r>
+        <w:t xml:space="preserve">“</w:t>
+      </w:r>
+      <w:r>
+        <w:t xml:space="preserve">View third-party testing results</w:t>
+      </w:r>
+      <w:r>
+        <w:t xml:space="preserve">”</w:t>
+      </w:r>
+      <w:r>
+        <w:t xml:space="preserve"> </w:t>
+      </w:r>
+      <w:r>
+        <w:t xml:space="preserve">link under the numbers. It opens the same testing pop-up as the product page, with the same batch data and wording; the template carries a copy of the product page’s</w:t>
+      </w:r>
+      <w:r>
+        <w:t xml:space="preserve"> </w:t>
+      </w:r>
+      <w:r>
+        <w:rPr>
+          <w:rStyle w:val="VerbatimChar"/>
+        </w:rPr>
+        <w:t xml:space="preserve">tests</w:t>
+      </w:r>
+      <w:r>
+        <w:t xml:space="preserve"> </w:t>
+      </w:r>
+      <w:r>
+        <w:t xml:space="preserve">section.</w:t>
+      </w:r>
+      <w:r>
+        <w:t xml:space="preserve"> </w:t>
+      </w:r>
+      <w:r>
+        <w:t xml:space="preserve">- A sticky add to cart (</w:t>
+      </w:r>
+      <w:r>
+        <w:rPr>
+          <w:rStyle w:val="VerbatimChar"/>
+        </w:rPr>
+        <w:t xml:space="preserve">snippets/muto-sci-sticky.liquid</w:t>
+      </w:r>
+      <w:r>
+        <w:t xml:space="preserve">). It’s the product page’s bar with 3-Month Supply £99 or 1-Month Supply £49.99. It adds the chosen plan (variant and Skio selling plan, read from the product) and then opens the cart.</w:t>
+      </w:r>
+    </w:p>
+    <w:p>
+      <w:pPr>
+        <w:pStyle w:val="BodyText"/>
+      </w:pPr>
+      <w:r>
         <w:t xml:space="preserve">In GitHub at</w:t>
       </w:r>
       <w:r>
@@ -2015,6 +2077,60 @@
       </w:r>
       <w:r>
         <w:t xml:space="preserve">.</w:t>
+      </w:r>
+    </w:p>
+    <w:p>
+      <w:pPr>
+        <w:pStyle w:val="BodyText"/>
+      </w:pPr>
+      <w:r>
+        <w:rPr>
+          <w:bCs/>
+          <w:b/>
+        </w:rPr>
+        <w:t xml:space="preserve">Site-wide: lighter headings.</w:t>
+      </w:r>
+      <w:r>
+        <w:t xml:space="preserve"> </w:t>
+      </w:r>
+      <w:r>
+        <w:rPr>
+          <w:rStyle w:val="VerbatimChar"/>
+        </w:rPr>
+        <w:t xml:space="preserve">muto-bf-head.liquid</w:t>
+      </w:r>
+      <w:r>
+        <w:t xml:space="preserve"> </w:t>
+      </w:r>
+      <w:r>
+        <w:t xml:space="preserve">sets the theme’s heading weight to 500 (</w:t>
+      </w:r>
+      <w:r>
+        <w:rPr>
+          <w:rStyle w:val="VerbatimChar"/>
+        </w:rPr>
+        <w:t xml:space="preserve">--font-heading-weight</w:t>
+      </w:r>
+      <w:r>
+        <w:t xml:space="preserve">), and makes the</w:t>
+      </w:r>
+      <w:r>
+        <w:t xml:space="preserve"> </w:t>
+      </w:r>
+      <w:r>
+        <w:t xml:space="preserve">“</w:t>
+      </w:r>
+      <w:r>
+        <w:t xml:space="preserve">Customer reviews</w:t>
+      </w:r>
+      <w:r>
+        <w:t xml:space="preserve">”</w:t>
+      </w:r>
+      <w:r>
+        <w:t xml:space="preserve"> </w:t>
+      </w:r>
+      <w:r>
+        <w:t xml:space="preserve">heading and the reviews widget’s score, sort and tabs weight 500 too.</w:t>
       </w:r>
     </w:p>
     <w:p>
@@ -3252,6 +3368,30 @@
       </w:pPr>
       <w:r>
         <w:t xml:space="preserve">☐ Testing pop-up: open it from the product page and the ingredients page, then check all four tabs on a phone and on desktop.</w:t>
+      </w:r>
+    </w:p>
+    <w:p>
+      <w:pPr>
+        <w:numPr>
+          <w:ilvl w:val="0"/>
+          <w:numId w:val="1018"/>
+        </w:numPr>
+        <w:pStyle w:val="Compact"/>
+      </w:pPr>
+      <w:r>
+        <w:t xml:space="preserve">☐ Headings across the site look right at weight 500, including the reviews block.</w:t>
+      </w:r>
+    </w:p>
+    <w:p>
+      <w:pPr>
+        <w:numPr>
+          <w:ilvl w:val="0"/>
+          <w:numId w:val="1018"/>
+        </w:numPr>
+        <w:pStyle w:val="Compact"/>
+      </w:pPr>
+      <w:r>
+        <w:t xml:space="preserve">☐ Science page: the testing link opens the pop-up; the sticky bar appears after scrolling and adds both plans correctly.</w:t>
       </w:r>
     </w:p>
     <w:p>

</xml_diff>